<commit_message>
Bot specs: add Menny's answers on containers, Zundel, spec sheet volume, Vendo timing, remittance
Co-Authored-By: Devin AI <158243242+devin-ai-integration[bot]@users.noreply.github.com>
</commit_message>
<xml_diff>
--- a/Shadowing_Report_2026-10-22_v2.docx
+++ b/Shadowing_Report_2026-10-22_v2.docx
@@ -98,7 +98,7 @@
         <w:rPr>
           <w:rFonts w:ascii="Calibri" w:cs="Calibri" w:eastAsia="Calibri" w:hAnsi="Calibri"/>
         </w:rPr>
-        <w:t xml:space="preserve">Six days, eight people shadowed. Most of the work I saw is people reading one screen and typing into another, forwarding emails by hand, and keeping track of things on paper, in notebooks and in shared Excels. The most money at risk is in the </w:t>
+        <w:t xml:space="preserve">Six days, eight people shadowed. Most of the work I saw is people reading one screen and typing into another, forwarding emails by hand, and keeping track of things on paper, in notebooks and in shared Excels. The clearest bot, and the most measured time, is </w:t>
       </w:r>
       <w:r>
         <w:rPr>
@@ -106,13 +106,13 @@
           <w:b/>
           <w:bCs/>
         </w:rPr>
-        <w:t xml:space="preserve">payment to container release chain</w:t>
-      </w:r>
-      <w:r>
-        <w:rPr>
-          <w:rFonts w:ascii="Calibri" w:cs="Calibri" w:eastAsia="Calibri" w:hAnsi="Calibri"/>
-        </w:rPr>
-        <w:t xml:space="preserve">, and the clearest bot is </w:t>
+        <w:t xml:space="preserve">Daniel's channel files built from the spec sheet</w:t>
+      </w:r>
+      <w:r>
+        <w:rPr>
+          <w:rFonts w:ascii="Calibri" w:cs="Calibri" w:eastAsia="Calibri" w:hAnsi="Calibri"/>
+        </w:rPr>
+        <w:t xml:space="preserve">. The </w:t>
       </w:r>
       <w:r>
         <w:rPr>
@@ -120,13 +120,13 @@
           <w:b/>
           <w:bCs/>
         </w:rPr>
-        <w:t xml:space="preserve">Daniel's channel files built from the spec sheet</w:t>
-      </w:r>
-      <w:r>
-        <w:rPr>
-          <w:rFonts w:ascii="Calibri" w:cs="Calibri" w:eastAsia="Calibri" w:hAnsi="Calibri"/>
-        </w:rPr>
-        <w:t xml:space="preserve">. About eight problems are </w:t>
+        <w:t xml:space="preserve">payment to container release chain</w:t>
+      </w:r>
+      <w:r>
+        <w:rPr>
+          <w:rFonts w:ascii="Calibri" w:cs="Calibri" w:eastAsia="Calibri" w:hAnsi="Calibri"/>
+        </w:rPr>
+        <w:t xml:space="preserve"> is the biggest money risk, but only when cash flow is tight. About eight problems are </w:t>
       </w:r>
       <w:r>
         <w:rPr>
@@ -402,7 +402,7 @@
         <w:rPr>
           <w:rFonts w:ascii="Calibri" w:cs="Calibri" w:eastAsia="Calibri" w:hAnsi="Calibri"/>
         </w:rPr>
-        <w:t xml:space="preserve">My ranking, by money at risk and how clearly the notes describe the work. Hours per week are not measured yet; the figures are only what the notes support (see What to Measure Next).</w:t>
+        <w:t xml:space="preserve">My ranking, by time and money at stake and how clearly the notes describe the work. Figures are only what the notes and follow-up answers support (see What to Measure Next).</w:t>
       </w:r>
     </w:p>
     <w:tbl>
@@ -633,7 +633,7 @@
                 <w:sz w:val="20"/>
                 <w:szCs w:val="20"/>
               </w:rPr>
-              <w:t xml:space="preserve">Payment to container release tracker</w:t>
+              <w:t xml:space="preserve">Spec sheet to channel file builder</w:t>
             </w:r>
           </w:p>
         </w:tc>
@@ -660,7 +660,7 @@
                 <w:sz w:val="20"/>
                 <w:szCs w:val="20"/>
               </w:rPr>
-              <w:t xml:space="preserve">Release depends on a chain through a supplier Excel, Allways, two shared Excels, F&amp;O and an OceanFirst wire draft, with status by cc'd email and WhatsApp. 7 containers were waiting on the factory payment (still within free time). Rule: once 4 working days of free time run out, demurrage is about $300 to $350 per container per day.</w:t>
+              <w:t xml:space="preserve">About 8 spec sheets a week at about 15 to 20 minutes each, roughly 2 to 2.5 hours of Daniel's week, then at least 3 reviews per file. A wrong curtain width on Wayfair reached a customer.</w:t>
             </w:r>
           </w:p>
         </w:tc>
@@ -687,7 +687,7 @@
                 <w:sz w:val="20"/>
                 <w:szCs w:val="20"/>
               </w:rPr>
-              <w:t xml:space="preserve">Bot now; Allways API later</w:t>
+              <w:t xml:space="preserve">Bot</w:t>
             </w:r>
           </w:p>
         </w:tc>
@@ -714,7 +714,7 @@
                 <w:sz w:val="20"/>
                 <w:szCs w:val="20"/>
               </w:rPr>
-              <w:t xml:space="preserve">Peleg with Moshe Aryeh Grossman</w:t>
+              <w:t xml:space="preserve">Peleg with Daniel and Tina</w:t>
             </w:r>
           </w:p>
         </w:tc>
@@ -773,7 +773,7 @@
                 <w:sz w:val="20"/>
                 <w:szCs w:val="20"/>
               </w:rPr>
-              <w:t xml:space="preserve">Spec sheet to channel file builder</w:t>
+              <w:t xml:space="preserve">Payment to container release tracker</w:t>
             </w:r>
           </w:p>
         </w:tc>
@@ -800,7 +800,7 @@
                 <w:sz w:val="20"/>
                 <w:szCs w:val="20"/>
               </w:rPr>
-              <w:t xml:space="preserve">About 15 to 20 minutes per product line for Daniel, then at least 3 reviews per file. A wrong curtain width on Wayfair reached a customer. Weekly volume not known.</w:t>
+              <w:t xml:space="preserve">Release depends on a chain through a supplier Excel, Allways, two shared Excels, F&amp;O and an OceanFirst wire draft, with status by cc'd email and WhatsApp. Containers rarely go past free time; it happens at random, when cash flow is tight. Rule: once 4 working days of free time run out, demurrage is about $300 to $350 per container per day.</w:t>
             </w:r>
           </w:p>
         </w:tc>
@@ -827,7 +827,7 @@
                 <w:sz w:val="20"/>
                 <w:szCs w:val="20"/>
               </w:rPr>
-              <w:t xml:space="preserve">Bot</w:t>
+              <w:t xml:space="preserve">Bot now; Allways API later</w:t>
             </w:r>
           </w:p>
         </w:tc>
@@ -854,7 +854,7 @@
                 <w:sz w:val="20"/>
                 <w:szCs w:val="20"/>
               </w:rPr>
-              <w:t xml:space="preserve">Peleg with Daniel and Tina</w:t>
+              <w:t xml:space="preserve">Peleg with Moshe Aryeh Grossman</w:t>
             </w:r>
           </w:p>
         </w:tc>
@@ -940,7 +940,7 @@
                 <w:sz w:val="20"/>
                 <w:szCs w:val="20"/>
               </w:rPr>
-              <w:t xml:space="preserve">A six-step download and match in F&amp;O for each Vendo low-stock file. Only Tina can do it, because Daniel has no access to open PO lines or Goods in Transit. Frequency not known.</w:t>
+              <w:t xml:space="preserve">A six-step download and match in F&amp;O, every week when the Vendo file is updated (usually Thursday, sometimes Friday). Only Tina can do it, because Daniel has no access to open PO lines or Goods in Transit.</w:t>
             </w:r>
           </w:p>
         </w:tc>
@@ -2163,7 +2163,7 @@
         <w:rPr>
           <w:rFonts w:ascii="Calibri" w:cs="Calibri" w:eastAsia="Calibri" w:hAnsi="Calibri"/>
         </w:rPr>
-        <w:t xml:space="preserve">A. Container release tracker (opportunity 1)</w:t>
+        <w:t xml:space="preserve">A. Container release tracker (opportunity 2)</w:t>
       </w:r>
     </w:p>
     <w:tbl>
@@ -2467,7 +2467,7 @@
                 <w:sz w:val="20"/>
                 <w:szCs w:val="20"/>
               </w:rPr>
-              <w:t xml:space="preserve">Day 6: the seven-step invoice and BOL chain; the 7 containers waiting on the factory payment; status passed by cc'd email and WhatsApp</w:t>
+              <w:t xml:space="preserve">Day 6: the seven-step invoice and BOL chain; the 7 containers waiting on the factory payment; status passed by cc'd email and WhatsApp. Follow-up: containers usually don't go past free time, except at random when cash flow is tight. Zundel takes the payments Excel and applies the payments to our POs in F&amp;O.</w:t>
             </w:r>
           </w:p>
         </w:tc>
@@ -2526,7 +2526,7 @@
                 <w:sz w:val="20"/>
                 <w:szCs w:val="20"/>
               </w:rPr>
-              <w:t xml:space="preserve">How often containers get close to free time; how many wires a week; what splits the wires; what Zundel does with the payments Excel</w:t>
+              <w:t xml:space="preserve">How many wires a week; what splits the wires</w:t>
             </w:r>
           </w:p>
         </w:tc>
@@ -2547,7 +2547,7 @@
         <w:rPr>
           <w:rFonts w:ascii="Calibri" w:cs="Calibri" w:eastAsia="Calibri" w:hAnsi="Calibri"/>
         </w:rPr>
-        <w:t xml:space="preserve">B. Channel file builder (opportunity 2)</w:t>
+        <w:t xml:space="preserve">B. Channel file builder (opportunity 1)</w:t>
       </w:r>
     </w:p>
     <w:tbl>
@@ -2851,7 +2851,7 @@
                 <w:sz w:val="20"/>
                 <w:szCs w:val="20"/>
               </w:rPr>
-              <w:t xml:space="preserve">Day 2: Daniel's Wayfair sheet, column-to-column copy and paste, info read off product images, 15 to 20 minutes per line; Tina's 3 reviews; the 55" curtain width error. Day 4: Home Depot spec sheet.</w:t>
+              <w:t xml:space="preserve">Day 2: Daniel's Wayfair sheet, column-to-column copy and paste, info read off product images, 15 to 20 minutes per line; Tina's 3 reviews; the 55" curtain width error. Day 4: Home Depot spec sheet. Follow-up: about 8 spec sheets a week.</w:t>
             </w:r>
           </w:p>
         </w:tc>
@@ -2910,7 +2910,7 @@
                 <w:sz w:val="20"/>
                 <w:szCs w:val="20"/>
               </w:rPr>
-              <w:t xml:space="preserve">Product lines per week and per customer; which attributes are missing from the main sheet</w:t>
+              <w:t xml:space="preserve">Which customers the 8 sheets are for; which attributes are missing from the main sheet</w:t>
             </w:r>
           </w:p>
         </w:tc>
@@ -3058,7 +3058,7 @@
                 <w:sz w:val="20"/>
                 <w:szCs w:val="20"/>
               </w:rPr>
-              <w:t xml:space="preserve">Daniel's low-stock file from Vendo's SharePoint</w:t>
+              <w:t xml:space="preserve">The weekly Vendo low-stock file from Vendo's SharePoint (usually Thursday, sometimes pushed to Friday)</w:t>
             </w:r>
           </w:p>
         </w:tc>
@@ -3294,7 +3294,7 @@
                 <w:sz w:val="20"/>
                 <w:szCs w:val="20"/>
               </w:rPr>
-              <w:t xml:space="preserve">How often Vendo sends the file and how many items are on it</w:t>
+              <w:t xml:space="preserve">How many items are on the file each week</w:t>
             </w:r>
           </w:p>
         </w:tc>
@@ -3442,7 +3442,7 @@
                 <w:sz w:val="20"/>
                 <w:szCs w:val="20"/>
               </w:rPr>
-              <w:t xml:space="preserve">Chani's deposit email with the scanned checks and batch total</w:t>
+              <w:t xml:space="preserve">A check arriving by mail or email, with the remittance attached; for mailed checks, Chani's deposit email with the scans and batch total</w:t>
             </w:r>
           </w:p>
         </w:tc>
@@ -3560,7 +3560,7 @@
                 <w:sz w:val="20"/>
                 <w:szCs w:val="20"/>
               </w:rPr>
-              <w:t xml:space="preserve">Deposit email and scans, F&amp;O open customer transactions</w:t>
+              <w:t xml:space="preserve">The check and its attached remittance, deposit email and scans, F&amp;O open customer transactions</w:t>
             </w:r>
           </w:p>
         </w:tc>
@@ -3678,7 +3678,7 @@
                 <w:sz w:val="20"/>
                 <w:szCs w:val="20"/>
               </w:rPr>
-              <w:t xml:space="preserve">Checks per week; how remittance details arrive</w:t>
+              <w:t xml:space="preserve">Checks per week</w:t>
             </w:r>
           </w:p>
         </w:tc>
@@ -4834,7 +4834,7 @@
         <w:rPr>
           <w:rFonts w:ascii="Calibri" w:cs="Calibri" w:eastAsia="Calibri" w:hAnsi="Calibri"/>
         </w:rPr>
-        <w:t xml:space="preserve">For each top-5 item: how often it happens and how many each time. Daniel's product lines a week; how often Tina gets the Vendo file; Suzanne's checks a week; Moshe's wires a week; how long Baruch Salamander's reports take.</w:t>
+        <w:t xml:space="preserve">For each top-5 item: how often it happens and how many each time. Still open: items on the weekly Vendo file; Suzanne's checks a week; Moshe's wires a week; how long Baruch Salamander's reports take.</w:t>
       </w:r>
     </w:p>
     <w:p>

</xml_diff>

<commit_message>
Bot B: spec sheets cover all dropship customers
Co-Authored-By: Devin AI <158243242+devin-ai-integration[bot]@users.noreply.github.com>
</commit_message>
<xml_diff>
--- a/Shadowing_Report_2026-10-22_v2.docx
+++ b/Shadowing_Report_2026-10-22_v2.docx
@@ -2851,7 +2851,7 @@
                 <w:sz w:val="20"/>
                 <w:szCs w:val="20"/>
               </w:rPr>
-              <w:t xml:space="preserve">Day 2: Daniel's Wayfair sheet, column-to-column copy and paste, info read off product images, 15 to 20 minutes per line; Tina's 3 reviews; the 55" curtain width error. Day 4: Home Depot spec sheet. Follow-up: about 8 spec sheets a week.</w:t>
+              <w:t xml:space="preserve">Day 2: Daniel's Wayfair sheet, column-to-column copy and paste, info read off product images, 15 to 20 minutes per line; Tina's 3 reviews; the 55" curtain width error. Day 4: Home Depot spec sheet. Follow-up: about 8 spec sheets a week, covering all our dropship customers.</w:t>
             </w:r>
           </w:p>
         </w:tc>
@@ -2910,7 +2910,7 @@
                 <w:sz w:val="20"/>
                 <w:szCs w:val="20"/>
               </w:rPr>
-              <w:t xml:space="preserve">Which customers the 8 sheets are for; which attributes are missing from the main sheet</w:t>
+              <w:t xml:space="preserve">Which attributes are missing from the main sheet</w:t>
             </w:r>
           </w:p>
         </w:tc>

</xml_diff>

<commit_message>
Bot A: about 5 wires a week, released by Isaac Grossman
Co-Authored-By: Devin AI <158243242+devin-ai-integration[bot]@users.noreply.github.com>
</commit_message>
<xml_diff>
--- a/Shadowing_Report_2026-10-22_v2.docx
+++ b/Shadowing_Report_2026-10-22_v2.docx
@@ -2467,7 +2467,7 @@
                 <w:sz w:val="20"/>
                 <w:szCs w:val="20"/>
               </w:rPr>
-              <w:t xml:space="preserve">Day 6: the seven-step invoice and BOL chain; the 7 containers waiting on the factory payment; status passed by cc'd email and WhatsApp. Follow-up: containers usually don't go past free time, except at random when cash flow is tight. Zundel takes the payments Excel and applies the payments to our POs in F&amp;O.</w:t>
+              <w:t xml:space="preserve">Day 6: the seven-step invoice and BOL chain; the 7 containers waiting on the factory payment; status passed by cc'd email and WhatsApp. Follow-up: containers usually don't go past free time, except at random when cash flow is tight. Zundel takes the payments Excel and applies the payments to our POs in F&amp;O. About 5 wires a week, each released by Isaac Grossman.</w:t>
             </w:r>
           </w:p>
         </w:tc>
@@ -2526,7 +2526,7 @@
                 <w:sz w:val="20"/>
                 <w:szCs w:val="20"/>
               </w:rPr>
-              <w:t xml:space="preserve">How many wires a week; what splits the wires</w:t>
+              <w:t xml:space="preserve">What splits the wires</w:t>
             </w:r>
           </w:p>
         </w:tc>
@@ -5218,7 +5218,7 @@
         <w:rPr>
           <w:rFonts w:ascii="Calibri" w:cs="Calibri" w:eastAsia="Calibri" w:hAnsi="Calibri"/>
         </w:rPr>
-        <w:t xml:space="preserve">For each top-5 item: how often it happens and how many each time. Still open: items on the weekly Vendo file; Suzanne's checks a week; Moshe's wires a week; how long Baruch Salamander's reports take.</w:t>
+        <w:t xml:space="preserve">For each top-5 item: how often it happens and how many each time. Still open: items on the weekly Vendo file; Suzanne's checks a week; how long Baruch Salamander's reports take.</w:t>
       </w:r>
     </w:p>
     <w:p>

</xml_diff>

<commit_message>
Day 7: Tina's weekly OnePlatform (Vendo) inventory file; rewrite Bot C
Co-Authored-By: Devin AI <158243242+devin-ai-integration[bot]@users.noreply.github.com>
</commit_message>
<xml_diff>
--- a/Shadowing_Report_2026-10-22_v2.docx
+++ b/Shadowing_Report_2026-10-22_v2.docx
@@ -28,7 +28,7 @@
           <w:sz w:val="26"/>
           <w:szCs w:val="26"/>
         </w:rPr>
-        <w:t xml:space="preserve">Wednesday, October 14 to Wednesday, October 21, 2026 (six shadowing days). Version 2: ranked summary up front, detail in the appendix</w:t>
+        <w:t xml:space="preserve">Wednesday, October 14 to Friday, October 23, 2026 (seven shadowing days). Version 2: ranked summary up front, detail in the appendix</w:t>
       </w:r>
     </w:p>
     <w:p>
@@ -98,7 +98,7 @@
         <w:rPr>
           <w:rFonts w:ascii="Calibri" w:cs="Calibri" w:eastAsia="Calibri" w:hAnsi="Calibri"/>
         </w:rPr>
-        <w:t xml:space="preserve">Six days, eight people shadowed. Most of the work I saw is people reading one screen and typing into another, forwarding emails by hand, and keeping track of things on paper, in notebooks and in shared Excels. The clearest bot, and the most measured time, is </w:t>
+        <w:t xml:space="preserve">Seven days, eight people shadowed. Most of the work I saw is people reading one screen and typing into another, forwarding emails by hand, and keeping track of things on paper, in notebooks and in shared Excels. The clearest bot, and the most measured time, is </w:t>
       </w:r>
       <w:r>
         <w:rPr>
@@ -913,7 +913,7 @@
                 <w:sz w:val="20"/>
                 <w:szCs w:val="20"/>
               </w:rPr>
-              <w:t xml:space="preserve">Low-stock vs open-PO match</w:t>
+              <w:t xml:space="preserve">Weekly Amazon inventory file for OnePlatform (Vendo)</w:t>
             </w:r>
           </w:p>
         </w:tc>
@@ -940,7 +940,7 @@
                 <w:sz w:val="20"/>
                 <w:szCs w:val="20"/>
               </w:rPr>
-              <w:t xml:space="preserve">A six-step download and match in F&amp;O, every week when the Vendo file is updated (usually Thursday, sometimes Friday). Only Tina can do it, because Daniel has no access to open PO lines or Goods in Transit.</w:t>
+              <w:t xml:space="preserve">Every Friday Daniel rebuilds the file and marks each item in, low or out of stock, then Tina adds next available dates from open PO lines and Goods in Transit with VLOOKUPs. Her part is under 10 minutes; Daniel's isn't measured, and Tina says he may be leaving. Everything we send is already in F&amp;O, so the whole file can be built from it. Out-of-stock items are not marked temporarily unavailable on Amazon.</w:t>
             </w:r>
           </w:p>
         </w:tc>
@@ -967,7 +967,7 @@
                 <w:sz w:val="20"/>
                 <w:szCs w:val="20"/>
               </w:rPr>
-              <w:t xml:space="preserve">Bot</w:t>
+              <w:t xml:space="preserve">F&amp;O report first, then bot</w:t>
             </w:r>
           </w:p>
         </w:tc>
@@ -2931,7 +2931,7 @@
         <w:rPr>
           <w:rFonts w:ascii="Calibri" w:cs="Calibri" w:eastAsia="Calibri" w:hAnsi="Calibri"/>
         </w:rPr>
-        <w:t xml:space="preserve">C. Low-stock vs open-PO match (opportunity 3)</w:t>
+        <w:t xml:space="preserve">C. Weekly Amazon inventory file for OnePlatform (opportunity 3)</w:t>
       </w:r>
     </w:p>
     <w:tbl>
@@ -3058,7 +3058,7 @@
                 <w:sz w:val="20"/>
                 <w:szCs w:val="20"/>
               </w:rPr>
-              <w:t xml:space="preserve">The weekly Vendo low-stock file from Vendo's SharePoint (usually Thursday, sometimes pushed to Friday)</w:t>
+              <w:t xml:space="preserve">Weekly, on Friday (OnePlatform, formerly Vendo, updates its file usually Thursday, sometimes Friday)</w:t>
             </w:r>
           </w:p>
         </w:tc>
@@ -3117,7 +3117,7 @@
                 <w:sz w:val="20"/>
                 <w:szCs w:val="20"/>
               </w:rPr>
-              <w:t xml:space="preserve">Matches each low-stock or out-of-stock item to open PO lines and Goods in Transit, fills the next available date, and flags lines with no updated date</w:t>
+              <w:t xml:space="preserve">Builds the whole file from F&amp;O: ASIN, SKU, UPC, product name and status for every item. Status comes from on-hand in warehouse 1600: 11 pieces or fewer is out of stock, under 50 is low, 50 or more is in stock. For low and out-of-stock items it adds the next available date: the Goods in Transit date where there is one, otherwise the earliest open PO date, blank if neither. Discontinued items are marked disco while we have stock and obsolete once we don't. Then it drafts the email to Matt and Reggie, cc Avi G and Tara. First step (my idea): an F&amp;O report with the dates already coalesced, even before anything else changes.</w:t>
             </w:r>
           </w:p>
         </w:tc>
@@ -3176,7 +3176,7 @@
                 <w:sz w:val="20"/>
                 <w:szCs w:val="20"/>
               </w:rPr>
-              <w:t xml:space="preserve">Vendo file, F&amp;O open PO lines, Goods in Transit</w:t>
+              <w:t xml:space="preserve">F&amp;O items (ASIN, SKU, UPC, name, status), on-hand for 1600, open PO lines, Goods in Transit; OnePlatform's file only as a cross-check</w:t>
             </w:r>
           </w:p>
         </w:tc>
@@ -3235,7 +3235,7 @@
                 <w:sz w:val="20"/>
                 <w:szCs w:val="20"/>
               </w:rPr>
-              <w:t xml:space="preserve">Day 2: Tina's six-step download, filter and match</w:t>
+              <w:t xml:space="preserve">Day 2: Tina's six-step download, filter and match. Day 7: the full weekly cycle. Daniel restarts the file every week and emails it to Tina as an attachment. Tina's part is under 10 minutes; when she used to do Daniel's part, a lookup formula wrote the status automatically. The only OnePlatform fields we don't have (Amazon product line, subcategory) aren't needed in what we send. The whole list goes out every week. Out-of-stock items aren't marked temporarily unavailable with an in-stock date, by us or OnePlatform.</w:t>
             </w:r>
           </w:p>
         </w:tc>
@@ -3294,7 +3294,7 @@
                 <w:sz w:val="20"/>
                 <w:szCs w:val="20"/>
               </w:rPr>
-              <w:t xml:space="preserve">How many items are on the file each week</w:t>
+              <w:t xml:space="preserve">Items on the file and how many need dates; on-hand or available quantity; whether the 30-day Goods in Transit cutoff should stay (it follows how Avi Altman updates dates); who should mark items temporarily unavailable</w:t>
             </w:r>
           </w:p>
         </w:tc>
@@ -5218,7 +5218,7 @@
         <w:rPr>
           <w:rFonts w:ascii="Calibri" w:cs="Calibri" w:eastAsia="Calibri" w:hAnsi="Calibri"/>
         </w:rPr>
-        <w:t xml:space="preserve">For each top-5 item: how often it happens and how many each time. Still open: items on the weekly Vendo file; Suzanne's checks a week; how long Baruch Salamander's reports take.</w:t>
+        <w:t xml:space="preserve">For each top-5 item: how often it happens and how many each time. Still open: items on the weekly OnePlatform file and how long Daniel's part takes; Suzanne's checks a week; how long Baruch Salamander's reports take.</w:t>
       </w:r>
     </w:p>
     <w:p>
@@ -5316,7 +5316,7 @@
         <w:rPr>
           <w:rFonts w:ascii="Calibri" w:cs="Calibri" w:eastAsia="Calibri" w:hAnsi="Calibri"/>
         </w:rPr>
-        <w:t xml:space="preserve">The Six Days at a Glance</w:t>
+        <w:t xml:space="preserve">The Seven Days at a Glance</w:t>
       </w:r>
     </w:p>
     <w:tbl>
@@ -7179,6 +7179,92 @@
           </w:p>
         </w:tc>
       </w:tr>
+      <w:tr>
+        <w:trPr>
+          <w:cantSplit/>
+        </w:trPr>
+        <w:tc>
+          <w:tcPr>
+            <w:tcW w:type="dxa" w:w="1500"/>
+            <w:tcBorders>
+              <w:top w:val="single" w:color="BFBFBF" w:sz="4"/>
+              <w:left w:val="single" w:color="BFBFBF" w:sz="4"/>
+              <w:bottom w:val="single" w:color="BFBFBF" w:sz="4"/>
+              <w:right w:val="single" w:color="BFBFBF" w:sz="4"/>
+            </w:tcBorders>
+            <w:tcMar>
+              <w:top w:type="dxa" w:w="60"/>
+              <w:left w:type="dxa" w:w="100"/>
+              <w:bottom w:type="dxa" w:w="60"/>
+              <w:right w:type="dxa" w:w="100"/>
+            </w:tcMar>
+          </w:tcPr>
+          <w:p>
+            <w:r>
+              <w:rPr>
+                <w:rFonts w:ascii="Calibri" w:cs="Calibri" w:eastAsia="Calibri" w:hAnsi="Calibri"/>
+                <w:sz w:val="20"/>
+                <w:szCs w:val="20"/>
+              </w:rPr>
+              <w:t xml:space="preserve">Fri Oct 23</w:t>
+            </w:r>
+          </w:p>
+        </w:tc>
+        <w:tc>
+          <w:tcPr>
+            <w:tcW w:type="dxa" w:w="2100"/>
+            <w:tcBorders>
+              <w:top w:val="single" w:color="BFBFBF" w:sz="4"/>
+              <w:left w:val="single" w:color="BFBFBF" w:sz="4"/>
+              <w:bottom w:val="single" w:color="BFBFBF" w:sz="4"/>
+              <w:right w:val="single" w:color="BFBFBF" w:sz="4"/>
+            </w:tcBorders>
+            <w:tcMar>
+              <w:top w:type="dxa" w:w="60"/>
+              <w:left w:type="dxa" w:w="100"/>
+              <w:bottom w:type="dxa" w:w="60"/>
+              <w:right w:type="dxa" w:w="100"/>
+            </w:tcMar>
+          </w:tcPr>
+          <w:p>
+            <w:r>
+              <w:rPr>
+                <w:rFonts w:ascii="Calibri" w:cs="Calibri" w:eastAsia="Calibri" w:hAnsi="Calibri"/>
+                <w:sz w:val="20"/>
+                <w:szCs w:val="20"/>
+              </w:rPr>
+              <w:t xml:space="preserve">Not given</w:t>
+            </w:r>
+          </w:p>
+        </w:tc>
+        <w:tc>
+          <w:tcPr>
+            <w:tcW w:type="dxa" w:w="5760"/>
+            <w:tcBorders>
+              <w:top w:val="single" w:color="BFBFBF" w:sz="4"/>
+              <w:left w:val="single" w:color="BFBFBF" w:sz="4"/>
+              <w:bottom w:val="single" w:color="BFBFBF" w:sz="4"/>
+              <w:right w:val="single" w:color="BFBFBF" w:sz="4"/>
+            </w:tcBorders>
+            <w:tcMar>
+              <w:top w:type="dxa" w:w="60"/>
+              <w:left w:type="dxa" w:w="100"/>
+              <w:bottom w:type="dxa" w:w="60"/>
+              <w:right w:type="dxa" w:w="100"/>
+            </w:tcMar>
+          </w:tcPr>
+          <w:p>
+            <w:r>
+              <w:rPr>
+                <w:rFonts w:ascii="Calibri" w:cs="Calibri" w:eastAsia="Calibri" w:hAnsi="Calibri"/>
+                <w:sz w:val="20"/>
+                <w:szCs w:val="20"/>
+              </w:rPr>
+              <w:t xml:space="preserve">Tina (Daniel's part described): weekly Amazon inventory file for OnePlatform (Vendo)</w:t>
+            </w:r>
+          </w:p>
+        </w:tc>
+      </w:tr>
     </w:tbl>
     <w:p>
       <w:pPr>
@@ -8577,6 +8663,124 @@
           </w:p>
         </w:tc>
       </w:tr>
+      <w:tr>
+        <w:trPr>
+          <w:cantSplit/>
+        </w:trPr>
+        <w:tc>
+          <w:tcPr>
+            <w:tcW w:type="dxa" w:w="2300"/>
+            <w:tcBorders>
+              <w:top w:val="single" w:color="BFBFBF" w:sz="4"/>
+              <w:left w:val="single" w:color="BFBFBF" w:sz="4"/>
+              <w:bottom w:val="single" w:color="BFBFBF" w:sz="4"/>
+              <w:right w:val="single" w:color="BFBFBF" w:sz="4"/>
+            </w:tcBorders>
+            <w:tcMar>
+              <w:top w:type="dxa" w:w="60"/>
+              <w:left w:type="dxa" w:w="100"/>
+              <w:bottom w:type="dxa" w:w="60"/>
+              <w:right w:type="dxa" w:w="100"/>
+            </w:tcMar>
+          </w:tcPr>
+          <w:p>
+            <w:r>
+              <w:rPr>
+                <w:rFonts w:ascii="Calibri" w:cs="Calibri" w:eastAsia="Calibri" w:hAnsi="Calibri"/>
+                <w:sz w:val="20"/>
+                <w:szCs w:val="20"/>
+              </w:rPr>
+              <w:t xml:space="preserve">Matt / Tara</w:t>
+            </w:r>
+          </w:p>
+        </w:tc>
+        <w:tc>
+          <w:tcPr>
+            <w:tcW w:type="dxa" w:w="7060"/>
+            <w:tcBorders>
+              <w:top w:val="single" w:color="BFBFBF" w:sz="4"/>
+              <w:left w:val="single" w:color="BFBFBF" w:sz="4"/>
+              <w:bottom w:val="single" w:color="BFBFBF" w:sz="4"/>
+              <w:right w:val="single" w:color="BFBFBF" w:sz="4"/>
+            </w:tcBorders>
+            <w:tcMar>
+              <w:top w:type="dxa" w:w="60"/>
+              <w:left w:type="dxa" w:w="100"/>
+              <w:bottom w:type="dxa" w:w="60"/>
+              <w:right w:type="dxa" w:w="100"/>
+            </w:tcMar>
+          </w:tcPr>
+          <w:p>
+            <w:r>
+              <w:rPr>
+                <w:rFonts w:ascii="Calibri" w:cs="Calibri" w:eastAsia="Calibri" w:hAnsi="Calibri"/>
+                <w:sz w:val="20"/>
+                <w:szCs w:val="20"/>
+              </w:rPr>
+              <w:t xml:space="preserve">At OnePlatform (formerly Vendo). Matt gets the weekly inventory file; Tara is cc'd</w:t>
+            </w:r>
+          </w:p>
+        </w:tc>
+      </w:tr>
+      <w:tr>
+        <w:trPr>
+          <w:cantSplit/>
+        </w:trPr>
+        <w:tc>
+          <w:tcPr>
+            <w:tcW w:type="dxa" w:w="2300"/>
+            <w:tcBorders>
+              <w:top w:val="single" w:color="BFBFBF" w:sz="4"/>
+              <w:left w:val="single" w:color="BFBFBF" w:sz="4"/>
+              <w:bottom w:val="single" w:color="BFBFBF" w:sz="4"/>
+              <w:right w:val="single" w:color="BFBFBF" w:sz="4"/>
+            </w:tcBorders>
+            <w:tcMar>
+              <w:top w:type="dxa" w:w="60"/>
+              <w:left w:type="dxa" w:w="100"/>
+              <w:bottom w:type="dxa" w:w="60"/>
+              <w:right w:type="dxa" w:w="100"/>
+            </w:tcMar>
+          </w:tcPr>
+          <w:p>
+            <w:r>
+              <w:rPr>
+                <w:rFonts w:ascii="Calibri" w:cs="Calibri" w:eastAsia="Calibri" w:hAnsi="Calibri"/>
+                <w:sz w:val="20"/>
+                <w:szCs w:val="20"/>
+              </w:rPr>
+              <w:t xml:space="preserve">Reggie</w:t>
+            </w:r>
+          </w:p>
+        </w:tc>
+        <w:tc>
+          <w:tcPr>
+            <w:tcW w:type="dxa" w:w="7060"/>
+            <w:tcBorders>
+              <w:top w:val="single" w:color="BFBFBF" w:sz="4"/>
+              <w:left w:val="single" w:color="BFBFBF" w:sz="4"/>
+              <w:bottom w:val="single" w:color="BFBFBF" w:sz="4"/>
+              <w:right w:val="single" w:color="BFBFBF" w:sz="4"/>
+            </w:tcBorders>
+            <w:tcMar>
+              <w:top w:type="dxa" w:w="60"/>
+              <w:left w:type="dxa" w:w="100"/>
+              <w:bottom w:type="dxa" w:w="60"/>
+              <w:right w:type="dxa" w:w="100"/>
+            </w:tcMar>
+          </w:tcPr>
+          <w:p>
+            <w:r>
+              <w:rPr>
+                <w:rFonts w:ascii="Calibri" w:cs="Calibri" w:eastAsia="Calibri" w:hAnsi="Calibri"/>
+                <w:sz w:val="20"/>
+                <w:szCs w:val="20"/>
+              </w:rPr>
+              <w:t xml:space="preserve">Our Amazon rep. Gets the weekly inventory file with Matt</w:t>
+            </w:r>
+          </w:p>
+        </w:tc>
+      </w:tr>
     </w:tbl>
     <w:p>
       <w:pPr>
@@ -8599,7 +8803,7 @@
         <w:rPr>
           <w:rFonts w:ascii="Calibri" w:cs="Calibri" w:eastAsia="Calibri" w:hAnsi="Calibri"/>
         </w:rPr>
-        <w:t xml:space="preserve"> Bais Trucking (sister company of Achim, runs on PortPro); Allways Shipping (customs, vessel bookings, container assignments; portal with exact locations; has API and EDI integrations available); All Blinds Co. (supplier in China); Vendo (middleman between us and Amazon; exact role not yet clear); Lincoln Supply, Family Dollar and Herman's (customers). </w:t>
+        <w:t xml:space="preserve"> Bais Trucking (sister company of Achim, runs on PortPro); Allways Shipping (customs, vessel bookings, container assignments; portal with exact locations; has API and EDI integrations available); All Blinds Co. (supplier in China); OnePlatform, called Vendo when we started with them (middleman between us and Amazon; uses our weekly inventory file for advertising decisions on Amazon); Lincoln Supply, Family Dollar and Herman's (customers). </w:t>
       </w:r>
       <w:r>
         <w:rPr>
@@ -13325,7 +13529,7 @@
         <w:rPr>
           <w:rFonts w:ascii="Calibri" w:cs="Calibri" w:eastAsia="Calibri" w:hAnsi="Calibri"/>
         </w:rPr>
-        <w:t xml:space="preserve"> Daniel downloads a file from Vendo's SharePoint and adds low-stock and out-of-stock items. He sends it to Tina, who adds the next available date (Daniel has no access to open PO lines or Goods in Transit). She reviews it and sends it back to Vendo. </w:t>
+        <w:t xml:space="preserve"> Daniel downloads a file from Vendo's SharePoint and adds low-stock and out-of-stock items. He sends it to Tina, who adds the next available date (Daniel has no access to open PO lines or Goods in Transit). She reviews it and sends it back to Vendo. Day 7 (Part 13) has the full weekly process. </w:t>
       </w:r>
       <w:r>
         <w:rPr>
@@ -19568,7 +19772,896 @@
         <w:rPr>
           <w:rFonts w:ascii="Calibri" w:cs="Calibri" w:eastAsia="Calibri" w:hAnsi="Calibri"/>
         </w:rPr>
-        <w:t xml:space="preserve">Part 13: Observer's Own Work (not part of the process study)</w:t>
+        <w:t xml:space="preserve">Part 13: Tina, Weekly Amazon Inventory File for OnePlatform, Day 7 (Fri Oct 23)</w:t>
+      </w:r>
+    </w:p>
+    <w:p>
+      <w:pPr>
+        <w:spacing w:after="120"/>
+      </w:pPr>
+      <w:r>
+        <w:rPr>
+          <w:rFonts w:ascii="Calibri" w:cs="Calibri" w:eastAsia="Calibri" w:hAnsi="Calibri"/>
+        </w:rPr>
+        <w:t xml:space="preserve">I sat with Tina. Daniel's part was described by Tina, not watched. No clock times. OnePlatform was called Vendo when we started with them; earlier parts use the old name.</w:t>
+      </w:r>
+    </w:p>
+    <w:p>
+      <w:pPr>
+        <w:spacing w:after="120"/>
+      </w:pPr>
+      <w:r>
+        <w:rPr>
+          <w:rFonts w:ascii="Calibri" w:cs="Calibri" w:eastAsia="Calibri" w:hAnsi="Calibri"/>
+          <w:b/>
+          <w:bCs/>
+        </w:rPr>
+        <w:t xml:space="preserve">Systems and tools:</w:t>
+      </w:r>
+      <w:r>
+        <w:rPr>
+          <w:rFonts w:ascii="Calibri" w:cs="Calibri" w:eastAsia="Calibri" w:hAnsi="Calibri"/>
+        </w:rPr>
+        <w:t xml:space="preserve"> OnePlatform (Vendo) SharePoint, the network drive (Daniel's base sheet), F&amp;O (on-hand, open PO lines, Goods in Transit), Excel VLOOKUPs, email, Teams.</w:t>
+      </w:r>
+    </w:p>
+    <w:p>
+      <w:pPr>
+        <w:pStyle w:val="Heading2"/>
+        <w:keepNext/>
+        <w:spacing w:after="100" w:before="240"/>
+      </w:pPr>
+      <w:r>
+        <w:rPr>
+          <w:rFonts w:ascii="Calibri" w:cs="Calibri" w:eastAsia="Calibri" w:hAnsi="Calibri"/>
+        </w:rPr>
+        <w:t xml:space="preserve">The process at a glance</w:t>
+      </w:r>
+    </w:p>
+    <w:tbl>
+      <w:tblPr>
+        <w:tblW w:type="dxa" w:w="9360"/>
+        <w:tblBorders>
+          <w:top w:val="single" w:color="auto" w:sz="4"/>
+          <w:left w:val="single" w:color="auto" w:sz="4"/>
+          <w:bottom w:val="single" w:color="auto" w:sz="4"/>
+          <w:right w:val="single" w:color="auto" w:sz="4"/>
+          <w:insideH w:val="single" w:color="auto" w:sz="4"/>
+          <w:insideV w:val="single" w:color="auto" w:sz="4"/>
+        </w:tblBorders>
+      </w:tblPr>
+      <w:tblGrid>
+        <w:gridCol w:w="1900"/>
+        <w:gridCol w:w="7460"/>
+      </w:tblGrid>
+      <w:tr>
+        <w:trPr>
+          <w:tblHeader/>
+        </w:trPr>
+        <w:tc>
+          <w:tcPr>
+            <w:tcW w:type="dxa" w:w="1900"/>
+            <w:tcBorders>
+              <w:top w:val="single" w:color="BFBFBF" w:sz="4"/>
+              <w:left w:val="single" w:color="BFBFBF" w:sz="4"/>
+              <w:bottom w:val="single" w:color="BFBFBF" w:sz="4"/>
+              <w:right w:val="single" w:color="BFBFBF" w:sz="4"/>
+            </w:tcBorders>
+            <w:shd w:fill="D9E2F3" w:color="auto" w:val="clear"/>
+            <w:tcMar>
+              <w:top w:type="dxa" w:w="60"/>
+              <w:left w:type="dxa" w:w="100"/>
+              <w:bottom w:type="dxa" w:w="60"/>
+              <w:right w:type="dxa" w:w="100"/>
+            </w:tcMar>
+          </w:tcPr>
+          <w:p/>
+        </w:tc>
+        <w:tc>
+          <w:tcPr>
+            <w:tcW w:type="dxa" w:w="7460"/>
+            <w:tcBorders>
+              <w:top w:val="single" w:color="BFBFBF" w:sz="4"/>
+              <w:left w:val="single" w:color="BFBFBF" w:sz="4"/>
+              <w:bottom w:val="single" w:color="BFBFBF" w:sz="4"/>
+              <w:right w:val="single" w:color="BFBFBF" w:sz="4"/>
+            </w:tcBorders>
+            <w:shd w:fill="D9E2F3" w:color="auto" w:val="clear"/>
+            <w:tcMar>
+              <w:top w:type="dxa" w:w="60"/>
+              <w:left w:type="dxa" w:w="100"/>
+              <w:bottom w:type="dxa" w:w="60"/>
+              <w:right w:type="dxa" w:w="100"/>
+            </w:tcMar>
+          </w:tcPr>
+          <w:p>
+            <w:r>
+              <w:rPr>
+                <w:rFonts w:ascii="Calibri" w:cs="Calibri" w:eastAsia="Calibri" w:hAnsi="Calibri"/>
+                <w:b/>
+                <w:bCs/>
+                <w:sz w:val="20"/>
+                <w:szCs w:val="20"/>
+              </w:rPr>
+              <w:t xml:space="preserve">Detail</w:t>
+            </w:r>
+          </w:p>
+        </w:tc>
+      </w:tr>
+      <w:tr>
+        <w:trPr>
+          <w:cantSplit/>
+        </w:trPr>
+        <w:tc>
+          <w:tcPr>
+            <w:tcW w:type="dxa" w:w="1900"/>
+            <w:tcBorders>
+              <w:top w:val="single" w:color="BFBFBF" w:sz="4"/>
+              <w:left w:val="single" w:color="BFBFBF" w:sz="4"/>
+              <w:bottom w:val="single" w:color="BFBFBF" w:sz="4"/>
+              <w:right w:val="single" w:color="BFBFBF" w:sz="4"/>
+            </w:tcBorders>
+            <w:tcMar>
+              <w:top w:type="dxa" w:w="60"/>
+              <w:left w:type="dxa" w:w="100"/>
+              <w:bottom w:type="dxa" w:w="60"/>
+              <w:right w:type="dxa" w:w="100"/>
+            </w:tcMar>
+          </w:tcPr>
+          <w:p>
+            <w:r>
+              <w:rPr>
+                <w:rFonts w:ascii="Calibri" w:cs="Calibri" w:eastAsia="Calibri" w:hAnsi="Calibri"/>
+                <w:sz w:val="20"/>
+                <w:szCs w:val="20"/>
+              </w:rPr>
+              <w:t xml:space="preserve">What</w:t>
+            </w:r>
+          </w:p>
+        </w:tc>
+        <w:tc>
+          <w:tcPr>
+            <w:tcW w:type="dxa" w:w="7460"/>
+            <w:tcBorders>
+              <w:top w:val="single" w:color="BFBFBF" w:sz="4"/>
+              <w:left w:val="single" w:color="BFBFBF" w:sz="4"/>
+              <w:bottom w:val="single" w:color="BFBFBF" w:sz="4"/>
+              <w:right w:val="single" w:color="BFBFBF" w:sz="4"/>
+            </w:tcBorders>
+            <w:tcMar>
+              <w:top w:type="dxa" w:w="60"/>
+              <w:left w:type="dxa" w:w="100"/>
+              <w:bottom w:type="dxa" w:w="60"/>
+              <w:right w:type="dxa" w:w="100"/>
+            </w:tcMar>
+          </w:tcPr>
+          <w:p>
+            <w:r>
+              <w:rPr>
+                <w:rFonts w:ascii="Calibri" w:cs="Calibri" w:eastAsia="Calibri" w:hAnsi="Calibri"/>
+                <w:sz w:val="20"/>
+                <w:szCs w:val="20"/>
+              </w:rPr>
+              <w:t xml:space="preserve">A weekly file telling OnePlatform whether each Amazon item is in stock, low or out, with the next available date for low and out-of-stock items</w:t>
+            </w:r>
+          </w:p>
+        </w:tc>
+      </w:tr>
+      <w:tr>
+        <w:trPr>
+          <w:cantSplit/>
+        </w:trPr>
+        <w:tc>
+          <w:tcPr>
+            <w:tcW w:type="dxa" w:w="1900"/>
+            <w:tcBorders>
+              <w:top w:val="single" w:color="BFBFBF" w:sz="4"/>
+              <w:left w:val="single" w:color="BFBFBF" w:sz="4"/>
+              <w:bottom w:val="single" w:color="BFBFBF" w:sz="4"/>
+              <w:right w:val="single" w:color="BFBFBF" w:sz="4"/>
+            </w:tcBorders>
+            <w:tcMar>
+              <w:top w:type="dxa" w:w="60"/>
+              <w:left w:type="dxa" w:w="100"/>
+              <w:bottom w:type="dxa" w:w="60"/>
+              <w:right w:type="dxa" w:w="100"/>
+            </w:tcMar>
+          </w:tcPr>
+          <w:p>
+            <w:r>
+              <w:rPr>
+                <w:rFonts w:ascii="Calibri" w:cs="Calibri" w:eastAsia="Calibri" w:hAnsi="Calibri"/>
+                <w:sz w:val="20"/>
+                <w:szCs w:val="20"/>
+              </w:rPr>
+              <w:t xml:space="preserve">Why</w:t>
+            </w:r>
+          </w:p>
+        </w:tc>
+        <w:tc>
+          <w:tcPr>
+            <w:tcW w:type="dxa" w:w="7460"/>
+            <w:tcBorders>
+              <w:top w:val="single" w:color="BFBFBF" w:sz="4"/>
+              <w:left w:val="single" w:color="BFBFBF" w:sz="4"/>
+              <w:bottom w:val="single" w:color="BFBFBF" w:sz="4"/>
+              <w:right w:val="single" w:color="BFBFBF" w:sz="4"/>
+            </w:tcBorders>
+            <w:tcMar>
+              <w:top w:type="dxa" w:w="60"/>
+              <w:left w:type="dxa" w:w="100"/>
+              <w:bottom w:type="dxa" w:w="60"/>
+              <w:right w:type="dxa" w:w="100"/>
+            </w:tcMar>
+          </w:tcPr>
+          <w:p>
+            <w:r>
+              <w:rPr>
+                <w:rFonts w:ascii="Calibri" w:cs="Calibri" w:eastAsia="Calibri" w:hAnsi="Calibri"/>
+                <w:sz w:val="20"/>
+                <w:szCs w:val="20"/>
+              </w:rPr>
+              <w:t xml:space="preserve">OnePlatform uses it for advertising decisions on Amazon</w:t>
+            </w:r>
+          </w:p>
+        </w:tc>
+      </w:tr>
+      <w:tr>
+        <w:trPr>
+          <w:cantSplit/>
+        </w:trPr>
+        <w:tc>
+          <w:tcPr>
+            <w:tcW w:type="dxa" w:w="1900"/>
+            <w:tcBorders>
+              <w:top w:val="single" w:color="BFBFBF" w:sz="4"/>
+              <w:left w:val="single" w:color="BFBFBF" w:sz="4"/>
+              <w:bottom w:val="single" w:color="BFBFBF" w:sz="4"/>
+              <w:right w:val="single" w:color="BFBFBF" w:sz="4"/>
+            </w:tcBorders>
+            <w:tcMar>
+              <w:top w:type="dxa" w:w="60"/>
+              <w:left w:type="dxa" w:w="100"/>
+              <w:bottom w:type="dxa" w:w="60"/>
+              <w:right w:type="dxa" w:w="100"/>
+            </w:tcMar>
+          </w:tcPr>
+          <w:p>
+            <w:r>
+              <w:rPr>
+                <w:rFonts w:ascii="Calibri" w:cs="Calibri" w:eastAsia="Calibri" w:hAnsi="Calibri"/>
+                <w:sz w:val="20"/>
+                <w:szCs w:val="20"/>
+              </w:rPr>
+              <w:t xml:space="preserve">When</w:t>
+            </w:r>
+          </w:p>
+        </w:tc>
+        <w:tc>
+          <w:tcPr>
+            <w:tcW w:type="dxa" w:w="7460"/>
+            <w:tcBorders>
+              <w:top w:val="single" w:color="BFBFBF" w:sz="4"/>
+              <w:left w:val="single" w:color="BFBFBF" w:sz="4"/>
+              <w:bottom w:val="single" w:color="BFBFBF" w:sz="4"/>
+              <w:right w:val="single" w:color="BFBFBF" w:sz="4"/>
+            </w:tcBorders>
+            <w:tcMar>
+              <w:top w:type="dxa" w:w="60"/>
+              <w:left w:type="dxa" w:w="100"/>
+              <w:bottom w:type="dxa" w:w="60"/>
+              <w:right w:type="dxa" w:w="100"/>
+            </w:tcMar>
+          </w:tcPr>
+          <w:p>
+            <w:r>
+              <w:rPr>
+                <w:rFonts w:ascii="Calibri" w:cs="Calibri" w:eastAsia="Calibri" w:hAnsi="Calibri"/>
+                <w:sz w:val="20"/>
+                <w:szCs w:val="20"/>
+              </w:rPr>
+              <w:t xml:space="preserve">Weekly, on Friday</w:t>
+            </w:r>
+          </w:p>
+        </w:tc>
+      </w:tr>
+      <w:tr>
+        <w:trPr>
+          <w:cantSplit/>
+        </w:trPr>
+        <w:tc>
+          <w:tcPr>
+            <w:tcW w:type="dxa" w:w="1900"/>
+            <w:tcBorders>
+              <w:top w:val="single" w:color="BFBFBF" w:sz="4"/>
+              <w:left w:val="single" w:color="BFBFBF" w:sz="4"/>
+              <w:bottom w:val="single" w:color="BFBFBF" w:sz="4"/>
+              <w:right w:val="single" w:color="BFBFBF" w:sz="4"/>
+            </w:tcBorders>
+            <w:tcMar>
+              <w:top w:type="dxa" w:w="60"/>
+              <w:left w:type="dxa" w:w="100"/>
+              <w:bottom w:type="dxa" w:w="60"/>
+              <w:right w:type="dxa" w:w="100"/>
+            </w:tcMar>
+          </w:tcPr>
+          <w:p>
+            <w:r>
+              <w:rPr>
+                <w:rFonts w:ascii="Calibri" w:cs="Calibri" w:eastAsia="Calibri" w:hAnsi="Calibri"/>
+                <w:sz w:val="20"/>
+                <w:szCs w:val="20"/>
+              </w:rPr>
+              <w:t xml:space="preserve">Who</w:t>
+            </w:r>
+          </w:p>
+        </w:tc>
+        <w:tc>
+          <w:tcPr>
+            <w:tcW w:type="dxa" w:w="7460"/>
+            <w:tcBorders>
+              <w:top w:val="single" w:color="BFBFBF" w:sz="4"/>
+              <w:left w:val="single" w:color="BFBFBF" w:sz="4"/>
+              <w:bottom w:val="single" w:color="BFBFBF" w:sz="4"/>
+              <w:right w:val="single" w:color="BFBFBF" w:sz="4"/>
+            </w:tcBorders>
+            <w:tcMar>
+              <w:top w:type="dxa" w:w="60"/>
+              <w:left w:type="dxa" w:w="100"/>
+              <w:bottom w:type="dxa" w:w="60"/>
+              <w:right w:type="dxa" w:w="100"/>
+            </w:tcMar>
+          </w:tcPr>
+          <w:p>
+            <w:r>
+              <w:rPr>
+                <w:rFonts w:ascii="Calibri" w:cs="Calibri" w:eastAsia="Calibri" w:hAnsi="Calibri"/>
+                <w:sz w:val="20"/>
+                <w:szCs w:val="20"/>
+              </w:rPr>
+              <w:t xml:space="preserve">Daniel, then Tina</w:t>
+            </w:r>
+          </w:p>
+        </w:tc>
+      </w:tr>
+      <w:tr>
+        <w:trPr>
+          <w:cantSplit/>
+        </w:trPr>
+        <w:tc>
+          <w:tcPr>
+            <w:tcW w:type="dxa" w:w="1900"/>
+            <w:tcBorders>
+              <w:top w:val="single" w:color="BFBFBF" w:sz="4"/>
+              <w:left w:val="single" w:color="BFBFBF" w:sz="4"/>
+              <w:bottom w:val="single" w:color="BFBFBF" w:sz="4"/>
+              <w:right w:val="single" w:color="BFBFBF" w:sz="4"/>
+            </w:tcBorders>
+            <w:tcMar>
+              <w:top w:type="dxa" w:w="60"/>
+              <w:left w:type="dxa" w:w="100"/>
+              <w:bottom w:type="dxa" w:w="60"/>
+              <w:right w:type="dxa" w:w="100"/>
+            </w:tcMar>
+          </w:tcPr>
+          <w:p>
+            <w:r>
+              <w:rPr>
+                <w:rFonts w:ascii="Calibri" w:cs="Calibri" w:eastAsia="Calibri" w:hAnsi="Calibri"/>
+                <w:sz w:val="20"/>
+                <w:szCs w:val="20"/>
+              </w:rPr>
+              <w:t xml:space="preserve">Where it goes</w:t>
+            </w:r>
+          </w:p>
+        </w:tc>
+        <w:tc>
+          <w:tcPr>
+            <w:tcW w:type="dxa" w:w="7460"/>
+            <w:tcBorders>
+              <w:top w:val="single" w:color="BFBFBF" w:sz="4"/>
+              <w:left w:val="single" w:color="BFBFBF" w:sz="4"/>
+              <w:bottom w:val="single" w:color="BFBFBF" w:sz="4"/>
+              <w:right w:val="single" w:color="BFBFBF" w:sz="4"/>
+            </w:tcBorders>
+            <w:tcMar>
+              <w:top w:type="dxa" w:w="60"/>
+              <w:left w:type="dxa" w:w="100"/>
+              <w:bottom w:type="dxa" w:w="60"/>
+              <w:right w:type="dxa" w:w="100"/>
+            </w:tcMar>
+          </w:tcPr>
+          <w:p>
+            <w:r>
+              <w:rPr>
+                <w:rFonts w:ascii="Calibri" w:cs="Calibri" w:eastAsia="Calibri" w:hAnsi="Calibri"/>
+                <w:sz w:val="20"/>
+                <w:szCs w:val="20"/>
+              </w:rPr>
+              <w:t xml:space="preserve">Emailed to Matt (OnePlatform) and Reggie (our Amazon rep), cc Avi G and Tara (OnePlatform)</w:t>
+            </w:r>
+          </w:p>
+        </w:tc>
+      </w:tr>
+      <w:tr>
+        <w:trPr>
+          <w:cantSplit/>
+        </w:trPr>
+        <w:tc>
+          <w:tcPr>
+            <w:tcW w:type="dxa" w:w="1900"/>
+            <w:tcBorders>
+              <w:top w:val="single" w:color="BFBFBF" w:sz="4"/>
+              <w:left w:val="single" w:color="BFBFBF" w:sz="4"/>
+              <w:bottom w:val="single" w:color="BFBFBF" w:sz="4"/>
+              <w:right w:val="single" w:color="BFBFBF" w:sz="4"/>
+            </w:tcBorders>
+            <w:tcMar>
+              <w:top w:type="dxa" w:w="60"/>
+              <w:left w:type="dxa" w:w="100"/>
+              <w:bottom w:type="dxa" w:w="60"/>
+              <w:right w:type="dxa" w:w="100"/>
+            </w:tcMar>
+          </w:tcPr>
+          <w:p>
+            <w:r>
+              <w:rPr>
+                <w:rFonts w:ascii="Calibri" w:cs="Calibri" w:eastAsia="Calibri" w:hAnsi="Calibri"/>
+                <w:sz w:val="20"/>
+                <w:szCs w:val="20"/>
+              </w:rPr>
+              <w:t xml:space="preserve">How long</w:t>
+            </w:r>
+          </w:p>
+        </w:tc>
+        <w:tc>
+          <w:tcPr>
+            <w:tcW w:type="dxa" w:w="7460"/>
+            <w:tcBorders>
+              <w:top w:val="single" w:color="BFBFBF" w:sz="4"/>
+              <w:left w:val="single" w:color="BFBFBF" w:sz="4"/>
+              <w:bottom w:val="single" w:color="BFBFBF" w:sz="4"/>
+              <w:right w:val="single" w:color="BFBFBF" w:sz="4"/>
+            </w:tcBorders>
+            <w:tcMar>
+              <w:top w:type="dxa" w:w="60"/>
+              <w:left w:type="dxa" w:w="100"/>
+              <w:bottom w:type="dxa" w:w="60"/>
+              <w:right w:type="dxa" w:w="100"/>
+            </w:tcMar>
+          </w:tcPr>
+          <w:p>
+            <w:r>
+              <w:rPr>
+                <w:rFonts w:ascii="Calibri" w:cs="Calibri" w:eastAsia="Calibri" w:hAnsi="Calibri"/>
+                <w:sz w:val="20"/>
+                <w:szCs w:val="20"/>
+              </w:rPr>
+              <w:t xml:space="preserve">Tina: under 10 minutes, depending on interruptions. Daniel: not known</w:t>
+            </w:r>
+          </w:p>
+        </w:tc>
+      </w:tr>
+    </w:tbl>
+    <w:p>
+      <w:pPr>
+        <w:spacing w:after="120"/>
+      </w:pPr>
+    </w:p>
+    <w:p>
+      <w:pPr>
+        <w:pStyle w:val="Heading2"/>
+        <w:keepNext/>
+        <w:spacing w:after="100" w:before="240"/>
+      </w:pPr>
+      <w:r>
+        <w:rPr>
+          <w:rFonts w:ascii="Calibri" w:cs="Calibri" w:eastAsia="Calibri" w:hAnsi="Calibri"/>
+        </w:rPr>
+        <w:t xml:space="preserve">The file</w:t>
+      </w:r>
+    </w:p>
+    <w:p>
+      <w:pPr>
+        <w:pStyle w:val="ListParagraph"/>
+        <w:numPr>
+          <w:ilvl w:val="0"/>
+          <w:numId w:val="2"/>
+        </w:numPr>
+        <w:spacing w:after="60"/>
+      </w:pPr>
+      <w:r>
+        <w:rPr>
+          <w:rFonts w:ascii="Calibri" w:cs="Calibri" w:eastAsia="Calibri" w:hAnsi="Calibri"/>
+        </w:rPr>
+        <w:t xml:space="preserve">OnePlatform's SharePoint Excel is a running report of everything we do with Amazon, with the full product list. Daniel copies one sheet into a base sheet on the network and reuses it to start each week's file.</w:t>
+      </w:r>
+    </w:p>
+    <w:p>
+      <w:pPr>
+        <w:pStyle w:val="ListParagraph"/>
+        <w:numPr>
+          <w:ilvl w:val="0"/>
+          <w:numId w:val="2"/>
+        </w:numPr>
+        <w:spacing w:after="60"/>
+      </w:pPr>
+      <w:r>
+        <w:rPr>
+          <w:rFonts w:ascii="Calibri" w:cs="Calibri" w:eastAsia="Calibri" w:hAnsi="Calibri"/>
+        </w:rPr>
+        <w:t xml:space="preserve">Black rows are items we keep selling. Red rows are discontinued or obsolete; they stay on so Amazon can sell its own remaining stock and OnePlatform still gets info on them. Once a red item's Amazon inventory is 0, it's dead. We work mostly with the black rows.</w:t>
+      </w:r>
+    </w:p>
+    <w:p>
+      <w:pPr>
+        <w:pStyle w:val="ListParagraph"/>
+        <w:numPr>
+          <w:ilvl w:val="0"/>
+          <w:numId w:val="2"/>
+        </w:numPr>
+        <w:spacing w:after="60"/>
+      </w:pPr>
+      <w:r>
+        <w:rPr>
+          <w:rFonts w:ascii="Calibri" w:cs="Calibri" w:eastAsia="Calibri" w:hAnsi="Calibri"/>
+        </w:rPr>
+        <w:t xml:space="preserve">Reds are updated from F&amp;O status: discontinued with stock left stays disco; discontinued with no stock becomes obsolete.</w:t>
+      </w:r>
+    </w:p>
+    <w:p>
+      <w:pPr>
+        <w:pStyle w:val="ListParagraph"/>
+        <w:numPr>
+          <w:ilvl w:val="0"/>
+          <w:numId w:val="2"/>
+        </w:numPr>
+        <w:spacing w:after="60"/>
+      </w:pPr>
+      <w:r>
+        <w:rPr>
+          <w:rFonts w:ascii="Calibri" w:cs="Calibri" w:eastAsia="Calibri" w:hAnsi="Calibri"/>
+        </w:rPr>
+        <w:t xml:space="preserve">We send the whole list every week, not just the items whose status changed.</w:t>
+      </w:r>
+    </w:p>
+    <w:p>
+      <w:pPr>
+        <w:pStyle w:val="ListParagraph"/>
+        <w:numPr>
+          <w:ilvl w:val="0"/>
+          <w:numId w:val="2"/>
+        </w:numPr>
+        <w:spacing w:after="60"/>
+      </w:pPr>
+      <w:r>
+        <w:rPr>
+          <w:rFonts w:ascii="Calibri" w:cs="Calibri" w:eastAsia="Calibri" w:hAnsi="Calibri"/>
+        </w:rPr>
+        <w:t xml:space="preserve">The only OnePlatform fields we don't have in F&amp;O are Amazon's product line, subcategory and similar. What we send is ASIN, SKU, UPC, product name and inventory status, and we have all of those.</w:t>
+      </w:r>
+    </w:p>
+    <w:p>
+      <w:pPr>
+        <w:pStyle w:val="Heading2"/>
+        <w:keepNext/>
+        <w:spacing w:after="100" w:before="240"/>
+      </w:pPr>
+      <w:r>
+        <w:rPr>
+          <w:rFonts w:ascii="Calibri" w:cs="Calibri" w:eastAsia="Calibri" w:hAnsi="Calibri"/>
+        </w:rPr>
+        <w:t xml:space="preserve">Stock levels</w:t>
+      </w:r>
+    </w:p>
+    <w:p>
+      <w:pPr>
+        <w:spacing w:after="120"/>
+      </w:pPr>
+      <w:r>
+        <w:rPr>
+          <w:rFonts w:ascii="Calibri" w:cs="Calibri" w:eastAsia="Calibri" w:hAnsi="Calibri"/>
+        </w:rPr>
+        <w:t xml:space="preserve">We don't give Amazon exact inventory because the warehouse is too fluid. The status uses on-hand pieces in F&amp;O for warehouse 1600, our only warehouse:</w:t>
+      </w:r>
+    </w:p>
+    <w:p>
+      <w:pPr>
+        <w:pStyle w:val="ListParagraph"/>
+        <w:numPr>
+          <w:ilvl w:val="0"/>
+          <w:numId w:val="2"/>
+        </w:numPr>
+        <w:spacing w:after="60"/>
+      </w:pPr>
+      <w:r>
+        <w:rPr>
+          <w:rFonts w:ascii="Calibri" w:cs="Calibri" w:eastAsia="Calibri" w:hAnsi="Calibri"/>
+          <w:b/>
+          <w:bCs/>
+        </w:rPr>
+        <w:t xml:space="preserve">Out of stock:</w:t>
+      </w:r>
+      <w:r>
+        <w:rPr>
+          <w:rFonts w:ascii="Calibri" w:cs="Calibri" w:eastAsia="Calibri" w:hAnsi="Calibri"/>
+        </w:rPr>
+        <w:t xml:space="preserve"> 11 pieces or fewer. Amazon requires full packs, and 12 is the most common pack size.</w:t>
+      </w:r>
+    </w:p>
+    <w:p>
+      <w:pPr>
+        <w:pStyle w:val="ListParagraph"/>
+        <w:numPr>
+          <w:ilvl w:val="0"/>
+          <w:numId w:val="2"/>
+        </w:numPr>
+        <w:spacing w:after="60"/>
+      </w:pPr>
+      <w:r>
+        <w:rPr>
+          <w:rFonts w:ascii="Calibri" w:cs="Calibri" w:eastAsia="Calibri" w:hAnsi="Calibri"/>
+          <w:b/>
+          <w:bCs/>
+        </w:rPr>
+        <w:t xml:space="preserve">Low stock:</w:t>
+      </w:r>
+      <w:r>
+        <w:rPr>
+          <w:rFonts w:ascii="Calibri" w:cs="Calibri" w:eastAsia="Calibri" w:hAnsi="Calibri"/>
+        </w:rPr>
+        <w:t xml:space="preserve"> under 50. The number is arbitrary. </w:t>
+      </w:r>
+      <w:r>
+        <w:rPr>
+          <w:rFonts w:ascii="Calibri" w:cs="Calibri" w:eastAsia="Calibri" w:hAnsi="Calibri"/>
+          <w:i/>
+          <w:iCs/>
+        </w:rPr>
+        <w:t xml:space="preserve">(Observer's view: it should probably be a multiple of 12, like 48 or 60. I'm not changing it now.)</w:t>
+      </w:r>
+    </w:p>
+    <w:p>
+      <w:pPr>
+        <w:pStyle w:val="ListParagraph"/>
+        <w:numPr>
+          <w:ilvl w:val="0"/>
+          <w:numId w:val="2"/>
+        </w:numPr>
+        <w:spacing w:after="60"/>
+      </w:pPr>
+      <w:r>
+        <w:rPr>
+          <w:rFonts w:ascii="Calibri" w:cs="Calibri" w:eastAsia="Calibri" w:hAnsi="Calibri"/>
+          <w:b/>
+          <w:bCs/>
+        </w:rPr>
+        <w:t xml:space="preserve">In stock:</w:t>
+      </w:r>
+      <w:r>
+        <w:rPr>
+          <w:rFonts w:ascii="Calibri" w:cs="Calibri" w:eastAsia="Calibri" w:hAnsi="Calibri"/>
+        </w:rPr>
+        <w:t xml:space="preserve"> 50 or more.</w:t>
+      </w:r>
+    </w:p>
+    <w:p>
+      <w:pPr>
+        <w:pStyle w:val="Heading2"/>
+        <w:keepNext/>
+        <w:spacing w:after="100" w:before="240"/>
+      </w:pPr>
+      <w:r>
+        <w:rPr>
+          <w:rFonts w:ascii="Calibri" w:cs="Calibri" w:eastAsia="Calibri" w:hAnsi="Calibri"/>
+        </w:rPr>
+        <w:t xml:space="preserve">Steps</w:t>
+      </w:r>
+    </w:p>
+    <w:p>
+      <w:pPr>
+        <w:pStyle w:val="ListParagraph"/>
+        <w:numPr>
+          <w:ilvl w:val="0"/>
+          <w:numId w:val="6"/>
+        </w:numPr>
+        <w:spacing w:after="60"/>
+      </w:pPr>
+      <w:r>
+        <w:rPr>
+          <w:rFonts w:ascii="Calibri" w:cs="Calibri" w:eastAsia="Calibri" w:hAnsi="Calibri"/>
+        </w:rPr>
+        <w:t xml:space="preserve">Daniel downloads OnePlatform's file from SharePoint and starts from his base sheet. He starts from scratch every week by design: a full download plus a lookup is easier than finding only the items that changed.</w:t>
+      </w:r>
+    </w:p>
+    <w:p>
+      <w:pPr>
+        <w:pStyle w:val="ListParagraph"/>
+        <w:numPr>
+          <w:ilvl w:val="0"/>
+          <w:numId w:val="6"/>
+        </w:numPr>
+        <w:spacing w:after="60"/>
+      </w:pPr>
+      <w:r>
+        <w:rPr>
+          <w:rFonts w:ascii="Calibri" w:cs="Calibri" w:eastAsia="Calibri" w:hAnsi="Calibri"/>
+        </w:rPr>
+        <w:t xml:space="preserve">Daniel marks each item in, low or out of stock from on-hand. When Tina used to do this part, a formula with a lookup to an on-hand download wrote the status automatically and it took her very little time. Tina doesn't know how long Daniel takes, and says he may be leaving.</w:t>
+      </w:r>
+    </w:p>
+    <w:p>
+      <w:pPr>
+        <w:pStyle w:val="ListParagraph"/>
+        <w:numPr>
+          <w:ilvl w:val="0"/>
+          <w:numId w:val="6"/>
+        </w:numPr>
+        <w:spacing w:after="60"/>
+      </w:pPr>
+      <w:r>
+        <w:rPr>
+          <w:rFonts w:ascii="Calibri" w:cs="Calibri" w:eastAsia="Calibri" w:hAnsi="Calibri"/>
+        </w:rPr>
+        <w:t xml:space="preserve">Daniel emails the file to Tina as an attachment, not a shared file.</w:t>
+      </w:r>
+    </w:p>
+    <w:p>
+      <w:pPr>
+        <w:pStyle w:val="ListParagraph"/>
+        <w:numPr>
+          <w:ilvl w:val="0"/>
+          <w:numId w:val="6"/>
+        </w:numPr>
+        <w:spacing w:after="60"/>
+      </w:pPr>
+      <w:r>
+        <w:rPr>
+          <w:rFonts w:ascii="Calibri" w:cs="Calibri" w:eastAsia="Calibri" w:hAnsi="Calibri"/>
+        </w:rPr>
+        <w:t xml:space="preserve">Tina downloads open PO lines from F&amp;O and VLOOKUPs the low and out-of-stock items to them, taking the earliest open PO date. Daniel can't do this step because he has no access to open PO lines or Goods in Transit.</w:t>
+      </w:r>
+    </w:p>
+    <w:p>
+      <w:pPr>
+        <w:pStyle w:val="ListParagraph"/>
+        <w:numPr>
+          <w:ilvl w:val="0"/>
+          <w:numId w:val="6"/>
+        </w:numPr>
+        <w:spacing w:after="60"/>
+      </w:pPr>
+      <w:r>
+        <w:rPr>
+          <w:rFonts w:ascii="Calibri" w:cs="Calibri" w:eastAsia="Calibri" w:hAnsi="Calibri"/>
+        </w:rPr>
+        <w:t xml:space="preserve">If that date is within 30 days of today, or already past, she pulls Goods in Transit for those items and uses its date instead. The open PO date is set when the PO is created; the Goods in Transit date is set when the goods ship and is updated as things change. Goods in Transit alone isn't enough, because items not yet on the water have no date there, so the result is a coalesce of the two. The 30-day rule comes from Avi Altman's explanation of how he updates dates in the system.</w:t>
+      </w:r>
+    </w:p>
+    <w:p>
+      <w:pPr>
+        <w:pStyle w:val="ListParagraph"/>
+        <w:numPr>
+          <w:ilvl w:val="0"/>
+          <w:numId w:val="6"/>
+        </w:numPr>
+        <w:spacing w:after="60"/>
+      </w:pPr>
+      <w:r>
+        <w:rPr>
+          <w:rFonts w:ascii="Calibri" w:cs="Calibri" w:eastAsia="Calibri" w:hAnsi="Calibri"/>
+        </w:rPr>
+        <w:t xml:space="preserve">With no open PO and no Goods in Transit, the date is left blank. A past date usually means the warehouse already received it.</w:t>
+      </w:r>
+    </w:p>
+    <w:p>
+      <w:pPr>
+        <w:pStyle w:val="ListParagraph"/>
+        <w:numPr>
+          <w:ilvl w:val="0"/>
+          <w:numId w:val="6"/>
+        </w:numPr>
+        <w:spacing w:after="60"/>
+      </w:pPr>
+      <w:r>
+        <w:rPr>
+          <w:rFonts w:ascii="Calibri" w:cs="Calibri" w:eastAsia="Calibri" w:hAnsi="Calibri"/>
+        </w:rPr>
+        <w:t xml:space="preserve">Tina emails the file to Matt and Reggie, cc Avi G and Tara.</w:t>
+      </w:r>
+    </w:p>
+    <w:p>
+      <w:pPr>
+        <w:pStyle w:val="Heading2"/>
+        <w:keepNext/>
+        <w:spacing w:after="100" w:before="240"/>
+      </w:pPr>
+      <w:r>
+        <w:rPr>
+          <w:rFonts w:ascii="Calibri" w:cs="Calibri" w:eastAsia="Calibri" w:hAnsi="Calibri"/>
+        </w:rPr>
+        <w:t xml:space="preserve">Gaps and ideas</w:t>
+      </w:r>
+    </w:p>
+    <w:p>
+      <w:pPr>
+        <w:pStyle w:val="ListParagraph"/>
+        <w:numPr>
+          <w:ilvl w:val="0"/>
+          <w:numId w:val="2"/>
+        </w:numPr>
+        <w:spacing w:after="60"/>
+      </w:pPr>
+      <w:r>
+        <w:rPr>
+          <w:rFonts w:ascii="Calibri" w:cs="Calibri" w:eastAsia="Calibri" w:hAnsi="Calibri"/>
+        </w:rPr>
+        <w:t xml:space="preserve">Out-of-stock items should be marked temporarily unavailable on Amazon with an in-stock date. Tina is fairly sure OnePlatform doesn't do it for us, and we don't do it either.</w:t>
+      </w:r>
+    </w:p>
+    <w:p>
+      <w:pPr>
+        <w:pStyle w:val="ListParagraph"/>
+        <w:numPr>
+          <w:ilvl w:val="0"/>
+          <w:numId w:val="2"/>
+        </w:numPr>
+        <w:spacing w:after="60"/>
+      </w:pPr>
+      <w:r>
+        <w:rPr>
+          <w:rFonts w:ascii="Calibri" w:cs="Calibri" w:eastAsia="Calibri" w:hAnsi="Calibri"/>
+          <w:i/>
+          <w:iCs/>
+        </w:rPr>
+        <w:t xml:space="preserve">(Observer's idea: an F&amp;O report with the due dates already coalesced would be an easy first step, even if nothing else in the flow changes. Since everything we send is already in F&amp;O, the whole file could be built for her every week.)</w:t>
+      </w:r>
+    </w:p>
+    <w:p>
+      <w:pPr>
+        <w:pStyle w:val="ListParagraph"/>
+        <w:numPr>
+          <w:ilvl w:val="0"/>
+          <w:numId w:val="2"/>
+        </w:numPr>
+        <w:spacing w:after="60"/>
+      </w:pPr>
+      <w:r>
+        <w:rPr>
+          <w:rFonts w:ascii="Calibri" w:cs="Calibri" w:eastAsia="Calibri" w:hAnsi="Calibri"/>
+          <w:i/>
+          <w:iCs/>
+        </w:rPr>
+        <w:t xml:space="preserve">(Observer's view: the file should be one shared file updated every week, not an attachment emailed back and forth.)</w:t>
+      </w:r>
+    </w:p>
+    <w:p>
+      <w:pPr>
+        <w:pStyle w:val="ListParagraph"/>
+        <w:numPr>
+          <w:ilvl w:val="0"/>
+          <w:numId w:val="2"/>
+        </w:numPr>
+        <w:spacing w:after="60"/>
+      </w:pPr>
+      <w:r>
+        <w:rPr>
+          <w:rFonts w:ascii="Calibri" w:cs="Calibri" w:eastAsia="Calibri" w:hAnsi="Calibri"/>
+        </w:rPr>
+        <w:t xml:space="preserve">Tina uses Teams well, and also a lot of email (relevant to the central channel idea).</w:t>
+      </w:r>
+    </w:p>
+    <w:p>
+      <w:pPr>
+        <w:pStyle w:val="Heading1"/>
+        <w:keepNext/>
+        <w:spacing w:after="160" w:before="360"/>
+      </w:pPr>
+      <w:r>
+        <w:rPr>
+          <w:rFonts w:ascii="Calibri" w:cs="Calibri" w:eastAsia="Calibri" w:hAnsi="Calibri"/>
+        </w:rPr>
+        <w:t xml:space="preserve">Part 14: Observer's Own Work (not part of the process study)</w:t>
       </w:r>
     </w:p>
     <w:p>
@@ -19680,7 +20773,7 @@
         <w:sz w:val="18"/>
         <w:szCs w:val="18"/>
       </w:rPr>
-      <w:t xml:space="preserve">Shadowing Report v2, Oct 14 to 21, 2026 | Page </w:t>
+      <w:t xml:space="preserve">Shadowing Report v2, Oct 14 to 23, 2026 | Page </w:t>
     </w:r>
     <w:r>
       <w:rPr>
@@ -19856,6 +20949,18 @@
       </w:pPr>
     </w:lvl>
   </w:abstractNum>
+  <w:abstractNum w:abstractNumId="6" w15:restartNumberingAfterBreak="0">
+    <w:multiLevelType w:val="hybridMultilevel"/>
+    <w:lvl w:ilvl="0" w:tentative="1">
+      <w:start w:val="1"/>
+      <w:numFmt w:val="decimal"/>
+      <w:lvlText w:val="%1."/>
+      <w:lvlJc w:val="left"/>
+      <w:pPr>
+        <w:ind w:left="540" w:hanging="360"/>
+      </w:pPr>
+    </w:lvl>
+  </w:abstractNum>
   <w:num w:numId="1">
     <w:abstractNumId w:val="1"/>
     <w:lvlOverride w:ilvl="0">
@@ -19882,6 +20987,12 @@
   </w:num>
   <w:num w:numId="5">
     <w:abstractNumId w:val="5"/>
+    <w:lvlOverride w:ilvl="0">
+      <w:startOverride w:val="1"/>
+    </w:lvlOverride>
+  </w:num>
+  <w:num w:numId="6">
+    <w:abstractNumId w:val="6"/>
     <w:lvlOverride w:ilvl="0">
       <w:startOverride w:val="1"/>
     </w:lvlOverride>
@@ -19974,6 +21085,139 @@
     <w:basedOn w:val="Normal"/>
     <w:qFormat/>
   </w:style>
+  <w:style w:type="paragraph" w:styleId="Caption">
+    <w:name w:val="caption"/>
+    <w:basedOn w:val="Normal"/>
+    <w:next w:val="Normal"/>
+    <w:uiPriority w:val="35"/>
+    <w:semiHidden/>
+    <w:unhideWhenUsed/>
+    <w:qFormat/>
+    <w:pPr>
+      <w:spacing w:after="200"/>
+    </w:pPr>
+    <w:rPr>
+      <w:i/>
+      <w:iCs/>
+      <w:color w:val="44546A" w:themeColor="dark2"/>
+      <w:sz w:val="18"/>
+      <w:szCs w:val="18"/>
+    </w:rPr>
+  </w:style>
+  <w:style w:type="paragraph" w:styleId="Bibliography">
+    <w:name w:val="Bibliography"/>
+    <w:basedOn w:val="Normal"/>
+    <w:next w:val="Normal"/>
+    <w:uiPriority w:val="37"/>
+    <w:unhideWhenUsed/>
+  </w:style>
+  <w:style w:type="paragraph" w:styleId="TOC1">
+    <w:name w:val="toc 1"/>
+    <w:basedOn w:val="Normal"/>
+    <w:next w:val="Normal"/>
+    <w:uiPriority w:val="39"/>
+    <w:semiHidden/>
+    <w:unhideWhenUsed/>
+    <w:pPr>
+      <w:spacing w:after="100"/>
+    </w:pPr>
+  </w:style>
+  <w:style w:type="paragraph" w:styleId="TOC2">
+    <w:name w:val="toc 2"/>
+    <w:basedOn w:val="Normal"/>
+    <w:next w:val="Normal"/>
+    <w:uiPriority w:val="39"/>
+    <w:semiHidden/>
+    <w:unhideWhenUsed/>
+    <w:pPr>
+      <w:spacing w:after="100"/>
+      <w:ind w:left="220"/>
+    </w:pPr>
+  </w:style>
+  <w:style w:type="paragraph" w:styleId="TOC3">
+    <w:name w:val="toc 3"/>
+    <w:basedOn w:val="Normal"/>
+    <w:next w:val="Normal"/>
+    <w:uiPriority w:val="39"/>
+    <w:semiHidden/>
+    <w:unhideWhenUsed/>
+    <w:pPr>
+      <w:spacing w:after="100"/>
+      <w:ind w:left="440"/>
+    </w:pPr>
+  </w:style>
+  <w:style w:type="paragraph" w:styleId="TOC4">
+    <w:name w:val="toc 4"/>
+    <w:basedOn w:val="Normal"/>
+    <w:next w:val="Normal"/>
+    <w:uiPriority w:val="39"/>
+    <w:semiHidden/>
+    <w:unhideWhenUsed/>
+    <w:pPr>
+      <w:spacing w:after="100"/>
+      <w:ind w:left="660"/>
+    </w:pPr>
+  </w:style>
+  <w:style w:type="paragraph" w:styleId="TOC5">
+    <w:name w:val="toc 5"/>
+    <w:basedOn w:val="Normal"/>
+    <w:next w:val="Normal"/>
+    <w:uiPriority w:val="39"/>
+    <w:semiHidden/>
+    <w:unhideWhenUsed/>
+    <w:pPr>
+      <w:spacing w:after="100"/>
+      <w:ind w:left="880"/>
+    </w:pPr>
+  </w:style>
+  <w:style w:type="paragraph" w:styleId="TOC6">
+    <w:name w:val="toc 6"/>
+    <w:basedOn w:val="Normal"/>
+    <w:next w:val="Normal"/>
+    <w:uiPriority w:val="39"/>
+    <w:semiHidden/>
+    <w:unhideWhenUsed/>
+    <w:pPr>
+      <w:spacing w:after="100"/>
+      <w:ind w:left="1100"/>
+    </w:pPr>
+  </w:style>
+  <w:style w:type="paragraph" w:styleId="TOC7">
+    <w:name w:val="toc 7"/>
+    <w:basedOn w:val="Normal"/>
+    <w:next w:val="Normal"/>
+    <w:uiPriority w:val="39"/>
+    <w:semiHidden/>
+    <w:unhideWhenUsed/>
+    <w:pPr>
+      <w:spacing w:after="100"/>
+      <w:ind w:left="1320"/>
+    </w:pPr>
+  </w:style>
+  <w:style w:type="paragraph" w:styleId="TOC8">
+    <w:name w:val="toc 8"/>
+    <w:basedOn w:val="Normal"/>
+    <w:next w:val="Normal"/>
+    <w:uiPriority w:val="39"/>
+    <w:semiHidden/>
+    <w:unhideWhenUsed/>
+    <w:pPr>
+      <w:spacing w:after="100"/>
+      <w:ind w:left="1540"/>
+    </w:pPr>
+  </w:style>
+  <w:style w:type="paragraph" w:styleId="TOC9">
+    <w:name w:val="toc 9"/>
+    <w:basedOn w:val="Normal"/>
+    <w:next w:val="Normal"/>
+    <w:uiPriority w:val="39"/>
+    <w:semiHidden/>
+    <w:unhideWhenUsed/>
+    <w:pPr>
+      <w:spacing w:after="100"/>
+      <w:ind w:left="1760"/>
+    </w:pPr>
+  </w:style>
   <w:style w:type="character" w:styleId="Hyperlink">
     <w:name w:val="Hyperlink"/>
     <w:basedOn w:val="DefaultParagraphFont"/>
@@ -20057,6 +21301,13 @@
       <w:sz w:val="20"/>
       <w:szCs w:val="20"/>
     </w:rPr>
+  </w:style>
+  <w:style w:type="character" w:styleId="LineNumber">
+    <w:name w:val="line number"/>
+    <w:basedOn w:val="DefaultParagraphFont"/>
+    <w:uiPriority w:val="99"/>
+    <w:semiHidden/>
+    <w:unhideWhenUsed/>
   </w:style>
   <w:style w:type="paragraph" w:styleId="Heading1">
     <w:name w:val="Heading 1"/>

</xml_diff>

<commit_message>
Day 7 follow-up: available qty, whole Amazon catalog, drop 30-day rule
Co-Authored-By: Devin AI <158243242+devin-ai-integration[bot]@users.noreply.github.com>
</commit_message>
<xml_diff>
--- a/Shadowing_Report_2026-10-22_v2.docx
+++ b/Shadowing_Report_2026-10-22_v2.docx
@@ -3117,7 +3117,7 @@
                 <w:sz w:val="20"/>
                 <w:szCs w:val="20"/>
               </w:rPr>
-              <w:t xml:space="preserve">Builds the whole file from F&amp;O: ASIN, SKU, UPC, product name and status for every item. Status comes from on-hand in warehouse 1600: 11 pieces or fewer is out of stock, under 50 is low, 50 or more is in stock. For low and out-of-stock items it adds the next available date: the Goods in Transit date where there is one, otherwise the earliest open PO date, blank if neither. Discontinued items are marked disco while we have stock and obsolete once we don't. Then it drafts the email to Matt and Reggie, cc Avi G and Tara. First step (my idea): an F&amp;O report with the dates already coalesced, even before anything else changes.</w:t>
+              <w:t xml:space="preserve">Builds the whole file from F&amp;O: ASIN, SKU, UPC, product name and status for every item. Status comes from available quantity in warehouse 1600: 11 pieces or fewer is out of stock, under 50 is low, 50 or more is in stock. For low and out-of-stock items it adds the next available date: the Goods in Transit date where there is one, otherwise the earliest open PO date, blank if neither. Discontinued items are marked disco while we have stock and obsolete once we don't. No 30-day cutoff. Then it drafts the email to Matt and Reggie, cc Avi G and Tara. First step (my idea): an F&amp;O report with the dates already coalesced, even before anything else changes.</w:t>
             </w:r>
           </w:p>
         </w:tc>
@@ -3176,7 +3176,7 @@
                 <w:sz w:val="20"/>
                 <w:szCs w:val="20"/>
               </w:rPr>
-              <w:t xml:space="preserve">F&amp;O items (ASIN, SKU, UPC, name, status), on-hand for 1600, open PO lines, Goods in Transit; OnePlatform's file only as a cross-check</w:t>
+              <w:t xml:space="preserve">F&amp;O items (ASIN, SKU, UPC, name, status), available quantity for 1600, open PO lines, Goods in Transit; OnePlatform's file only as a cross-check</w:t>
             </w:r>
           </w:p>
         </w:tc>
@@ -3235,7 +3235,7 @@
                 <w:sz w:val="20"/>
                 <w:szCs w:val="20"/>
               </w:rPr>
-              <w:t xml:space="preserve">Day 2: Tina's six-step download, filter and match. Day 7: the full weekly cycle. Daniel restarts the file every week and emails it to Tina as an attachment. Tina's part is under 10 minutes; when she used to do Daniel's part, a lookup formula wrote the status automatically. The only OnePlatform fields we don't have (Amazon product line, subcategory) aren't needed in what we send. The whole list goes out every week. Out-of-stock items aren't marked temporarily unavailable with an in-stock date, by us or OnePlatform.</w:t>
+              <w:t xml:space="preserve">Day 2: Tina's six-step download, filter and match. Day 7: the full weekly cycle. Daniel restarts the file every week and emails it to Tina as an attachment. Tina's part is under 10 minutes; when she used to do Daniel's part, a lookup formula wrote the status automatically. The only OnePlatform fields we don't have (Amazon product line, subcategory) aren't needed in what we send. The whole list, every item in our Amazon catalog, goes out every week. Follow-up: Tina uses available quantity; the 30-day cutoff should go (Goods in Transit first, then the earliest open PO). Out-of-stock items aren't marked temporarily unavailable with an in-stock date, by us or OnePlatform.</w:t>
             </w:r>
           </w:p>
         </w:tc>
@@ -3294,7 +3294,7 @@
                 <w:sz w:val="20"/>
                 <w:szCs w:val="20"/>
               </w:rPr>
-              <w:t xml:space="preserve">Items on the file and how many need dates; on-hand or available quantity; whether the 30-day Goods in Transit cutoff should stay (it follows how Avi Altman updates dates); who should mark items temporarily unavailable</w:t>
+              <w:t xml:space="preserve">How many items need dates each week; how long Daniel's part takes; who should mark items temporarily unavailable</w:t>
             </w:r>
           </w:p>
         </w:tc>
@@ -5218,7 +5218,7 @@
         <w:rPr>
           <w:rFonts w:ascii="Calibri" w:cs="Calibri" w:eastAsia="Calibri" w:hAnsi="Calibri"/>
         </w:rPr>
-        <w:t xml:space="preserve">For each top-5 item: how often it happens and how many each time. Still open: items on the weekly OnePlatform file and how long Daniel's part takes; Suzanne's checks a week; how long Baruch Salamander's reports take.</w:t>
+        <w:t xml:space="preserve">For each top-5 item: how often it happens and how many each time. Still open: how long Daniel's part of the OnePlatform file takes and how many items need dates; Suzanne's checks a week; how long Baruch Salamander's reports take.</w:t>
       </w:r>
     </w:p>
     <w:p>
@@ -20322,7 +20322,7 @@
         <w:rPr>
           <w:rFonts w:ascii="Calibri" w:cs="Calibri" w:eastAsia="Calibri" w:hAnsi="Calibri"/>
         </w:rPr>
-        <w:t xml:space="preserve">We send the whole list every week, not just the items whose status changed.</w:t>
+        <w:t xml:space="preserve">We send the whole list every week, not just the items whose status changed. The list is every item in our Amazon catalog; there is no exact count.</w:t>
       </w:r>
     </w:p>
     <w:p>
@@ -20362,7 +20362,7 @@
         <w:rPr>
           <w:rFonts w:ascii="Calibri" w:cs="Calibri" w:eastAsia="Calibri" w:hAnsi="Calibri"/>
         </w:rPr>
-        <w:t xml:space="preserve">We don't give Amazon exact inventory because the warehouse is too fluid. The status uses on-hand pieces in F&amp;O for warehouse 1600, our only warehouse:</w:t>
+        <w:t xml:space="preserve">We don't give Amazon exact inventory because the warehouse is too fluid. The status uses pieces in F&amp;O for warehouse 1600, our only warehouse. Tina uses available quantity; Daniel was first said to use on-hand, which still needs checking with him.</w:t>
       </w:r>
     </w:p>
     <w:p>
@@ -20535,7 +20535,15 @@
         <w:rPr>
           <w:rFonts w:ascii="Calibri" w:cs="Calibri" w:eastAsia="Calibri" w:hAnsi="Calibri"/>
         </w:rPr>
-        <w:t xml:space="preserve">If that date is within 30 days of today, or already past, she pulls Goods in Transit for those items and uses its date instead. The open PO date is set when the PO is created; the Goods in Transit date is set when the goods ship and is updated as things change. Goods in Transit alone isn't enough, because items not yet on the water have no date there, so the result is a coalesce of the two. The 30-day rule comes from Avi Altman's explanation of how he updates dates in the system.</w:t>
+        <w:t xml:space="preserve">If that date is within 30 days of today, or already past, she pulls Goods in Transit for those items and uses its date instead. The open PO date is set when the PO is created; the Goods in Transit date is set when the goods ship and is updated as things change. Goods in Transit alone isn't enough, because items not yet on the water have no date there, so the result is a coalesce of the two. The 30-day rule comes from Avi Altman's explanation of how he updates dates in the system. </w:t>
+      </w:r>
+      <w:r>
+        <w:rPr>
+          <w:rFonts w:ascii="Calibri" w:cs="Calibri" w:eastAsia="Calibri" w:hAnsi="Calibri"/>
+          <w:i/>
+          <w:iCs/>
+        </w:rPr>
+        <w:t xml:space="preserve">(Observer's view: the rule should already be gone. Goods in Transit dates first, then the earliest open PO date for items still without one, is fine, and I had already recommended it to her.)</w:t>
       </w:r>
     </w:p>
     <w:p>

</xml_diff>

<commit_message>
Inventory feeds: Daniel's 5 daily customers, his 24 cutoff; broaden Bot C and the process write-up
Co-Authored-By: Devin AI <158243242+devin-ai-integration[bot]@users.noreply.github.com>
</commit_message>
<xml_diff>
--- a/Shadowing_Report_2026-10-22_v2.docx
+++ b/Shadowing_Report_2026-10-22_v2.docx
@@ -913,7 +913,7 @@
                 <w:sz w:val="20"/>
                 <w:szCs w:val="20"/>
               </w:rPr>
-              <w:t xml:space="preserve">Weekly Amazon inventory file for OnePlatform (Vendo)</w:t>
+              <w:t xml:space="preserve">Customer inventory feeds (Amazon weekly for OnePlatform, 5 customers daily)</w:t>
             </w:r>
           </w:p>
         </w:tc>
@@ -940,7 +940,7 @@
                 <w:sz w:val="20"/>
                 <w:szCs w:val="20"/>
               </w:rPr>
-              <w:t xml:space="preserve">Every Friday Daniel rebuilds the file and marks each item in, low or out of stock, then Tina adds next available dates from open PO lines and Goods in Transit with VLOOKUPs. Her part is under 10 minutes; Daniel's isn't measured, and Tina says he may be leaving. Everything we send is already in F&amp;O, so the whole file can be built from it. Out-of-stock items are not marked temporarily unavailable on Amazon.</w:t>
+              <w:t xml:space="preserve">Daniel builds six inventory feeds by hand-filtering an F&amp;O inventory download: Amazon weekly, and Mason, Dealora, Kohls, Lincoln Comfy and Sears daily, each in its own format. The daily ones take about 10 to 15 minutes a day, roughly 1 to 1.25 hours a week. For Amazon, Tina then adds next available dates from open PO lines and Goods in Transit with VLOOKUPs (under 10 minutes). Tina says Daniel may be leaving. Everything we send is already in F&amp;O, so the whole file can be built from it. Out-of-stock items are not marked temporarily unavailable on Amazon.</w:t>
             </w:r>
           </w:p>
         </w:tc>
@@ -994,7 +994,7 @@
                 <w:sz w:val="20"/>
                 <w:szCs w:val="20"/>
               </w:rPr>
-              <w:t xml:space="preserve">Peleg with Tina</w:t>
+              <w:t xml:space="preserve">Peleg with Daniel and Tina</w:t>
             </w:r>
           </w:p>
         </w:tc>
@@ -2931,7 +2931,7 @@
         <w:rPr>
           <w:rFonts w:ascii="Calibri" w:cs="Calibri" w:eastAsia="Calibri" w:hAnsi="Calibri"/>
         </w:rPr>
-        <w:t xml:space="preserve">C. Weekly Amazon inventory file for OnePlatform (opportunity 3)</w:t>
+        <w:t xml:space="preserve">C. Customer inventory feeds (opportunity 3)</w:t>
       </w:r>
     </w:p>
     <w:tbl>
@@ -3058,7 +3058,7 @@
                 <w:sz w:val="20"/>
                 <w:szCs w:val="20"/>
               </w:rPr>
-              <w:t xml:space="preserve">Weekly, on Friday (OnePlatform, formerly Vendo, updates its file usually Thursday, sometimes Friday)</w:t>
+              <w:t xml:space="preserve">Daily for Mason, Dealora, Kohls, Lincoln Comfy and Sears; weekly on Friday for Amazon (OnePlatform, formerly Vendo, updates its file usually Thursday, sometimes Friday)</w:t>
             </w:r>
           </w:p>
         </w:tc>
@@ -3117,7 +3117,7 @@
                 <w:sz w:val="20"/>
                 <w:szCs w:val="20"/>
               </w:rPr>
-              <w:t xml:space="preserve">Builds the whole file from F&amp;O: ASIN, SKU, UPC, product name and status for every item. Status comes from available quantity in warehouse 1600: 11 pieces or fewer is out of stock, under 50 is low, 50 or more is in stock. For low and out-of-stock items it adds the next available date: the Goods in Transit date where there is one, otherwise the earliest open PO date, blank if neither. Discontinued items are marked disco while we have stock and obsolete once we don't. No 30-day cutoff. Then it drafts the email to Matt and Reggie, cc Avi G and Tara. First step (my idea): an F&amp;O report with the dates already coalesced, even before anything else changes.</w:t>
+              <w:t xml:space="preserve">Builds every feed from one F&amp;O inventory pull, in each customer's own format. Daily customers get a quantity of 0, 24 or 50; it uploads the Mason, Kohls and Sears files to their portals (or queues them) and drafts the Dealora and Lincoln emails. For Amazon it builds the whole file from F&amp;O: ASIN, SKU, UPC, product name and status for every Amazon dropship item. Status comes from quantity in warehouse 1600 using one agreed set of cutoffs (Daniel uses under 24 out, 24 to 50 low; Tina described 11 or fewer out, under 50 low). For low and out-of-stock items it adds the next available date: the Goods in Transit date where there is one, otherwise the earliest open PO date, blank if neither. Discontinued items are marked disco while we have stock and obsolete once we don't. No 30-day cutoff. Then it drafts the Amazon email to Matt and Reggie, cc Avi G and Tara, and saves the file to OneDrive. First step (my idea): an F&amp;O report with the dates already coalesced, even before anything else changes.</w:t>
             </w:r>
           </w:p>
         </w:tc>
@@ -3176,7 +3176,7 @@
                 <w:sz w:val="20"/>
                 <w:szCs w:val="20"/>
               </w:rPr>
-              <w:t xml:space="preserve">F&amp;O items (ASIN, SKU, UPC, name, status), available quantity for 1600, open PO lines, Goods in Transit; OnePlatform's file only as a cross-check</w:t>
+              <w:t xml:space="preserve">F&amp;O items (ASIN, SKU, UPC, name, status), quantity for 1600, open PO lines, Goods in Transit; each customer's template; Lincoln Comfy image URLs and Sears variation group IDs if needed; OnePlatform's file only as a cross-check</w:t>
             </w:r>
           </w:p>
         </w:tc>
@@ -3235,7 +3235,7 @@
                 <w:sz w:val="20"/>
                 <w:szCs w:val="20"/>
               </w:rPr>
-              <w:t xml:space="preserve">Day 2: Tina's six-step download, filter and match. Day 7: the full weekly cycle. Daniel restarts the file every week and emails it to Tina as an attachment. Tina's part is under 10 minutes; when she used to do Daniel's part, a lookup formula wrote the status automatically. The only OnePlatform fields we don't have (Amazon product line, subcategory) aren't needed in what we send. The whole list, every item in our Amazon catalog, goes out every week. Follow-up: Tina uses available quantity; the 30-day cutoff should go (Goods in Transit first, then the earliest open PO). Out-of-stock items aren't marked temporarily unavailable with an in-stock date, by us or OnePlatform.</w:t>
+              <w:t xml:space="preserve">Day 2: Tina's six-step download, filter and match. Day 7: the full weekly cycle. Daniel restarts the file every week and emails it to Tina as an attachment. Tina's part is under 10 minutes; when she used to do Daniel's part, a lookup formula wrote the status automatically. The only OnePlatform fields we don't have (Amazon product line, subcategory) aren't needed in what we send. The whole list, every item in our Amazon catalog, goes out every week. Follow-up: Tina uses available quantity; the 30-day cutoff should go (Goods in Transit first, then the earliest open PO). Out-of-stock items aren't marked temporarily unavailable with an in-stock date, by us or OnePlatform. Follow-up with Daniel: the same hand-filter and VLOOKUP runs daily for five more customers, about 10 to 15 minutes a day for all of them; the Amazon file is dropship only.</w:t>
             </w:r>
           </w:p>
         </w:tc>
@@ -3294,7 +3294,7 @@
                 <w:sz w:val="20"/>
                 <w:szCs w:val="20"/>
               </w:rPr>
-              <w:t xml:space="preserve">How many items need dates each week; how long Daniel's part takes; who should mark items temporarily unavailable</w:t>
+              <w:t xml:space="preserve">Which out-of-stock cutoff is right (24 or 12); whether Kohls is still "under 5, send 0" and who uploads it; whether Lincoln Comfy needs image URLs and where they live; what Sears' variation group ID is; who should mark items temporarily unavailable</w:t>
             </w:r>
           </w:p>
         </w:tc>
@@ -5218,7 +5218,7 @@
         <w:rPr>
           <w:rFonts w:ascii="Calibri" w:cs="Calibri" w:eastAsia="Calibri" w:hAnsi="Calibri"/>
         </w:rPr>
-        <w:t xml:space="preserve">For each top-5 item: how often it happens and how many each time. Still open: how long Daniel's part of the OnePlatform file takes and how many items need dates; Suzanne's checks a week; how long Baruch Salamander's reports take.</w:t>
+        <w:t xml:space="preserve">For each top-5 item: how often it happens and how many each time. Still open: how many Amazon items need dates; Suzanne's checks a week; how long Baruch Salamander's reports take.</w:t>
       </w:r>
     </w:p>
     <w:p>
@@ -7260,7 +7260,7 @@
                 <w:sz w:val="20"/>
                 <w:szCs w:val="20"/>
               </w:rPr>
-              <w:t xml:space="preserve">Tina (Daniel's part described): weekly Amazon inventory file for OnePlatform (Vendo)</w:t>
+              <w:t xml:space="preserve">Tina (Daniel's part described): weekly Amazon inventory file for OnePlatform (Vendo); follow-up with Daniel on his daily feeds</w:t>
             </w:r>
           </w:p>
         </w:tc>
@@ -20657,6 +20657,963 @@
           <w:rFonts w:ascii="Calibri" w:cs="Calibri" w:eastAsia="Calibri" w:hAnsi="Calibri"/>
         </w:rPr>
         <w:t xml:space="preserve">Tina uses Teams well, and also a lot of email (relevant to the central channel idea).</w:t>
+      </w:r>
+    </w:p>
+    <w:p>
+      <w:pPr>
+        <w:pStyle w:val="Heading2"/>
+        <w:keepNext/>
+        <w:spacing w:after="100" w:before="240"/>
+      </w:pPr>
+      <w:r>
+        <w:rPr>
+          <w:rFonts w:ascii="Calibri" w:cs="Calibri" w:eastAsia="Calibri" w:hAnsi="Calibri"/>
+        </w:rPr>
+        <w:t xml:space="preserve">Follow-up with Daniel: five more customers, daily</w:t>
+      </w:r>
+    </w:p>
+    <w:p>
+      <w:pPr>
+        <w:spacing w:after="120"/>
+      </w:pPr>
+      <w:r>
+        <w:rPr>
+          <w:rFonts w:ascii="Calibri" w:cs="Calibri" w:eastAsia="Calibri" w:hAnsi="Calibri"/>
+        </w:rPr>
+        <w:t xml:space="preserve">From a conversation with Daniel afterwards, not watched. The Amazon file is one of six inventory feeds he builds.</w:t>
+      </w:r>
+    </w:p>
+    <w:tbl>
+      <w:tblPr>
+        <w:tblW w:type="dxa" w:w="9360"/>
+        <w:tblBorders>
+          <w:top w:val="single" w:color="auto" w:sz="4"/>
+          <w:left w:val="single" w:color="auto" w:sz="4"/>
+          <w:bottom w:val="single" w:color="auto" w:sz="4"/>
+          <w:right w:val="single" w:color="auto" w:sz="4"/>
+          <w:insideH w:val="single" w:color="auto" w:sz="4"/>
+          <w:insideV w:val="single" w:color="auto" w:sz="4"/>
+        </w:tblBorders>
+      </w:tblPr>
+      <w:tblGrid>
+        <w:gridCol w:w="1900"/>
+        <w:gridCol w:w="1300"/>
+        <w:gridCol w:w="2560"/>
+        <w:gridCol w:w="3600"/>
+      </w:tblGrid>
+      <w:tr>
+        <w:trPr>
+          <w:tblHeader/>
+        </w:trPr>
+        <w:tc>
+          <w:tcPr>
+            <w:tcW w:type="dxa" w:w="1900"/>
+            <w:tcBorders>
+              <w:top w:val="single" w:color="BFBFBF" w:sz="4"/>
+              <w:left w:val="single" w:color="BFBFBF" w:sz="4"/>
+              <w:bottom w:val="single" w:color="BFBFBF" w:sz="4"/>
+              <w:right w:val="single" w:color="BFBFBF" w:sz="4"/>
+            </w:tcBorders>
+            <w:shd w:fill="D9E2F3" w:color="auto" w:val="clear"/>
+            <w:tcMar>
+              <w:top w:type="dxa" w:w="60"/>
+              <w:left w:type="dxa" w:w="100"/>
+              <w:bottom w:type="dxa" w:w="60"/>
+              <w:right w:type="dxa" w:w="100"/>
+            </w:tcMar>
+          </w:tcPr>
+          <w:p>
+            <w:r>
+              <w:rPr>
+                <w:rFonts w:ascii="Calibri" w:cs="Calibri" w:eastAsia="Calibri" w:hAnsi="Calibri"/>
+                <w:b/>
+                <w:bCs/>
+                <w:sz w:val="20"/>
+                <w:szCs w:val="20"/>
+              </w:rPr>
+              <w:t xml:space="preserve">Customer</w:t>
+            </w:r>
+          </w:p>
+        </w:tc>
+        <w:tc>
+          <w:tcPr>
+            <w:tcW w:type="dxa" w:w="1300"/>
+            <w:tcBorders>
+              <w:top w:val="single" w:color="BFBFBF" w:sz="4"/>
+              <w:left w:val="single" w:color="BFBFBF" w:sz="4"/>
+              <w:bottom w:val="single" w:color="BFBFBF" w:sz="4"/>
+              <w:right w:val="single" w:color="BFBFBF" w:sz="4"/>
+            </w:tcBorders>
+            <w:shd w:fill="D9E2F3" w:color="auto" w:val="clear"/>
+            <w:tcMar>
+              <w:top w:type="dxa" w:w="60"/>
+              <w:left w:type="dxa" w:w="100"/>
+              <w:bottom w:type="dxa" w:w="60"/>
+              <w:right w:type="dxa" w:w="100"/>
+            </w:tcMar>
+          </w:tcPr>
+          <w:p>
+            <w:r>
+              <w:rPr>
+                <w:rFonts w:ascii="Calibri" w:cs="Calibri" w:eastAsia="Calibri" w:hAnsi="Calibri"/>
+                <w:b/>
+                <w:bCs/>
+                <w:sz w:val="20"/>
+                <w:szCs w:val="20"/>
+              </w:rPr>
+              <w:t xml:space="preserve">How often</w:t>
+            </w:r>
+          </w:p>
+        </w:tc>
+        <w:tc>
+          <w:tcPr>
+            <w:tcW w:type="dxa" w:w="2560"/>
+            <w:tcBorders>
+              <w:top w:val="single" w:color="BFBFBF" w:sz="4"/>
+              <w:left w:val="single" w:color="BFBFBF" w:sz="4"/>
+              <w:bottom w:val="single" w:color="BFBFBF" w:sz="4"/>
+              <w:right w:val="single" w:color="BFBFBF" w:sz="4"/>
+            </w:tcBorders>
+            <w:shd w:fill="D9E2F3" w:color="auto" w:val="clear"/>
+            <w:tcMar>
+              <w:top w:type="dxa" w:w="60"/>
+              <w:left w:type="dxa" w:w="100"/>
+              <w:bottom w:type="dxa" w:w="60"/>
+              <w:right w:type="dxa" w:w="100"/>
+            </w:tcMar>
+          </w:tcPr>
+          <w:p>
+            <w:r>
+              <w:rPr>
+                <w:rFonts w:ascii="Calibri" w:cs="Calibri" w:eastAsia="Calibri" w:hAnsi="Calibri"/>
+                <w:b/>
+                <w:bCs/>
+                <w:sz w:val="20"/>
+                <w:szCs w:val="20"/>
+              </w:rPr>
+              <w:t xml:space="preserve">What they get</w:t>
+            </w:r>
+          </w:p>
+        </w:tc>
+        <w:tc>
+          <w:tcPr>
+            <w:tcW w:type="dxa" w:w="3600"/>
+            <w:tcBorders>
+              <w:top w:val="single" w:color="BFBFBF" w:sz="4"/>
+              <w:left w:val="single" w:color="BFBFBF" w:sz="4"/>
+              <w:bottom w:val="single" w:color="BFBFBF" w:sz="4"/>
+              <w:right w:val="single" w:color="BFBFBF" w:sz="4"/>
+            </w:tcBorders>
+            <w:shd w:fill="D9E2F3" w:color="auto" w:val="clear"/>
+            <w:tcMar>
+              <w:top w:type="dxa" w:w="60"/>
+              <w:left w:type="dxa" w:w="100"/>
+              <w:bottom w:type="dxa" w:w="60"/>
+              <w:right w:type="dxa" w:w="100"/>
+            </w:tcMar>
+          </w:tcPr>
+          <w:p>
+            <w:r>
+              <w:rPr>
+                <w:rFonts w:ascii="Calibri" w:cs="Calibri" w:eastAsia="Calibri" w:hAnsi="Calibri"/>
+                <w:b/>
+                <w:bCs/>
+                <w:sz w:val="20"/>
+                <w:szCs w:val="20"/>
+              </w:rPr>
+              <w:t xml:space="preserve">How it's sent</w:t>
+            </w:r>
+          </w:p>
+        </w:tc>
+      </w:tr>
+      <w:tr>
+        <w:trPr>
+          <w:cantSplit/>
+        </w:trPr>
+        <w:tc>
+          <w:tcPr>
+            <w:tcW w:type="dxa" w:w="1900"/>
+            <w:tcBorders>
+              <w:top w:val="single" w:color="BFBFBF" w:sz="4"/>
+              <w:left w:val="single" w:color="BFBFBF" w:sz="4"/>
+              <w:bottom w:val="single" w:color="BFBFBF" w:sz="4"/>
+              <w:right w:val="single" w:color="BFBFBF" w:sz="4"/>
+            </w:tcBorders>
+            <w:tcMar>
+              <w:top w:type="dxa" w:w="60"/>
+              <w:left w:type="dxa" w:w="100"/>
+              <w:bottom w:type="dxa" w:w="60"/>
+              <w:right w:type="dxa" w:w="100"/>
+            </w:tcMar>
+          </w:tcPr>
+          <w:p>
+            <w:r>
+              <w:rPr>
+                <w:rFonts w:ascii="Calibri" w:cs="Calibri" w:eastAsia="Calibri" w:hAnsi="Calibri"/>
+                <w:sz w:val="20"/>
+                <w:szCs w:val="20"/>
+              </w:rPr>
+              <w:t xml:space="preserve">Amazon (via OnePlatform)</w:t>
+            </w:r>
+          </w:p>
+        </w:tc>
+        <w:tc>
+          <w:tcPr>
+            <w:tcW w:type="dxa" w:w="1300"/>
+            <w:tcBorders>
+              <w:top w:val="single" w:color="BFBFBF" w:sz="4"/>
+              <w:left w:val="single" w:color="BFBFBF" w:sz="4"/>
+              <w:bottom w:val="single" w:color="BFBFBF" w:sz="4"/>
+              <w:right w:val="single" w:color="BFBFBF" w:sz="4"/>
+            </w:tcBorders>
+            <w:tcMar>
+              <w:top w:type="dxa" w:w="60"/>
+              <w:left w:type="dxa" w:w="100"/>
+              <w:bottom w:type="dxa" w:w="60"/>
+              <w:right w:type="dxa" w:w="100"/>
+            </w:tcMar>
+          </w:tcPr>
+          <w:p>
+            <w:r>
+              <w:rPr>
+                <w:rFonts w:ascii="Calibri" w:cs="Calibri" w:eastAsia="Calibri" w:hAnsi="Calibri"/>
+                <w:sz w:val="20"/>
+                <w:szCs w:val="20"/>
+              </w:rPr>
+              <w:t xml:space="preserve">Weekly</w:t>
+            </w:r>
+          </w:p>
+        </w:tc>
+        <w:tc>
+          <w:tcPr>
+            <w:tcW w:type="dxa" w:w="2560"/>
+            <w:tcBorders>
+              <w:top w:val="single" w:color="BFBFBF" w:sz="4"/>
+              <w:left w:val="single" w:color="BFBFBF" w:sz="4"/>
+              <w:bottom w:val="single" w:color="BFBFBF" w:sz="4"/>
+              <w:right w:val="single" w:color="BFBFBF" w:sz="4"/>
+            </w:tcBorders>
+            <w:tcMar>
+              <w:top w:type="dxa" w:w="60"/>
+              <w:left w:type="dxa" w:w="100"/>
+              <w:bottom w:type="dxa" w:w="60"/>
+              <w:right w:type="dxa" w:w="100"/>
+            </w:tcMar>
+          </w:tcPr>
+          <w:p>
+            <w:r>
+              <w:rPr>
+                <w:rFonts w:ascii="Calibri" w:cs="Calibri" w:eastAsia="Calibri" w:hAnsi="Calibri"/>
+                <w:sz w:val="20"/>
+                <w:szCs w:val="20"/>
+              </w:rPr>
+              <w:t xml:space="preserve">In, low or out of stock</w:t>
+            </w:r>
+          </w:p>
+        </w:tc>
+        <w:tc>
+          <w:tcPr>
+            <w:tcW w:type="dxa" w:w="3600"/>
+            <w:tcBorders>
+              <w:top w:val="single" w:color="BFBFBF" w:sz="4"/>
+              <w:left w:val="single" w:color="BFBFBF" w:sz="4"/>
+              <w:bottom w:val="single" w:color="BFBFBF" w:sz="4"/>
+              <w:right w:val="single" w:color="BFBFBF" w:sz="4"/>
+            </w:tcBorders>
+            <w:tcMar>
+              <w:top w:type="dxa" w:w="60"/>
+              <w:left w:type="dxa" w:w="100"/>
+              <w:bottom w:type="dxa" w:w="60"/>
+              <w:right w:type="dxa" w:w="100"/>
+            </w:tcMar>
+          </w:tcPr>
+          <w:p>
+            <w:r>
+              <w:rPr>
+                <w:rFonts w:ascii="Calibri" w:cs="Calibri" w:eastAsia="Calibri" w:hAnsi="Calibri"/>
+                <w:sz w:val="20"/>
+                <w:szCs w:val="20"/>
+              </w:rPr>
+              <w:t xml:space="preserve">Emailed to Tina, saved in OneDrive</w:t>
+            </w:r>
+          </w:p>
+        </w:tc>
+      </w:tr>
+      <w:tr>
+        <w:trPr>
+          <w:cantSplit/>
+        </w:trPr>
+        <w:tc>
+          <w:tcPr>
+            <w:tcW w:type="dxa" w:w="1900"/>
+            <w:tcBorders>
+              <w:top w:val="single" w:color="BFBFBF" w:sz="4"/>
+              <w:left w:val="single" w:color="BFBFBF" w:sz="4"/>
+              <w:bottom w:val="single" w:color="BFBFBF" w:sz="4"/>
+              <w:right w:val="single" w:color="BFBFBF" w:sz="4"/>
+            </w:tcBorders>
+            <w:tcMar>
+              <w:top w:type="dxa" w:w="60"/>
+              <w:left w:type="dxa" w:w="100"/>
+              <w:bottom w:type="dxa" w:w="60"/>
+              <w:right w:type="dxa" w:w="100"/>
+            </w:tcMar>
+          </w:tcPr>
+          <w:p>
+            <w:r>
+              <w:rPr>
+                <w:rFonts w:ascii="Calibri" w:cs="Calibri" w:eastAsia="Calibri" w:hAnsi="Calibri"/>
+                <w:sz w:val="20"/>
+                <w:szCs w:val="20"/>
+              </w:rPr>
+              <w:t xml:space="preserve">Mason</w:t>
+            </w:r>
+          </w:p>
+        </w:tc>
+        <w:tc>
+          <w:tcPr>
+            <w:tcW w:type="dxa" w:w="1300"/>
+            <w:tcBorders>
+              <w:top w:val="single" w:color="BFBFBF" w:sz="4"/>
+              <w:left w:val="single" w:color="BFBFBF" w:sz="4"/>
+              <w:bottom w:val="single" w:color="BFBFBF" w:sz="4"/>
+              <w:right w:val="single" w:color="BFBFBF" w:sz="4"/>
+            </w:tcBorders>
+            <w:tcMar>
+              <w:top w:type="dxa" w:w="60"/>
+              <w:left w:type="dxa" w:w="100"/>
+              <w:bottom w:type="dxa" w:w="60"/>
+              <w:right w:type="dxa" w:w="100"/>
+            </w:tcMar>
+          </w:tcPr>
+          <w:p>
+            <w:r>
+              <w:rPr>
+                <w:rFonts w:ascii="Calibri" w:cs="Calibri" w:eastAsia="Calibri" w:hAnsi="Calibri"/>
+                <w:sz w:val="20"/>
+                <w:szCs w:val="20"/>
+              </w:rPr>
+              <w:t xml:space="preserve">Daily</w:t>
+            </w:r>
+          </w:p>
+        </w:tc>
+        <w:tc>
+          <w:tcPr>
+            <w:tcW w:type="dxa" w:w="2560"/>
+            <w:tcBorders>
+              <w:top w:val="single" w:color="BFBFBF" w:sz="4"/>
+              <w:left w:val="single" w:color="BFBFBF" w:sz="4"/>
+              <w:bottom w:val="single" w:color="BFBFBF" w:sz="4"/>
+              <w:right w:val="single" w:color="BFBFBF" w:sz="4"/>
+            </w:tcBorders>
+            <w:tcMar>
+              <w:top w:type="dxa" w:w="60"/>
+              <w:left w:type="dxa" w:w="100"/>
+              <w:bottom w:type="dxa" w:w="60"/>
+              <w:right w:type="dxa" w:w="100"/>
+            </w:tcMar>
+          </w:tcPr>
+          <w:p>
+            <w:r>
+              <w:rPr>
+                <w:rFonts w:ascii="Calibri" w:cs="Calibri" w:eastAsia="Calibri" w:hAnsi="Calibri"/>
+                <w:sz w:val="20"/>
+                <w:szCs w:val="20"/>
+              </w:rPr>
+              <w:t xml:space="preserve">0, 24 or 50</w:t>
+            </w:r>
+          </w:p>
+        </w:tc>
+        <w:tc>
+          <w:tcPr>
+            <w:tcW w:type="dxa" w:w="3600"/>
+            <w:tcBorders>
+              <w:top w:val="single" w:color="BFBFBF" w:sz="4"/>
+              <w:left w:val="single" w:color="BFBFBF" w:sz="4"/>
+              <w:bottom w:val="single" w:color="BFBFBF" w:sz="4"/>
+              <w:right w:val="single" w:color="BFBFBF" w:sz="4"/>
+            </w:tcBorders>
+            <w:tcMar>
+              <w:top w:type="dxa" w:w="60"/>
+              <w:left w:type="dxa" w:w="100"/>
+              <w:bottom w:type="dxa" w:w="60"/>
+              <w:right w:type="dxa" w:w="100"/>
+            </w:tcMar>
+          </w:tcPr>
+          <w:p>
+            <w:r>
+              <w:rPr>
+                <w:rFonts w:ascii="Calibri" w:cs="Calibri" w:eastAsia="Calibri" w:hAnsi="Calibri"/>
+                <w:sz w:val="20"/>
+                <w:szCs w:val="20"/>
+              </w:rPr>
+              <w:t xml:space="preserve">Portal upload</w:t>
+            </w:r>
+          </w:p>
+        </w:tc>
+      </w:tr>
+      <w:tr>
+        <w:trPr>
+          <w:cantSplit/>
+        </w:trPr>
+        <w:tc>
+          <w:tcPr>
+            <w:tcW w:type="dxa" w:w="1900"/>
+            <w:tcBorders>
+              <w:top w:val="single" w:color="BFBFBF" w:sz="4"/>
+              <w:left w:val="single" w:color="BFBFBF" w:sz="4"/>
+              <w:bottom w:val="single" w:color="BFBFBF" w:sz="4"/>
+              <w:right w:val="single" w:color="BFBFBF" w:sz="4"/>
+            </w:tcBorders>
+            <w:tcMar>
+              <w:top w:type="dxa" w:w="60"/>
+              <w:left w:type="dxa" w:w="100"/>
+              <w:bottom w:type="dxa" w:w="60"/>
+              <w:right w:type="dxa" w:w="100"/>
+            </w:tcMar>
+          </w:tcPr>
+          <w:p>
+            <w:r>
+              <w:rPr>
+                <w:rFonts w:ascii="Calibri" w:cs="Calibri" w:eastAsia="Calibri" w:hAnsi="Calibri"/>
+                <w:sz w:val="20"/>
+                <w:szCs w:val="20"/>
+              </w:rPr>
+              <w:t xml:space="preserve">Dealora</w:t>
+            </w:r>
+          </w:p>
+        </w:tc>
+        <w:tc>
+          <w:tcPr>
+            <w:tcW w:type="dxa" w:w="1300"/>
+            <w:tcBorders>
+              <w:top w:val="single" w:color="BFBFBF" w:sz="4"/>
+              <w:left w:val="single" w:color="BFBFBF" w:sz="4"/>
+              <w:bottom w:val="single" w:color="BFBFBF" w:sz="4"/>
+              <w:right w:val="single" w:color="BFBFBF" w:sz="4"/>
+            </w:tcBorders>
+            <w:tcMar>
+              <w:top w:type="dxa" w:w="60"/>
+              <w:left w:type="dxa" w:w="100"/>
+              <w:bottom w:type="dxa" w:w="60"/>
+              <w:right w:type="dxa" w:w="100"/>
+            </w:tcMar>
+          </w:tcPr>
+          <w:p>
+            <w:r>
+              <w:rPr>
+                <w:rFonts w:ascii="Calibri" w:cs="Calibri" w:eastAsia="Calibri" w:hAnsi="Calibri"/>
+                <w:sz w:val="20"/>
+                <w:szCs w:val="20"/>
+              </w:rPr>
+              <w:t xml:space="preserve">Daily</w:t>
+            </w:r>
+          </w:p>
+        </w:tc>
+        <w:tc>
+          <w:tcPr>
+            <w:tcW w:type="dxa" w:w="2560"/>
+            <w:tcBorders>
+              <w:top w:val="single" w:color="BFBFBF" w:sz="4"/>
+              <w:left w:val="single" w:color="BFBFBF" w:sz="4"/>
+              <w:bottom w:val="single" w:color="BFBFBF" w:sz="4"/>
+              <w:right w:val="single" w:color="BFBFBF" w:sz="4"/>
+            </w:tcBorders>
+            <w:tcMar>
+              <w:top w:type="dxa" w:w="60"/>
+              <w:left w:type="dxa" w:w="100"/>
+              <w:bottom w:type="dxa" w:w="60"/>
+              <w:right w:type="dxa" w:w="100"/>
+            </w:tcMar>
+          </w:tcPr>
+          <w:p>
+            <w:r>
+              <w:rPr>
+                <w:rFonts w:ascii="Calibri" w:cs="Calibri" w:eastAsia="Calibri" w:hAnsi="Calibri"/>
+                <w:sz w:val="20"/>
+                <w:szCs w:val="20"/>
+              </w:rPr>
+              <w:t xml:space="preserve">0, 24 or 50</w:t>
+            </w:r>
+          </w:p>
+        </w:tc>
+        <w:tc>
+          <w:tcPr>
+            <w:tcW w:type="dxa" w:w="3600"/>
+            <w:tcBorders>
+              <w:top w:val="single" w:color="BFBFBF" w:sz="4"/>
+              <w:left w:val="single" w:color="BFBFBF" w:sz="4"/>
+              <w:bottom w:val="single" w:color="BFBFBF" w:sz="4"/>
+              <w:right w:val="single" w:color="BFBFBF" w:sz="4"/>
+            </w:tcBorders>
+            <w:tcMar>
+              <w:top w:type="dxa" w:w="60"/>
+              <w:left w:type="dxa" w:w="100"/>
+              <w:bottom w:type="dxa" w:w="60"/>
+              <w:right w:type="dxa" w:w="100"/>
+            </w:tcMar>
+          </w:tcPr>
+          <w:p>
+            <w:r>
+              <w:rPr>
+                <w:rFonts w:ascii="Calibri" w:cs="Calibri" w:eastAsia="Calibri" w:hAnsi="Calibri"/>
+                <w:sz w:val="20"/>
+                <w:szCs w:val="20"/>
+              </w:rPr>
+              <w:t xml:space="preserve">Email</w:t>
+            </w:r>
+          </w:p>
+        </w:tc>
+      </w:tr>
+      <w:tr>
+        <w:trPr>
+          <w:cantSplit/>
+        </w:trPr>
+        <w:tc>
+          <w:tcPr>
+            <w:tcW w:type="dxa" w:w="1900"/>
+            <w:tcBorders>
+              <w:top w:val="single" w:color="BFBFBF" w:sz="4"/>
+              <w:left w:val="single" w:color="BFBFBF" w:sz="4"/>
+              <w:bottom w:val="single" w:color="BFBFBF" w:sz="4"/>
+              <w:right w:val="single" w:color="BFBFBF" w:sz="4"/>
+            </w:tcBorders>
+            <w:tcMar>
+              <w:top w:type="dxa" w:w="60"/>
+              <w:left w:type="dxa" w:w="100"/>
+              <w:bottom w:type="dxa" w:w="60"/>
+              <w:right w:type="dxa" w:w="100"/>
+            </w:tcMar>
+          </w:tcPr>
+          <w:p>
+            <w:r>
+              <w:rPr>
+                <w:rFonts w:ascii="Calibri" w:cs="Calibri" w:eastAsia="Calibri" w:hAnsi="Calibri"/>
+                <w:sz w:val="20"/>
+                <w:szCs w:val="20"/>
+              </w:rPr>
+              <w:t xml:space="preserve">Kohls</w:t>
+            </w:r>
+          </w:p>
+        </w:tc>
+        <w:tc>
+          <w:tcPr>
+            <w:tcW w:type="dxa" w:w="1300"/>
+            <w:tcBorders>
+              <w:top w:val="single" w:color="BFBFBF" w:sz="4"/>
+              <w:left w:val="single" w:color="BFBFBF" w:sz="4"/>
+              <w:bottom w:val="single" w:color="BFBFBF" w:sz="4"/>
+              <w:right w:val="single" w:color="BFBFBF" w:sz="4"/>
+            </w:tcBorders>
+            <w:tcMar>
+              <w:top w:type="dxa" w:w="60"/>
+              <w:left w:type="dxa" w:w="100"/>
+              <w:bottom w:type="dxa" w:w="60"/>
+              <w:right w:type="dxa" w:w="100"/>
+            </w:tcMar>
+          </w:tcPr>
+          <w:p>
+            <w:r>
+              <w:rPr>
+                <w:rFonts w:ascii="Calibri" w:cs="Calibri" w:eastAsia="Calibri" w:hAnsi="Calibri"/>
+                <w:sz w:val="20"/>
+                <w:szCs w:val="20"/>
+              </w:rPr>
+              <w:t xml:space="preserve">Daily</w:t>
+            </w:r>
+          </w:p>
+        </w:tc>
+        <w:tc>
+          <w:tcPr>
+            <w:tcW w:type="dxa" w:w="2560"/>
+            <w:tcBorders>
+              <w:top w:val="single" w:color="BFBFBF" w:sz="4"/>
+              <w:left w:val="single" w:color="BFBFBF" w:sz="4"/>
+              <w:bottom w:val="single" w:color="BFBFBF" w:sz="4"/>
+              <w:right w:val="single" w:color="BFBFBF" w:sz="4"/>
+            </w:tcBorders>
+            <w:tcMar>
+              <w:top w:type="dxa" w:w="60"/>
+              <w:left w:type="dxa" w:w="100"/>
+              <w:bottom w:type="dxa" w:w="60"/>
+              <w:right w:type="dxa" w:w="100"/>
+            </w:tcMar>
+          </w:tcPr>
+          <w:p>
+            <w:r>
+              <w:rPr>
+                <w:rFonts w:ascii="Calibri" w:cs="Calibri" w:eastAsia="Calibri" w:hAnsi="Calibri"/>
+                <w:sz w:val="20"/>
+                <w:szCs w:val="20"/>
+              </w:rPr>
+              <w:t xml:space="preserve">0, 24 or 50</w:t>
+            </w:r>
+          </w:p>
+        </w:tc>
+        <w:tc>
+          <w:tcPr>
+            <w:tcW w:type="dxa" w:w="3600"/>
+            <w:tcBorders>
+              <w:top w:val="single" w:color="BFBFBF" w:sz="4"/>
+              <w:left w:val="single" w:color="BFBFBF" w:sz="4"/>
+              <w:bottom w:val="single" w:color="BFBFBF" w:sz="4"/>
+              <w:right w:val="single" w:color="BFBFBF" w:sz="4"/>
+            </w:tcBorders>
+            <w:tcMar>
+              <w:top w:type="dxa" w:w="60"/>
+              <w:left w:type="dxa" w:w="100"/>
+              <w:bottom w:type="dxa" w:w="60"/>
+              <w:right w:type="dxa" w:w="100"/>
+            </w:tcMar>
+          </w:tcPr>
+          <w:p>
+            <w:r>
+              <w:rPr>
+                <w:rFonts w:ascii="Calibri" w:cs="Calibri" w:eastAsia="Calibri" w:hAnsi="Calibri"/>
+                <w:sz w:val="20"/>
+                <w:szCs w:val="20"/>
+              </w:rPr>
+              <w:t xml:space="preserve">Portal upload</w:t>
+            </w:r>
+          </w:p>
+        </w:tc>
+      </w:tr>
+      <w:tr>
+        <w:trPr>
+          <w:cantSplit/>
+        </w:trPr>
+        <w:tc>
+          <w:tcPr>
+            <w:tcW w:type="dxa" w:w="1900"/>
+            <w:tcBorders>
+              <w:top w:val="single" w:color="BFBFBF" w:sz="4"/>
+              <w:left w:val="single" w:color="BFBFBF" w:sz="4"/>
+              <w:bottom w:val="single" w:color="BFBFBF" w:sz="4"/>
+              <w:right w:val="single" w:color="BFBFBF" w:sz="4"/>
+            </w:tcBorders>
+            <w:tcMar>
+              <w:top w:type="dxa" w:w="60"/>
+              <w:left w:type="dxa" w:w="100"/>
+              <w:bottom w:type="dxa" w:w="60"/>
+              <w:right w:type="dxa" w:w="100"/>
+            </w:tcMar>
+          </w:tcPr>
+          <w:p>
+            <w:r>
+              <w:rPr>
+                <w:rFonts w:ascii="Calibri" w:cs="Calibri" w:eastAsia="Calibri" w:hAnsi="Calibri"/>
+                <w:sz w:val="20"/>
+                <w:szCs w:val="20"/>
+              </w:rPr>
+              <w:t xml:space="preserve">Lincoln Comfy</w:t>
+            </w:r>
+          </w:p>
+        </w:tc>
+        <w:tc>
+          <w:tcPr>
+            <w:tcW w:type="dxa" w:w="1300"/>
+            <w:tcBorders>
+              <w:top w:val="single" w:color="BFBFBF" w:sz="4"/>
+              <w:left w:val="single" w:color="BFBFBF" w:sz="4"/>
+              <w:bottom w:val="single" w:color="BFBFBF" w:sz="4"/>
+              <w:right w:val="single" w:color="BFBFBF" w:sz="4"/>
+            </w:tcBorders>
+            <w:tcMar>
+              <w:top w:type="dxa" w:w="60"/>
+              <w:left w:type="dxa" w:w="100"/>
+              <w:bottom w:type="dxa" w:w="60"/>
+              <w:right w:type="dxa" w:w="100"/>
+            </w:tcMar>
+          </w:tcPr>
+          <w:p>
+            <w:r>
+              <w:rPr>
+                <w:rFonts w:ascii="Calibri" w:cs="Calibri" w:eastAsia="Calibri" w:hAnsi="Calibri"/>
+                <w:sz w:val="20"/>
+                <w:szCs w:val="20"/>
+              </w:rPr>
+              <w:t xml:space="preserve">Daily</w:t>
+            </w:r>
+          </w:p>
+        </w:tc>
+        <w:tc>
+          <w:tcPr>
+            <w:tcW w:type="dxa" w:w="2560"/>
+            <w:tcBorders>
+              <w:top w:val="single" w:color="BFBFBF" w:sz="4"/>
+              <w:left w:val="single" w:color="BFBFBF" w:sz="4"/>
+              <w:bottom w:val="single" w:color="BFBFBF" w:sz="4"/>
+              <w:right w:val="single" w:color="BFBFBF" w:sz="4"/>
+            </w:tcBorders>
+            <w:tcMar>
+              <w:top w:type="dxa" w:w="60"/>
+              <w:left w:type="dxa" w:w="100"/>
+              <w:bottom w:type="dxa" w:w="60"/>
+              <w:right w:type="dxa" w:w="100"/>
+            </w:tcMar>
+          </w:tcPr>
+          <w:p>
+            <w:r>
+              <w:rPr>
+                <w:rFonts w:ascii="Calibri" w:cs="Calibri" w:eastAsia="Calibri" w:hAnsi="Calibri"/>
+                <w:sz w:val="20"/>
+                <w:szCs w:val="20"/>
+              </w:rPr>
+              <w:t xml:space="preserve">0, 24 or 50, plus an image URL</w:t>
+            </w:r>
+          </w:p>
+        </w:tc>
+        <w:tc>
+          <w:tcPr>
+            <w:tcW w:type="dxa" w:w="3600"/>
+            <w:tcBorders>
+              <w:top w:val="single" w:color="BFBFBF" w:sz="4"/>
+              <w:left w:val="single" w:color="BFBFBF" w:sz="4"/>
+              <w:bottom w:val="single" w:color="BFBFBF" w:sz="4"/>
+              <w:right w:val="single" w:color="BFBFBF" w:sz="4"/>
+            </w:tcBorders>
+            <w:tcMar>
+              <w:top w:type="dxa" w:w="60"/>
+              <w:left w:type="dxa" w:w="100"/>
+              <w:bottom w:type="dxa" w:w="60"/>
+              <w:right w:type="dxa" w:w="100"/>
+            </w:tcMar>
+          </w:tcPr>
+          <w:p>
+            <w:r>
+              <w:rPr>
+                <w:rFonts w:ascii="Calibri" w:cs="Calibri" w:eastAsia="Calibri" w:hAnsi="Calibri"/>
+                <w:sz w:val="20"/>
+                <w:szCs w:val="20"/>
+              </w:rPr>
+              <w:t xml:space="preserve">Email</w:t>
+            </w:r>
+          </w:p>
+        </w:tc>
+      </w:tr>
+      <w:tr>
+        <w:trPr>
+          <w:cantSplit/>
+        </w:trPr>
+        <w:tc>
+          <w:tcPr>
+            <w:tcW w:type="dxa" w:w="1900"/>
+            <w:tcBorders>
+              <w:top w:val="single" w:color="BFBFBF" w:sz="4"/>
+              <w:left w:val="single" w:color="BFBFBF" w:sz="4"/>
+              <w:bottom w:val="single" w:color="BFBFBF" w:sz="4"/>
+              <w:right w:val="single" w:color="BFBFBF" w:sz="4"/>
+            </w:tcBorders>
+            <w:tcMar>
+              <w:top w:type="dxa" w:w="60"/>
+              <w:left w:type="dxa" w:w="100"/>
+              <w:bottom w:type="dxa" w:w="60"/>
+              <w:right w:type="dxa" w:w="100"/>
+            </w:tcMar>
+          </w:tcPr>
+          <w:p>
+            <w:r>
+              <w:rPr>
+                <w:rFonts w:ascii="Calibri" w:cs="Calibri" w:eastAsia="Calibri" w:hAnsi="Calibri"/>
+                <w:sz w:val="20"/>
+                <w:szCs w:val="20"/>
+              </w:rPr>
+              <w:t xml:space="preserve">Sears</w:t>
+            </w:r>
+          </w:p>
+        </w:tc>
+        <w:tc>
+          <w:tcPr>
+            <w:tcW w:type="dxa" w:w="1300"/>
+            <w:tcBorders>
+              <w:top w:val="single" w:color="BFBFBF" w:sz="4"/>
+              <w:left w:val="single" w:color="BFBFBF" w:sz="4"/>
+              <w:bottom w:val="single" w:color="BFBFBF" w:sz="4"/>
+              <w:right w:val="single" w:color="BFBFBF" w:sz="4"/>
+            </w:tcBorders>
+            <w:tcMar>
+              <w:top w:type="dxa" w:w="60"/>
+              <w:left w:type="dxa" w:w="100"/>
+              <w:bottom w:type="dxa" w:w="60"/>
+              <w:right w:type="dxa" w:w="100"/>
+            </w:tcMar>
+          </w:tcPr>
+          <w:p>
+            <w:r>
+              <w:rPr>
+                <w:rFonts w:ascii="Calibri" w:cs="Calibri" w:eastAsia="Calibri" w:hAnsi="Calibri"/>
+                <w:sz w:val="20"/>
+                <w:szCs w:val="20"/>
+              </w:rPr>
+              <w:t xml:space="preserve">Daily</w:t>
+            </w:r>
+          </w:p>
+        </w:tc>
+        <w:tc>
+          <w:tcPr>
+            <w:tcW w:type="dxa" w:w="2560"/>
+            <w:tcBorders>
+              <w:top w:val="single" w:color="BFBFBF" w:sz="4"/>
+              <w:left w:val="single" w:color="BFBFBF" w:sz="4"/>
+              <w:bottom w:val="single" w:color="BFBFBF" w:sz="4"/>
+              <w:right w:val="single" w:color="BFBFBF" w:sz="4"/>
+            </w:tcBorders>
+            <w:tcMar>
+              <w:top w:type="dxa" w:w="60"/>
+              <w:left w:type="dxa" w:w="100"/>
+              <w:bottom w:type="dxa" w:w="60"/>
+              <w:right w:type="dxa" w:w="100"/>
+            </w:tcMar>
+          </w:tcPr>
+          <w:p>
+            <w:r>
+              <w:rPr>
+                <w:rFonts w:ascii="Calibri" w:cs="Calibri" w:eastAsia="Calibri" w:hAnsi="Calibri"/>
+                <w:sz w:val="20"/>
+                <w:szCs w:val="20"/>
+              </w:rPr>
+              <w:t xml:space="preserve">0, 24 or 50, plus a variation group ID</w:t>
+            </w:r>
+          </w:p>
+        </w:tc>
+        <w:tc>
+          <w:tcPr>
+            <w:tcW w:type="dxa" w:w="3600"/>
+            <w:tcBorders>
+              <w:top w:val="single" w:color="BFBFBF" w:sz="4"/>
+              <w:left w:val="single" w:color="BFBFBF" w:sz="4"/>
+              <w:bottom w:val="single" w:color="BFBFBF" w:sz="4"/>
+              <w:right w:val="single" w:color="BFBFBF" w:sz="4"/>
+            </w:tcBorders>
+            <w:tcMar>
+              <w:top w:type="dxa" w:w="60"/>
+              <w:left w:type="dxa" w:w="100"/>
+              <w:bottom w:type="dxa" w:w="60"/>
+              <w:right w:type="dxa" w:w="100"/>
+            </w:tcMar>
+          </w:tcPr>
+          <w:p>
+            <w:r>
+              <w:rPr>
+                <w:rFonts w:ascii="Calibri" w:cs="Calibri" w:eastAsia="Calibri" w:hAnsi="Calibri"/>
+                <w:sz w:val="20"/>
+                <w:szCs w:val="20"/>
+              </w:rPr>
+              <w:t xml:space="preserve">Portal upload</w:t>
+            </w:r>
+          </w:p>
+        </w:tc>
+      </w:tr>
+    </w:tbl>
+    <w:p>
+      <w:pPr>
+        <w:spacing w:after="120"/>
+      </w:pPr>
+    </w:p>
+    <w:p>
+      <w:pPr>
+        <w:pStyle w:val="ListParagraph"/>
+        <w:numPr>
+          <w:ilvl w:val="0"/>
+          <w:numId w:val="2"/>
+        </w:numPr>
+        <w:spacing w:after="60"/>
+      </w:pPr>
+      <w:r>
+        <w:rPr>
+          <w:rFonts w:ascii="Calibri" w:cs="Calibri" w:eastAsia="Calibri" w:hAnsi="Calibri"/>
+        </w:rPr>
+        <w:t xml:space="preserve">The Amazon file covers Amazon dropship only, not Amazon warehouse. His template is already on the server.</w:t>
+      </w:r>
+    </w:p>
+    <w:p>
+      <w:pPr>
+        <w:pStyle w:val="ListParagraph"/>
+        <w:numPr>
+          <w:ilvl w:val="0"/>
+          <w:numId w:val="2"/>
+        </w:numPr>
+        <w:spacing w:after="60"/>
+      </w:pPr>
+      <w:r>
+        <w:rPr>
+          <w:rFonts w:ascii="Calibri" w:cs="Calibri" w:eastAsia="Calibri" w:hAnsi="Calibri"/>
+        </w:rPr>
+        <w:t xml:space="preserve">He downloads inventory from F&amp;O, filters the stock column for one band, types the status in the next column, copies it down, then filters the next band. Then he VLOOKUPs from his working inventory file into each customer's file. Every customer has its own format.</w:t>
+      </w:r>
+    </w:p>
+    <w:p>
+      <w:pPr>
+        <w:pStyle w:val="ListParagraph"/>
+        <w:numPr>
+          <w:ilvl w:val="0"/>
+          <w:numId w:val="2"/>
+        </w:numPr>
+        <w:spacing w:after="60"/>
+      </w:pPr>
+      <w:r>
+        <w:rPr>
+          <w:rFonts w:ascii="Calibri" w:cs="Calibri" w:eastAsia="Calibri" w:hAnsi="Calibri"/>
+          <w:b/>
+          <w:bCs/>
+        </w:rPr>
+        <w:t xml:space="preserve">His cutoffs:</w:t>
+      </w:r>
+      <w:r>
+        <w:rPr>
+          <w:rFonts w:ascii="Calibri" w:cs="Calibri" w:eastAsia="Calibri" w:hAnsi="Calibri"/>
+        </w:rPr>
+        <w:t xml:space="preserve"> under 24 is out of stock (not 12, as Tina described), 24 to 50 is low, above that is in stock. The daily customers get those as numbers: 0, 24 or 50.</w:t>
+      </w:r>
+    </w:p>
+    <w:p>
+      <w:pPr>
+        <w:pStyle w:val="ListParagraph"/>
+        <w:numPr>
+          <w:ilvl w:val="0"/>
+          <w:numId w:val="2"/>
+        </w:numPr>
+        <w:spacing w:after="60"/>
+      </w:pPr>
+      <w:r>
+        <w:rPr>
+          <w:rFonts w:ascii="Calibri" w:cs="Calibri" w:eastAsia="Calibri" w:hAnsi="Calibri"/>
+        </w:rPr>
+        <w:t xml:space="preserve">The daily feeds take about 10 to 15 minutes a day for all five.</w:t>
+      </w:r>
+    </w:p>
+    <w:p>
+      <w:pPr>
+        <w:pStyle w:val="ListParagraph"/>
+        <w:numPr>
+          <w:ilvl w:val="0"/>
+          <w:numId w:val="2"/>
+        </w:numPr>
+        <w:spacing w:after="60"/>
+      </w:pPr>
+      <w:r>
+        <w:rPr>
+          <w:rFonts w:ascii="Calibri" w:cs="Calibri" w:eastAsia="Calibri" w:hAnsi="Calibri"/>
+        </w:rPr>
+        <w:t xml:space="preserve">To check: whether Lincoln Comfy actually needs the image URL and whether it's in F&amp;O; what Sears' variation group ID is.</w:t>
+      </w:r>
+    </w:p>
+    <w:p>
+      <w:pPr>
+        <w:pStyle w:val="ListParagraph"/>
+        <w:numPr>
+          <w:ilvl w:val="0"/>
+          <w:numId w:val="2"/>
+        </w:numPr>
+        <w:spacing w:after="60"/>
+      </w:pPr>
+      <w:r>
+        <w:rPr>
+          <w:rFonts w:ascii="Calibri" w:cs="Calibri" w:eastAsia="Calibri" w:hAnsi="Calibri"/>
+          <w:i/>
+          <w:iCs/>
+        </w:rPr>
+        <w:t xml:space="preserve">(Observer's note: on Day 2 Tina uploaded Kohls on DSCO with an "under 5, send 0" rule. That doesn't match Daniel's 0 / 24 / 50, so which rule is current, and who does Kohls now, needs checking.)</w:t>
       </w:r>
     </w:p>
     <w:p>

</xml_diff>

<commit_message>
Tina's clarification: 24 is the cutoff, Amazon file is OnePlatform's whole catalog, one job on different schedules
Co-Authored-By: Devin AI <158243242+devin-ai-integration[bot]@users.noreply.github.com>
</commit_message>
<xml_diff>
--- a/Shadowing_Report_2026-10-22_v2.docx
+++ b/Shadowing_Report_2026-10-22_v2.docx
@@ -3117,7 +3117,7 @@
                 <w:sz w:val="20"/>
                 <w:szCs w:val="20"/>
               </w:rPr>
-              <w:t xml:space="preserve">Builds every feed from one F&amp;O inventory pull, in each customer's own format. Daily customers get a quantity of 0, 24 or 50; it uploads the Mason, Kohls and Sears files to their portals (or queues them) and drafts the Dealora and Lincoln emails. For Amazon it builds the whole file from F&amp;O: ASIN, SKU, UPC, product name and status for every Amazon dropship item. Status comes from quantity in warehouse 1600 using one agreed set of cutoffs (Daniel uses under 24 out, 24 to 50 low; Tina described 11 or fewer out, under 50 low). For low and out-of-stock items it adds the next available date: the Goods in Transit date where there is one, otherwise the earliest open PO date, blank if neither. Discontinued items are marked disco while we have stock and obsolete once we don't. No 30-day cutoff. Then it drafts the Amazon email to Matt and Reggie, cc Avi G and Tara, and saves the file to OneDrive. First step (my idea): an F&amp;O report with the dates already coalesced, even before anything else changes.</w:t>
+              <w:t xml:space="preserve">Builds every feed from one F&amp;O inventory pull, in each customer's own format. Daily customers get a quantity of 0, 24 or 50; it uploads the Mason, Kohls and Sears files to their portals (or queues them) and drafts the Dealora and Lincoln emails. For Amazon it builds the whole file from F&amp;O: ASIN, SKU, UPC, product name and status for every item in OnePlatform's catalog (the entire Amazon catalog). Status comes from quantity in warehouse 1600 under 24 is out of stock, 24 to 50 is low, above that is in stock (Tina confirmed 24 is fine as long as it's above the pack size). One job, scheduled differently per customer. For low and out-of-stock items it adds the next available date: the Goods in Transit date where there is one, otherwise the earliest open PO date, blank if neither. Discontinued items are marked disco while we have stock and obsolete once we don't. No 30-day cutoff. Then it drafts the Amazon email to Matt and Reggie, cc Avi G and Tara, and saves the file to OneDrive. First step (my idea): an F&amp;O report with the dates already coalesced, even before anything else changes.</w:t>
             </w:r>
           </w:p>
         </w:tc>
@@ -3235,7 +3235,7 @@
                 <w:sz w:val="20"/>
                 <w:szCs w:val="20"/>
               </w:rPr>
-              <w:t xml:space="preserve">Day 2: Tina's six-step download, filter and match. Day 7: the full weekly cycle. Daniel restarts the file every week and emails it to Tina as an attachment. Tina's part is under 10 minutes; when she used to do Daniel's part, a lookup formula wrote the status automatically. The only OnePlatform fields we don't have (Amazon product line, subcategory) aren't needed in what we send. The whole list, every item in our Amazon catalog, goes out every week. Follow-up: Tina uses available quantity; the 30-day cutoff should go (Goods in Transit first, then the earliest open PO). Out-of-stock items aren't marked temporarily unavailable with an in-stock date, by us or OnePlatform. Follow-up with Daniel: the same hand-filter and VLOOKUP runs daily for five more customers, about 10 to 15 minutes a day for all of them; the Amazon file is dropship only.</w:t>
+              <w:t xml:space="preserve">Day 2: Tina's six-step download, filter and match. Day 7: the full weekly cycle. Daniel restarts the file every week and emails it to Tina as an attachment. Tina's part is under 10 minutes; when she used to do Daniel's part, a lookup formula wrote the status automatically. The only OnePlatform fields we don't have (Amazon product line, subcategory) aren't needed in what we send. The whole list, every item in our Amazon catalog, goes out every week. Follow-up: Tina uses available quantity; the 30-day cutoff should go (Goods in Transit first, then the earliest open PO). Out-of-stock items aren't marked temporarily unavailable with an in-stock date, by us or OnePlatform. Follow-up with Daniel: the same hand-filter and VLOOKUP runs daily for five more customers, about 10 to 15 minutes a day for all of them; the Amazon file is OnePlatform's whole catalog, and 24 is the agreed cutoff.</w:t>
             </w:r>
           </w:p>
         </w:tc>
@@ -3294,7 +3294,7 @@
                 <w:sz w:val="20"/>
                 <w:szCs w:val="20"/>
               </w:rPr>
-              <w:t xml:space="preserve">Which out-of-stock cutoff is right (24 or 12); whether Kohls is still "under 5, send 0" and who uploads it; whether Lincoln Comfy needs image URLs and where they live; what Sears' variation group ID is; who should mark items temporarily unavailable</w:t>
+              <w:t xml:space="preserve">Whether Lincoln Comfy needs image URLs and where they live; what Sears' variation group ID is; who should mark items temporarily unavailable</w:t>
             </w:r>
           </w:p>
         </w:tc>
@@ -20386,7 +20386,7 @@
         <w:rPr>
           <w:rFonts w:ascii="Calibri" w:cs="Calibri" w:eastAsia="Calibri" w:hAnsi="Calibri"/>
         </w:rPr>
-        <w:t xml:space="preserve"> 11 pieces or fewer. Amazon requires full packs, and 12 is the most common pack size.</w:t>
+        <w:t xml:space="preserve"> 11 pieces or fewer, as Tina first described. Amazon requires full packs, and 12 is the most common pack size. (Daniel actually uses under 24; Tina later confirmed that's fine, see the follow-up below.)</w:t>
       </w:r>
     </w:p>
     <w:p>
@@ -21523,7 +21523,7 @@
         <w:rPr>
           <w:rFonts w:ascii="Calibri" w:cs="Calibri" w:eastAsia="Calibri" w:hAnsi="Calibri"/>
         </w:rPr>
-        <w:t xml:space="preserve">The Amazon file covers Amazon dropship only, not Amazon warehouse. His template is already on the server.</w:t>
+        <w:t xml:space="preserve">Daniel said the Amazon file is dropship only, but Tina clarified it's OnePlatform's whole catalog, the entire Amazon catalog. He thought dropship because it's the same process as his other feeds, and he doesn't know what the file is for. Tina says OnePlatform uses it for advertising decisions for Amazon warehouse. His template is already on the server.</w:t>
       </w:r>
     </w:p>
     <w:p>
@@ -21557,13 +21557,13 @@
           <w:b/>
           <w:bCs/>
         </w:rPr>
-        <w:t xml:space="preserve">His cutoffs:</w:t>
-      </w:r>
-      <w:r>
-        <w:rPr>
-          <w:rFonts w:ascii="Calibri" w:cs="Calibri" w:eastAsia="Calibri" w:hAnsi="Calibri"/>
-        </w:rPr>
-        <w:t xml:space="preserve"> under 24 is out of stock (not 12, as Tina described), 24 to 50 is low, above that is in stock. The daily customers get those as numbers: 0, 24 or 50.</w:t>
+        <w:t xml:space="preserve">Cutoffs:</w:t>
+      </w:r>
+      <w:r>
+        <w:rPr>
+          <w:rFonts w:ascii="Calibri" w:cs="Calibri" w:eastAsia="Calibri" w:hAnsi="Calibri"/>
+        </w:rPr>
+        <w:t xml:space="preserve"> under 24 is out of stock, 24 to 50 is low, above that is in stock. The daily customers get those as numbers: 0, 24 or 50. Tina had said 12, but confirmed 24 is fine as long as it's above the pack size.</w:t>
       </w:r>
     </w:p>
     <w:p>
@@ -21613,7 +21613,7 @@
           <w:i/>
           <w:iCs/>
         </w:rPr>
-        <w:t xml:space="preserve">(Observer's note: on Day 2 Tina uploaded Kohls on DSCO with an "under 5, send 0" rule. That doesn't match Daniel's 0 / 24 / 50, so which rule is current, and who does Kohls now, needs checking.)</w:t>
+        <w:t xml:space="preserve">(Observer's view: for a bot or report runner, Amazon and the daily feeds are the same job, just scheduled differently. Day 2's "under 5, send 0" for Kohls has been replaced by 0 / 24 / 50.)</w:t>
       </w:r>
     </w:p>
     <w:p>

</xml_diff>

<commit_message>
Kohls exception: Tina's 5 on disco'd items to sell off leftover stock
Co-Authored-By: Devin AI <158243242+devin-ai-integration[bot]@users.noreply.github.com>
</commit_message>
<xml_diff>
--- a/Shadowing_Report_2026-10-22_v2.docx
+++ b/Shadowing_Report_2026-10-22_v2.docx
@@ -3117,7 +3117,7 @@
                 <w:sz w:val="20"/>
                 <w:szCs w:val="20"/>
               </w:rPr>
-              <w:t xml:space="preserve">Builds every feed from one F&amp;O inventory pull, in each customer's own format. Daily customers get a quantity of 0, 24 or 50; it uploads the Mason, Kohls and Sears files to their portals (or queues them) and drafts the Dealora and Lincoln emails. For Amazon it builds the whole file from F&amp;O: ASIN, SKU, UPC, product name and status for every item in OnePlatform's catalog (the entire Amazon catalog). Status comes from quantity in warehouse 1600 under 24 is out of stock, 24 to 50 is low, above that is in stock (Tina confirmed 24 is fine as long as it's above the pack size). One job, scheduled differently per customer. For low and out-of-stock items it adds the next available date: the Goods in Transit date where there is one, otherwise the earliest open PO date, blank if neither. Discontinued items are marked disco while we have stock and obsolete once we don't. No 30-day cutoff. Then it drafts the Amazon email to Matt and Reggie, cc Avi G and Tara, and saves the file to OneDrive. First step (my idea): an F&amp;O report with the dates already coalesced, even before anything else changes.</w:t>
+              <w:t xml:space="preserve">Builds every feed from one F&amp;O inventory pull, in each customer's own format. Daily customers get a quantity of 0, 24 or 50, except that Kohls also gets 5 on disco'd items we still have, so leftover stock sells off there; it uploads the Mason, Kohls and Sears files to their portals (or queues them) and drafts the Dealora and Lincoln emails. For Amazon it builds the whole file from F&amp;O: ASIN, SKU, UPC, product name and status for every item in OnePlatform's catalog (the entire Amazon catalog). Status comes from quantity in warehouse 1600 under 24 is out of stock, 24 to 50 is low, above that is in stock (Tina confirmed 24 is fine as long as it's above the pack size). One job, scheduled differently per customer. For low and out-of-stock items it adds the next available date: the Goods in Transit date where there is one, otherwise the earliest open PO date, blank if neither. Discontinued items are marked disco while we have stock and obsolete once we don't. No 30-day cutoff. Then it drafts the Amazon email to Matt and Reggie, cc Avi G and Tara, and saves the file to OneDrive. First step (my idea): an F&amp;O report with the dates already coalesced, even before anything else changes.</w:t>
             </w:r>
           </w:p>
         </w:tc>
@@ -21613,7 +21613,31 @@
           <w:i/>
           <w:iCs/>
         </w:rPr>
-        <w:t xml:space="preserve">(Observer's view: for a bot or report runner, Amazon and the daily feeds are the same job, just scheduled differently. Day 2's "under 5, send 0" for Kohls has been replaced by 0 / 24 / 50.)</w:t>
+        <w:t xml:space="preserve">(Observer's view: for a bot or report runner, Amazon and the daily feeds are the same job, just scheduled differently. )</w:t>
+      </w:r>
+    </w:p>
+    <w:p>
+      <w:pPr>
+        <w:pStyle w:val="ListParagraph"/>
+        <w:numPr>
+          <w:ilvl w:val="0"/>
+          <w:numId w:val="2"/>
+        </w:numPr>
+        <w:spacing w:after="60"/>
+      </w:pPr>
+      <w:r>
+        <w:rPr>
+          <w:rFonts w:ascii="Calibri" w:cs="Calibri" w:eastAsia="Calibri" w:hAnsi="Calibri"/>
+          <w:b/>
+          <w:bCs/>
+        </w:rPr>
+        <w:t xml:space="preserve">Kohls exception</w:t>
+      </w:r>
+      <w:r>
+        <w:rPr>
+          <w:rFonts w:ascii="Calibri" w:cs="Calibri" w:eastAsia="Calibri" w:hAnsi="Calibri"/>
+        </w:rPr>
+        <w:t xml:space="preserve"> (Tina): other customers' feeds are automated and zero an item once it gets to 6, so nobody else gets inventory for disco'd items under 6. Kohls is manual, so Tina puts a 5 on disco'd items we still have (from returns, or never sold off) to sell them off there. This is the reason behind Day 2's "under 5, send 0" note.</w:t>
       </w:r>
     </w:p>
     <w:p>

</xml_diff>

<commit_message>
Kohls: disco flag check, never send more than we have, largest catalog
Co-Authored-By: Devin AI <158243242+devin-ai-integration[bot]@users.noreply.github.com>
</commit_message>
<xml_diff>
--- a/Shadowing_Report_2026-10-22_v2.docx
+++ b/Shadowing_Report_2026-10-22_v2.docx
@@ -3117,7 +3117,7 @@
                 <w:sz w:val="20"/>
                 <w:szCs w:val="20"/>
               </w:rPr>
-              <w:t xml:space="preserve">Builds every feed from one F&amp;O inventory pull, in each customer's own format. Daily customers get a quantity of 0, 24 or 50, except that Kohls also gets 5 on disco'd items we still have, so leftover stock sells off there; it uploads the Mason, Kohls and Sears files to their portals (or queues them) and drafts the Dealora and Lincoln emails. For Amazon it builds the whole file from F&amp;O: ASIN, SKU, UPC, product name and status for every item in OnePlatform's catalog (the entire Amazon catalog). Status comes from quantity in warehouse 1600 under 24 is out of stock, 24 to 50 is low, above that is in stock (Tina confirmed 24 is fine as long as it's above the pack size). One job, scheduled differently per customer. For low and out-of-stock items it adds the next available date: the Goods in Transit date where there is one, otherwise the earliest open PO date, blank if neither. Discontinued items are marked disco while we have stock and obsolete once we don't. No 30-day cutoff. Then it drafts the Amazon email to Matt and Reggie, cc Avi G and Tara, and saves the file to OneDrive. First step (my idea): an F&amp;O report with the dates already coalesced, even before anything else changes.</w:t>
+              <w:t xml:space="preserve">Builds every feed from one F&amp;O inventory pull, in each customer's own format. Daily customers get a quantity of 0, 24 or 50, except that Kohls also gets 5 on disco'd items we still have (found by checking the F&amp;O disco flag against on-hand), so leftover stock sells off there. Nothing ever goes out above what we have; it uploads the Mason, Kohls and Sears files to their portals (or queues them) and drafts the Dealora and Lincoln emails. For Amazon it builds the whole file from F&amp;O: ASIN, SKU, UPC, product name and status for every item in OnePlatform's catalog (the entire Amazon catalog). Status comes from quantity in warehouse 1600 under 24 is out of stock, 24 to 50 is low, above that is in stock (Tina confirmed 24 is fine as long as it's above the pack size). One job, scheduled differently per customer. For low and out-of-stock items it adds the next available date: the Goods in Transit date where there is one, otherwise the earliest open PO date, blank if neither. Discontinued items are marked disco while we have stock and obsolete once we don't. No 30-day cutoff. Then it drafts the Amazon email to Matt and Reggie, cc Avi G and Tara, and saves the file to OneDrive. First step (my idea): an F&amp;O report with the dates already coalesced, even before anything else changes.</w:t>
             </w:r>
           </w:p>
         </w:tc>
@@ -21638,6 +21638,54 @@
           <w:rFonts w:ascii="Calibri" w:cs="Calibri" w:eastAsia="Calibri" w:hAnsi="Calibri"/>
         </w:rPr>
         <w:t xml:space="preserve"> (Tina): other customers' feeds are automated and zero an item once it gets to 6, so nobody else gets inventory for disco'd items under 6. Kohls is manual, so Tina puts a 5 on disco'd items we still have (from returns, or never sold off) to sell them off there. This is the reason behind Day 2's "under 5, send 0" note.</w:t>
+      </w:r>
+    </w:p>
+    <w:p>
+      <w:pPr>
+        <w:pStyle w:val="ListParagraph"/>
+        <w:numPr>
+          <w:ilvl w:val="0"/>
+          <w:numId w:val="2"/>
+        </w:numPr>
+        <w:spacing w:after="60"/>
+      </w:pPr>
+      <w:r>
+        <w:rPr>
+          <w:rFonts w:ascii="Calibri" w:cs="Calibri" w:eastAsia="Calibri" w:hAnsi="Calibri"/>
+        </w:rPr>
+        <w:t xml:space="preserve">Kohls is used because, of the five daily feeds, it carries the largest catalog of our items. F&amp;O already flags disco'd items, and the on-hand sheet shows which still have stock, so the check can be automated. </w:t>
+      </w:r>
+      <w:r>
+        <w:rPr>
+          <w:rFonts w:ascii="Calibri" w:cs="Calibri" w:eastAsia="Calibri" w:hAnsi="Calibri"/>
+          <w:i/>
+          <w:iCs/>
+        </w:rPr>
+        <w:t xml:space="preserve">(Observer's view: we might pick the sell-off channel by which customer gives us the best pricing instead.)</w:t>
+      </w:r>
+    </w:p>
+    <w:p>
+      <w:pPr>
+        <w:pStyle w:val="ListParagraph"/>
+        <w:numPr>
+          <w:ilvl w:val="0"/>
+          <w:numId w:val="2"/>
+        </w:numPr>
+        <w:spacing w:after="60"/>
+      </w:pPr>
+      <w:r>
+        <w:rPr>
+          <w:rFonts w:ascii="Calibri" w:cs="Calibri" w:eastAsia="Calibri" w:hAnsi="Calibri"/>
+          <w:b/>
+          <w:bCs/>
+        </w:rPr>
+        <w:t xml:space="preserve">The main rule</w:t>
+      </w:r>
+      <w:r>
+        <w:rPr>
+          <w:rFonts w:ascii="Calibri" w:cs="Calibri" w:eastAsia="Calibri" w:hAnsi="Calibri"/>
+        </w:rPr>
+        <w:t xml:space="preserve"> (Tina): never send a customer more than we have. As long as out-of-stock items are marked out and every number is at or below real stock (we have 30, we send 24), we're fine. So Daniel's different cutoffs don't matter.</w:t>
       </w:r>
     </w:p>
     <w:p>

</xml_diff>

<commit_message>
Dates: Amazon only today; Mason and Kohls want them, add in automation
Co-Authored-By: Devin AI <158243242+devin-ai-integration[bot]@users.noreply.github.com>
</commit_message>
<xml_diff>
--- a/Shadowing_Report_2026-10-22_v2.docx
+++ b/Shadowing_Report_2026-10-22_v2.docx
@@ -3117,7 +3117,7 @@
                 <w:sz w:val="20"/>
                 <w:szCs w:val="20"/>
               </w:rPr>
-              <w:t xml:space="preserve">Builds every feed from one F&amp;O inventory pull, in each customer's own format. Daily customers get a quantity of 0, 24 or 50, except that Kohls also gets 5 on disco'd items we still have (found by checking the F&amp;O disco flag against on-hand), so leftover stock sells off there. Nothing ever goes out above what we have; it uploads the Mason, Kohls and Sears files to their portals (or queues them) and drafts the Dealora and Lincoln emails. For Amazon it builds the whole file from F&amp;O: ASIN, SKU, UPC, product name and status for every item in OnePlatform's catalog (the entire Amazon catalog). Status comes from quantity in warehouse 1600 under 24 is out of stock, 24 to 50 is low, above that is in stock (Tina confirmed 24 is fine as long as it's above the pack size). One job, scheduled differently per customer. For low and out-of-stock items it adds the next available date: the Goods in Transit date where there is one, otherwise the earliest open PO date, blank if neither. Discontinued items are marked disco while we have stock and obsolete once we don't. No 30-day cutoff. Then it drafts the Amazon email to Matt and Reggie, cc Avi G and Tara, and saves the file to OneDrive. First step (my idea): an F&amp;O report with the dates already coalesced, even before anything else changes.</w:t>
+              <w:t xml:space="preserve">Builds every feed from one F&amp;O inventory pull, in each customer's own format. Daily customers get a quantity of 0, 24 or 50, except that Kohls also gets 5 on disco'd items we still have (found by checking the F&amp;O disco flag against on-hand), so leftover stock sells off there. Nothing ever goes out above what we have; it uploads the Mason, Kohls and Sears files to their portals (or queues them) and drafts the Dealora and Lincoln emails. For Amazon it builds the whole file from F&amp;O: ASIN, SKU, UPC, product name and status for every item in OnePlatform's catalog (the entire Amazon catalog). Status comes from quantity in warehouse 1600 under 24 is out of stock, 24 to 50 is low, above that is in stock (Tina confirmed 24 is fine as long as it's above the pack size). One job, scheduled differently per customer. For low and out-of-stock items it adds the next available date: the Goods in Transit date where there is one, otherwise the earliest open PO date, blank if neither. Discontinued items are marked disco while we have stock and obsolete once we don't. No 30-day cutoff. It adds the same dates to the Mason and Kohls feeds, which they'd like but don't get today. Then it drafts the Amazon email to Matt and Reggie, cc Avi G and Tara, and saves the file to OneDrive. First step (my idea): an F&amp;O report with the dates already coalesced, even before anything else changes.</w:t>
             </w:r>
           </w:p>
         </w:tc>
@@ -21686,6 +21686,30 @@
           <w:rFonts w:ascii="Calibri" w:cs="Calibri" w:eastAsia="Calibri" w:hAnsi="Calibri"/>
         </w:rPr>
         <w:t xml:space="preserve"> (Tina): never send a customer more than we have. As long as out-of-stock items are marked out and every number is at or below real stock (we have 30, we send 24), we're fine. So Daniel's different cutoffs don't matter.</w:t>
+      </w:r>
+    </w:p>
+    <w:p>
+      <w:pPr>
+        <w:pStyle w:val="ListParagraph"/>
+        <w:numPr>
+          <w:ilvl w:val="0"/>
+          <w:numId w:val="2"/>
+        </w:numPr>
+        <w:spacing w:after="60"/>
+      </w:pPr>
+      <w:r>
+        <w:rPr>
+          <w:rFonts w:ascii="Calibri" w:cs="Calibri" w:eastAsia="Calibri" w:hAnsi="Calibri"/>
+          <w:b/>
+          <w:bCs/>
+        </w:rPr>
+        <w:t xml:space="preserve">Dates</w:t>
+      </w:r>
+      <w:r>
+        <w:rPr>
+          <w:rFonts w:ascii="Calibri" w:cs="Calibri" w:eastAsia="Calibri" w:hAnsi="Calibri"/>
+        </w:rPr>
+        <w:t xml:space="preserve"> (Tina): only the Amazon file gets next available dates. Mason and Kohls would like future dates too, but we don't add them now; any automation we build should.</w:t>
       </w:r>
     </w:p>
     <w:p>

</xml_diff>

<commit_message>
Tina/Daniel follow-ups: available qty, F&O catalog, reds, 1-5 sell-off, Mason/Kohls dates, no EDI 846
Co-Authored-By: Devin AI <158243242+devin-ai-integration[bot]@users.noreply.github.com>
</commit_message>
<xml_diff>
--- a/Shadowing_Report_2026-10-22_v2.docx
+++ b/Shadowing_Report_2026-10-22_v2.docx
@@ -2526,7 +2526,7 @@
                 <w:sz w:val="20"/>
                 <w:szCs w:val="20"/>
               </w:rPr>
-              <w:t xml:space="preserve">What splits the wires</w:t>
+              <w:t xml:space="preserve">Who uploads Kohls each day, and when Tina's sell-off numbers go in; What splits the wires</w:t>
             </w:r>
           </w:p>
         </w:tc>
@@ -3117,7 +3117,7 @@
                 <w:sz w:val="20"/>
                 <w:szCs w:val="20"/>
               </w:rPr>
-              <w:t xml:space="preserve">Builds every feed from one F&amp;O inventory pull, in each customer's own format. Daily customers get a quantity of 0, 24 or 50, except that Kohls also gets 5 on disco'd items we still have (found by checking the F&amp;O disco flag against on-hand), so leftover stock sells off there. Nothing ever goes out above what we have; it uploads the Mason, Kohls and Sears files to their portals (or queues them) and drafts the Dealora and Lincoln emails. For Amazon it builds the whole file from F&amp;O: ASIN, SKU, UPC, product name and status for every item in OnePlatform's catalog (the entire Amazon catalog). Status comes from quantity in warehouse 1600 under 24 is out of stock, 24 to 50 is low, above that is in stock (Tina confirmed 24 is fine as long as it's above the pack size). One job, scheduled differently per customer. For low and out-of-stock items it adds the next available date: the Goods in Transit date where there is one, otherwise the earliest open PO date, blank if neither. Discontinued items are marked disco while we have stock and obsolete once we don't. No 30-day cutoff. It adds the same dates to the Mason and Kohls feeds, which they'd like but don't get today. Then it drafts the Amazon email to Matt and Reggie, cc Avi G and Tara, and saves the file to OneDrive. First step (my idea): an F&amp;O report with the dates already coalesced, even before anything else changes.</w:t>
+              <w:t xml:space="preserve">Builds every feed from one F&amp;O inventory pull, in each customer's own format. Daily customers get a quantity of 0, 24 or 50, except that Kohls also gets 1 to 5 (never more than we have) on disco'd items we still have (found by checking the F&amp;O disco flag against on-hand), so leftover stock sells off there. Nothing ever goes out above what we have; it uploads the Mason, Kohls and Sears files to their portals (or queues them) and drafts the Dealora and Lincoln emails. For Amazon it builds the whole file from F&amp;O: ASIN, SKU, UPC, product name and status for every item in OnePlatform's catalog (the entire Amazon catalog). Status comes from available quantity in warehouse 1600: under 24 is out of stock, 24 to 50 is low, above that is in stock (Tina confirmed 24 is fine as long as it's above the pack size). One job, scheduled differently per customer. For low and out-of-stock items it adds the next available date: the Goods in Transit date where there is one, otherwise the earliest open PO date, blank if neither. Discontinued items are marked disco while we have stock and obsolete once we don't. No 30-day cutoff. It adds the next receive date and next available quantity (24 when the next PO has more than 24) to the Mason and Kohls feeds, which they'd like but don't get today. Then it drafts the Amazon email to Matt and Reggie, cc Avi G and Tara, and saves the file to OneDrive. First step (my idea): an F&amp;O report with the dates already coalesced, even before anything else changes.</w:t>
             </w:r>
           </w:p>
         </w:tc>
@@ -3176,7 +3176,7 @@
                 <w:sz w:val="20"/>
                 <w:szCs w:val="20"/>
               </w:rPr>
-              <w:t xml:space="preserve">F&amp;O items (ASIN, SKU, UPC, name, status), quantity for 1600, open PO lines, Goods in Transit; each customer's template; Lincoln Comfy image URLs and Sears variation group IDs if needed; OnePlatform's file only as a cross-check</w:t>
+              <w:t xml:space="preserve">F&amp;O items (ASIN, SKU, UPC, name, status), available quantity for 1600, open PO lines, Goods in Transit; each customer's template; Lincoln Comfy image URLs and Sears variation group IDs if needed; OnePlatform's file only as a cross-check</w:t>
             </w:r>
           </w:p>
         </w:tc>
@@ -20362,7 +20362,7 @@
         <w:rPr>
           <w:rFonts w:ascii="Calibri" w:cs="Calibri" w:eastAsia="Calibri" w:hAnsi="Calibri"/>
         </w:rPr>
-        <w:t xml:space="preserve">We don't give Amazon exact inventory because the warehouse is too fluid. The status uses pieces in F&amp;O for warehouse 1600, our only warehouse. Tina uses available quantity; Daniel was first said to use on-hand, which still needs checking with him.</w:t>
+        <w:t xml:space="preserve">We don't give Amazon exact inventory because the warehouse is too fluid. The status uses pieces in F&amp;O for warehouse 1600, our only warehouse. Tina uses available quantity; Daniel uses available too (confirmed in the follow-up).</w:t>
       </w:r>
     </w:p>
     <w:p>
@@ -20487,7 +20487,7 @@
         <w:rPr>
           <w:rFonts w:ascii="Calibri" w:cs="Calibri" w:eastAsia="Calibri" w:hAnsi="Calibri"/>
         </w:rPr>
-        <w:t xml:space="preserve">Daniel marks each item in, low or out of stock from on-hand. When Tina used to do this part, a formula with a lookup to an on-hand download wrote the status automatically and it took her very little time. Tina doesn't know how long Daniel takes, and says he may be leaving.</w:t>
+        <w:t xml:space="preserve">Daniel marks each item in, low or out of stock from available quantity (first given as on-hand; confirmed available). When Tina used to do this part, a formula with a lookup to an on-hand download wrote the status automatically and it took her very little time. Tina doesn't know how long Daniel takes, and says he may be leaving.</w:t>
       </w:r>
     </w:p>
     <w:p>
@@ -21710,6 +21710,190 @@
           <w:rFonts w:ascii="Calibri" w:cs="Calibri" w:eastAsia="Calibri" w:hAnsi="Calibri"/>
         </w:rPr>
         <w:t xml:space="preserve"> (Tina): only the Amazon file gets next available dates. Mason and Kohls would like future dates too, but we don't add them now; any automation we build should.</w:t>
+      </w:r>
+    </w:p>
+    <w:p>
+      <w:pPr>
+        <w:pStyle w:val="ListParagraph"/>
+        <w:numPr>
+          <w:ilvl w:val="0"/>
+          <w:numId w:val="2"/>
+        </w:numPr>
+        <w:spacing w:after="60"/>
+      </w:pPr>
+      <w:r>
+        <w:rPr>
+          <w:rFonts w:ascii="Calibri" w:cs="Calibri" w:eastAsia="Calibri" w:hAnsi="Calibri"/>
+          <w:b/>
+          <w:bCs/>
+        </w:rPr>
+        <w:t xml:space="preserve">Sell-off quantity</w:t>
+      </w:r>
+      <w:r>
+        <w:rPr>
+          <w:rFonts w:ascii="Calibri" w:cs="Calibri" w:eastAsia="Calibri" w:hAnsi="Calibri"/>
+        </w:rPr>
+        <w:t xml:space="preserve"> (Tina): she sends 1, 2, 3, 4 or 5 on Kohls depending on what we have, not always 5.</w:t>
+      </w:r>
+    </w:p>
+    <w:p>
+      <w:pPr>
+        <w:pStyle w:val="ListParagraph"/>
+        <w:numPr>
+          <w:ilvl w:val="0"/>
+          <w:numId w:val="2"/>
+        </w:numPr>
+        <w:spacing w:after="60"/>
+      </w:pPr>
+      <w:r>
+        <w:rPr>
+          <w:rFonts w:ascii="Calibri" w:cs="Calibri" w:eastAsia="Calibri" w:hAnsi="Calibri"/>
+          <w:b/>
+          <w:bCs/>
+        </w:rPr>
+        <w:t xml:space="preserve">Dates for Mason and Kohls:</w:t>
+      </w:r>
+      <w:r>
+        <w:rPr>
+          <w:rFonts w:ascii="Calibri" w:cs="Calibri" w:eastAsia="Calibri" w:hAnsi="Calibri"/>
+        </w:rPr>
+        <w:t xml:space="preserve"> they need the next receive date and the next available quantity. The quantity is always 24, as long as the next PO has more than 24.</w:t>
+      </w:r>
+    </w:p>
+    <w:p>
+      <w:pPr>
+        <w:pStyle w:val="ListParagraph"/>
+        <w:numPr>
+          <w:ilvl w:val="0"/>
+          <w:numId w:val="2"/>
+        </w:numPr>
+        <w:spacing w:after="60"/>
+      </w:pPr>
+      <w:r>
+        <w:rPr>
+          <w:rFonts w:ascii="Calibri" w:cs="Calibri" w:eastAsia="Calibri" w:hAnsi="Calibri"/>
+          <w:b/>
+          <w:bCs/>
+        </w:rPr>
+        <w:t xml:space="preserve">Quantity:</w:t>
+      </w:r>
+      <w:r>
+        <w:rPr>
+          <w:rFonts w:ascii="Calibri" w:cs="Calibri" w:eastAsia="Calibri" w:hAnsi="Calibri"/>
+        </w:rPr>
+        <w:t xml:space="preserve"> Daniel uses available, like Tina.</w:t>
+      </w:r>
+    </w:p>
+    <w:p>
+      <w:pPr>
+        <w:pStyle w:val="ListParagraph"/>
+        <w:numPr>
+          <w:ilvl w:val="0"/>
+          <w:numId w:val="2"/>
+        </w:numPr>
+        <w:spacing w:after="60"/>
+      </w:pPr>
+      <w:r>
+        <w:rPr>
+          <w:rFonts w:ascii="Calibri" w:cs="Calibri" w:eastAsia="Calibri" w:hAnsi="Calibri"/>
+          <w:b/>
+          <w:bCs/>
+        </w:rPr>
+        <w:t xml:space="preserve">Amazon item list:</w:t>
+      </w:r>
+      <w:r>
+        <w:rPr>
+          <w:rFonts w:ascii="Calibri" w:cs="Calibri" w:eastAsia="Calibri" w:hAnsi="Calibri"/>
+        </w:rPr>
+        <w:t xml:space="preserve"> our Amazon catalog in F&amp;O is the same list. OnePlatform has its own reporting sheet; Daniel downloaded it once and re-uses it.</w:t>
+      </w:r>
+    </w:p>
+    <w:p>
+      <w:pPr>
+        <w:pStyle w:val="ListParagraph"/>
+        <w:numPr>
+          <w:ilvl w:val="0"/>
+          <w:numId w:val="2"/>
+        </w:numPr>
+        <w:spacing w:after="60"/>
+      </w:pPr>
+      <w:r>
+        <w:rPr>
+          <w:rFonts w:ascii="Calibri" w:cs="Calibri" w:eastAsia="Calibri" w:hAnsi="Calibri"/>
+          <w:b/>
+          <w:bCs/>
+        </w:rPr>
+        <w:t xml:space="preserve">Reds:</w:t>
+      </w:r>
+      <w:r>
+        <w:rPr>
+          <w:rFonts w:ascii="Calibri" w:cs="Calibri" w:eastAsia="Calibri" w:hAnsi="Calibri"/>
+        </w:rPr>
+        <w:t xml:space="preserve"> only updated when the item becomes obsolete in F&amp;O (disco'd and no stock). Amazon may still have inventory in its DCs.</w:t>
+      </w:r>
+    </w:p>
+    <w:p>
+      <w:pPr>
+        <w:pStyle w:val="ListParagraph"/>
+        <w:numPr>
+          <w:ilvl w:val="0"/>
+          <w:numId w:val="2"/>
+        </w:numPr>
+        <w:spacing w:after="60"/>
+      </w:pPr>
+      <w:r>
+        <w:rPr>
+          <w:rFonts w:ascii="Calibri" w:cs="Calibri" w:eastAsia="Calibri" w:hAnsi="Calibri"/>
+          <w:b/>
+          <w:bCs/>
+        </w:rPr>
+        <w:t xml:space="preserve">Never drop the line:</w:t>
+      </w:r>
+      <w:r>
+        <w:rPr>
+          <w:rFonts w:ascii="Calibri" w:cs="Calibri" w:eastAsia="Calibri" w:hAnsi="Calibri"/>
+        </w:rPr>
+        <w:t xml:space="preserve"> Daniel seems to know it; he sends Tina the list with those items still on it.</w:t>
+      </w:r>
+    </w:p>
+    <w:p>
+      <w:pPr>
+        <w:pStyle w:val="ListParagraph"/>
+        <w:numPr>
+          <w:ilvl w:val="0"/>
+          <w:numId w:val="2"/>
+        </w:numPr>
+        <w:spacing w:after="60"/>
+      </w:pPr>
+      <w:r>
+        <w:rPr>
+          <w:rFonts w:ascii="Calibri" w:cs="Calibri" w:eastAsia="Calibri" w:hAnsi="Calibri"/>
+          <w:b/>
+          <w:bCs/>
+        </w:rPr>
+        <w:t xml:space="preserve">Why these five are manual:</w:t>
+      </w:r>
+      <w:r>
+        <w:rPr>
+          <w:rFonts w:ascii="Calibri" w:cs="Calibri" w:eastAsia="Calibri" w:hAnsi="Calibri"/>
+        </w:rPr>
+        <w:t xml:space="preserve"> they don't have EDI capability for inventory; not all customers take an 846.</w:t>
+      </w:r>
+    </w:p>
+    <w:p>
+      <w:pPr>
+        <w:pStyle w:val="ListParagraph"/>
+        <w:numPr>
+          <w:ilvl w:val="0"/>
+          <w:numId w:val="2"/>
+        </w:numPr>
+        <w:spacing w:after="60"/>
+      </w:pPr>
+      <w:r>
+        <w:rPr>
+          <w:rFonts w:ascii="Calibri" w:cs="Calibri" w:eastAsia="Calibri" w:hAnsi="Calibri"/>
+        </w:rPr>
+        <w:t xml:space="preserve">Still open: who uploads Kohls each day, and when Tina's sell-off numbers go in.</w:t>
       </w:r>
     </w:p>
     <w:p>

</xml_diff>

<commit_message>
Kohls: Daniel uploads daily, real quantity on disco'd items
Co-Authored-By: Devin AI <158243242+devin-ai-integration[bot]@users.noreply.github.com>
</commit_message>
<xml_diff>
--- a/Shadowing_Report_2026-10-22_v2.docx
+++ b/Shadowing_Report_2026-10-22_v2.docx
@@ -2526,7 +2526,7 @@
                 <w:sz w:val="20"/>
                 <w:szCs w:val="20"/>
               </w:rPr>
-              <w:t xml:space="preserve">Who uploads Kohls each day, and when Tina's sell-off numbers go in; What splits the wires</w:t>
+              <w:t xml:space="preserve">What splits the wires</w:t>
             </w:r>
           </w:p>
         </w:tc>
@@ -3117,7 +3117,7 @@
                 <w:sz w:val="20"/>
                 <w:szCs w:val="20"/>
               </w:rPr>
-              <w:t xml:space="preserve">Builds every feed from one F&amp;O inventory pull, in each customer's own format. Daily customers get a quantity of 0, 24 or 50, except that Kohls also gets 1 to 5 (never more than we have) on disco'd items we still have (found by checking the F&amp;O disco flag against on-hand), so leftover stock sells off there. Nothing ever goes out above what we have; it uploads the Mason, Kohls and Sears files to their portals (or queues them) and drafts the Dealora and Lincoln emails. For Amazon it builds the whole file from F&amp;O: ASIN, SKU, UPC, product name and status for every item in OnePlatform's catalog (the entire Amazon catalog). Status comes from available quantity in warehouse 1600: under 24 is out of stock, 24 to 50 is low, above that is in stock (Tina confirmed 24 is fine as long as it's above the pack size). One job, scheduled differently per customer. For low and out-of-stock items it adds the next available date: the Goods in Transit date where there is one, otherwise the earliest open PO date, blank if neither. Discontinued items are marked disco while we have stock and obsolete once we don't. No 30-day cutoff. It adds the next receive date and next available quantity (24 when the next PO has more than 24) to the Mason and Kohls feeds, which they'd like but don't get today. Then it drafts the Amazon email to Matt and Reggie, cc Avi G and Tara, and saves the file to OneDrive. First step (my idea): an F&amp;O report with the dates already coalesced, even before anything else changes.</w:t>
+              <w:t xml:space="preserve">Builds every feed from one F&amp;O inventory pull, in each customer's own format. Daily customers get a quantity of 0, 24 or 50, except that Kohls gets the real quantity on disco'd items we still have (found by checking the F&amp;O disco flag against on-hand), so leftover stock sells off there. Nothing ever goes out above what we have; it uploads the Mason, Kohls and Sears files to their portals (or queues them) and drafts the Dealora and Lincoln emails. For Amazon it builds the whole file from F&amp;O: ASIN, SKU, UPC, product name and status for every item in OnePlatform's catalog (the entire Amazon catalog). Status comes from available quantity in warehouse 1600: under 24 is out of stock, 24 to 50 is low, above that is in stock (Tina confirmed 24 is fine as long as it's above the pack size). One job, scheduled differently per customer. For low and out-of-stock items it adds the next available date: the Goods in Transit date where there is one, otherwise the earliest open PO date, blank if neither. Discontinued items are marked disco while we have stock and obsolete once we don't. No 30-day cutoff. It adds the next receive date and next available quantity (24 when the next PO has more than 24) to the Mason and Kohls feeds, which they'd like but don't get today. Then it drafts the Amazon email to Matt and Reggie, cc Avi G and Tara, and saves the file to OneDrive. First step (my idea): an F&amp;O report with the dates already coalesced, even before anything else changes.</w:t>
             </w:r>
           </w:p>
         </w:tc>
@@ -13300,6 +13300,24 @@
           <w:rFonts w:ascii="Calibri" w:cs="Calibri" w:eastAsia="Calibri" w:hAnsi="Calibri"/>
         </w:rPr>
         <w:t xml:space="preserve">She uploaded an inventory file manually in DSCO Rithum. She messaged Daniel that Kohls has quantities on items that shouldn't have any, which she needs to fix.</w:t>
+      </w:r>
+    </w:p>
+    <w:p>
+      <w:pPr>
+        <w:pStyle w:val="ListParagraph"/>
+        <w:numPr>
+          <w:ilvl w:val="0"/>
+          <w:numId w:val="2"/>
+        </w:numPr>
+        <w:spacing w:after="60"/>
+      </w:pPr>
+      <w:r>
+        <w:rPr>
+          <w:rFonts w:ascii="Calibri" w:cs="Calibri" w:eastAsia="Calibri" w:hAnsi="Calibri"/>
+          <w:i/>
+          <w:iCs/>
+        </w:rPr>
+        <w:t xml:space="preserve">(Later clarified: Daniel does the Kohls upload every day; Tina was only uploading here to diagnose this issue.)</w:t>
       </w:r>
     </w:p>
     <w:p>
@@ -21246,7 +21264,7 @@
                 <w:sz w:val="20"/>
                 <w:szCs w:val="20"/>
               </w:rPr>
-              <w:t xml:space="preserve">0, 24 or 50</w:t>
+              <w:t xml:space="preserve">0, 24 or 50; real quantity on disco'd items</w:t>
             </w:r>
           </w:p>
         </w:tc>
@@ -21892,8 +21910,16 @@
       <w:r>
         <w:rPr>
           <w:rFonts w:ascii="Calibri" w:cs="Calibri" w:eastAsia="Calibri" w:hAnsi="Calibri"/>
-        </w:rPr>
-        <w:t xml:space="preserve">Still open: who uploads Kohls each day, and when Tina's sell-off numbers go in.</w:t>
+          <w:b/>
+          <w:bCs/>
+        </w:rPr>
+        <w:t xml:space="preserve">Who uploads Kohls</w:t>
+      </w:r>
+      <w:r>
+        <w:rPr>
+          <w:rFonts w:ascii="Calibri" w:cs="Calibri" w:eastAsia="Calibri" w:hAnsi="Calibri"/>
+        </w:rPr>
+        <w:t xml:space="preserve"> (Menny, after asking): Daniel, every day. Active items go through his filters and VLOOKUP as 0, 24 or 50; disco'd items keep their real quantity. Tina only uploaded it on Day 2 to diagnose an issue; she usually doesn't.</w:t>
       </w:r>
     </w:p>
     <w:p>

</xml_diff>

<commit_message>
Deductions and disputes: Charmaine follow-up and process card
Co-Authored-By: Devin AI <158243242+devin-ai-integration[bot]@users.noreply.github.com>
</commit_message>
<xml_diff>
--- a/Shadowing_Report_2026-10-22_v2.docx
+++ b/Shadowing_Report_2026-10-22_v2.docx
@@ -14720,6 +14720,259 @@
           <w:rFonts w:ascii="Calibri" w:cs="Calibri" w:eastAsia="Calibri" w:hAnsi="Calibri"/>
         </w:rPr>
         <w:t xml:space="preserve">After going through another deduction, she went back in to download the deductions. Wayfair offers a CSV download, so she gets a normal-looking list, unlike the Lowes list from Day 1. She then reviewed it.</w:t>
+      </w:r>
+    </w:p>
+    <w:p>
+      <w:pPr>
+        <w:spacing w:after="120"/>
+      </w:pPr>
+      <w:r>
+        <w:rPr>
+          <w:rFonts w:ascii="Calibri" w:cs="Calibri" w:eastAsia="Calibri" w:hAnsi="Calibri"/>
+          <w:i/>
+          <w:iCs/>
+        </w:rPr>
+        <w:t xml:space="preserve">(Follow-up after Day 7: Suzanne checks the amounts when she enters the payment; Charmaine checks the reason. See below.)</w:t>
+      </w:r>
+    </w:p>
+    <w:p>
+      <w:pPr>
+        <w:pStyle w:val="Heading2"/>
+        <w:keepNext/>
+        <w:spacing w:after="100" w:before="240"/>
+      </w:pPr>
+      <w:r>
+        <w:rPr>
+          <w:rFonts w:ascii="Calibri" w:cs="Calibri" w:eastAsia="Calibri" w:hAnsi="Calibri"/>
+        </w:rPr>
+        <w:t xml:space="preserve">Follow-up with Charmaine: deductions and disputes</w:t>
+      </w:r>
+    </w:p>
+    <w:p>
+      <w:pPr>
+        <w:spacing w:after="120"/>
+      </w:pPr>
+      <w:r>
+        <w:rPr>
+          <w:rFonts w:ascii="Calibri" w:cs="Calibri" w:eastAsia="Calibri" w:hAnsi="Calibri"/>
+        </w:rPr>
+        <w:t xml:space="preserve">From a conversation with Charmaine after Day 7, not watched. The full write-up is the deductions and disputes process card.</w:t>
+      </w:r>
+    </w:p>
+    <w:p>
+      <w:pPr>
+        <w:pStyle w:val="ListParagraph"/>
+        <w:numPr>
+          <w:ilvl w:val="0"/>
+          <w:numId w:val="2"/>
+        </w:numPr>
+        <w:spacing w:after="60"/>
+      </w:pPr>
+      <w:r>
+        <w:rPr>
+          <w:rFonts w:ascii="Calibri" w:cs="Calibri" w:eastAsia="Calibri" w:hAnsi="Calibri"/>
+          <w:b/>
+          <w:bCs/>
+        </w:rPr>
+        <w:t xml:space="preserve">Her customers (DS only):</w:t>
+      </w:r>
+      <w:r>
+        <w:rPr>
+          <w:rFonts w:ascii="Calibri" w:cs="Calibri" w:eastAsia="Calibri" w:hAnsi="Calibri"/>
+        </w:rPr>
+        <w:t xml:space="preserve"> Wayfair (portal, checked every day), Lowes, OJCommerce and a few others. VirVentures, UnbeatableSales and KartIt are handled entirely by email.</w:t>
+      </w:r>
+    </w:p>
+    <w:p>
+      <w:pPr>
+        <w:pStyle w:val="ListParagraph"/>
+        <w:numPr>
+          <w:ilvl w:val="0"/>
+          <w:numId w:val="2"/>
+        </w:numPr>
+        <w:spacing w:after="60"/>
+      </w:pPr>
+      <w:r>
+        <w:rPr>
+          <w:rFonts w:ascii="Calibri" w:cs="Calibri" w:eastAsia="Calibri" w:hAnsi="Calibri"/>
+          <w:b/>
+          <w:bCs/>
+        </w:rPr>
+        <w:t xml:space="preserve">Wayfair managed returns:</w:t>
+      </w:r>
+      <w:r>
+        <w:rPr>
+          <w:rFonts w:ascii="Calibri" w:cs="Calibri" w:eastAsia="Calibri" w:hAnsi="Calibri"/>
+        </w:rPr>
+        <w:t xml:space="preserve"> always accepted, as part of our policy.</w:t>
+      </w:r>
+    </w:p>
+    <w:p>
+      <w:pPr>
+        <w:pStyle w:val="ListParagraph"/>
+        <w:numPr>
+          <w:ilvl w:val="0"/>
+          <w:numId w:val="2"/>
+        </w:numPr>
+        <w:spacing w:after="60"/>
+      </w:pPr>
+      <w:r>
+        <w:rPr>
+          <w:rFonts w:ascii="Calibri" w:cs="Calibri" w:eastAsia="Calibri" w:hAnsi="Calibri"/>
+          <w:b/>
+          <w:bCs/>
+        </w:rPr>
+        <w:t xml:space="preserve">Misinformation or mis-shipped:</w:t>
+      </w:r>
+      <w:r>
+        <w:rPr>
+          <w:rFonts w:ascii="Calibri" w:cs="Calibri" w:eastAsia="Calibri" w:hAnsi="Calibri"/>
+        </w:rPr>
+        <w:t xml:space="preserve"> she checks that we actually sent the wrong item, usually from the customer's image. If it doesn't match, she disputes on the ticket; Wayfair replies by email if they accept, sometimes after a few rounds. If the customer says they never received it, she checks tracking.</w:t>
+      </w:r>
+    </w:p>
+    <w:p>
+      <w:pPr>
+        <w:pStyle w:val="ListParagraph"/>
+        <w:numPr>
+          <w:ilvl w:val="0"/>
+          <w:numId w:val="2"/>
+        </w:numPr>
+        <w:spacing w:after="60"/>
+      </w:pPr>
+      <w:r>
+        <w:rPr>
+          <w:rFonts w:ascii="Calibri" w:cs="Calibri" w:eastAsia="Calibri" w:hAnsi="Calibri"/>
+          <w:b/>
+          <w:bCs/>
+        </w:rPr>
+        <w:t xml:space="preserve">Return deductions (email customers):</w:t>
+      </w:r>
+      <w:r>
+        <w:rPr>
+          <w:rFonts w:ascii="Calibri" w:cs="Calibri" w:eastAsia="Calibri" w:hAnsi="Calibri"/>
+        </w:rPr>
+        <w:t xml:space="preserve"> she checks the item came back to the warehouse, as per our policy with that customer. If not, she doesn't approve it; we tell them we never received it, and it goes on next month's payment once they send tracking. UnbeatableSales sends a batch of emails once a week.</w:t>
+      </w:r>
+    </w:p>
+    <w:p>
+      <w:pPr>
+        <w:pStyle w:val="ListParagraph"/>
+        <w:numPr>
+          <w:ilvl w:val="0"/>
+          <w:numId w:val="2"/>
+        </w:numPr>
+        <w:spacing w:after="60"/>
+      </w:pPr>
+      <w:r>
+        <w:rPr>
+          <w:rFonts w:ascii="Calibri" w:cs="Calibri" w:eastAsia="Calibri" w:hAnsi="Calibri"/>
+          <w:b/>
+          <w:bCs/>
+        </w:rPr>
+        <w:t xml:space="preserve">Rules:</w:t>
+      </w:r>
+      <w:r>
+        <w:rPr>
+          <w:rFonts w:ascii="Calibri" w:cs="Calibri" w:eastAsia="Calibri" w:hAnsi="Calibri"/>
+        </w:rPr>
+        <w:t xml:space="preserve"> set per customer by Tina and Avi. Charmaine has them in her head and couldn't repeat them. Sometimes she checks with Tina before responding.</w:t>
+      </w:r>
+    </w:p>
+    <w:p>
+      <w:pPr>
+        <w:pStyle w:val="ListParagraph"/>
+        <w:numPr>
+          <w:ilvl w:val="0"/>
+          <w:numId w:val="2"/>
+        </w:numPr>
+        <w:spacing w:after="60"/>
+      </w:pPr>
+      <w:r>
+        <w:rPr>
+          <w:rFonts w:ascii="Calibri" w:cs="Calibri" w:eastAsia="Calibri" w:hAnsi="Calibri"/>
+          <w:b/>
+          <w:bCs/>
+        </w:rPr>
+        <w:t xml:space="preserve">Volume and time:</w:t>
+      </w:r>
+      <w:r>
+        <w:rPr>
+          <w:rFonts w:ascii="Calibri" w:cs="Calibri" w:eastAsia="Calibri" w:hAnsi="Calibri"/>
+        </w:rPr>
+        <w:t xml:space="preserve"> Oct 2 to 15, 70 deductions, 11 of which needed checking; the rest were auto-accepts. Gathering the info takes 5 to 10 minutes, and each dispute about 5 to 15 minutes of her time, though it can stay open a few days.</w:t>
+      </w:r>
+    </w:p>
+    <w:p>
+      <w:pPr>
+        <w:pStyle w:val="ListParagraph"/>
+        <w:numPr>
+          <w:ilvl w:val="0"/>
+          <w:numId w:val="2"/>
+        </w:numPr>
+        <w:spacing w:after="60"/>
+      </w:pPr>
+      <w:r>
+        <w:rPr>
+          <w:rFonts w:ascii="Calibri" w:cs="Calibri" w:eastAsia="Calibri" w:hAnsi="Calibri"/>
+          <w:b/>
+          <w:bCs/>
+        </w:rPr>
+        <w:t xml:space="preserve">Deadline:</w:t>
+      </w:r>
+      <w:r>
+        <w:rPr>
+          <w:rFonts w:ascii="Calibri" w:cs="Calibri" w:eastAsia="Calibri" w:hAnsi="Calibri"/>
+        </w:rPr>
+        <w:t xml:space="preserve"> only Wayfair has one, the settlement date on each deduction.</w:t>
+      </w:r>
+    </w:p>
+    <w:p>
+      <w:pPr>
+        <w:pStyle w:val="ListParagraph"/>
+        <w:numPr>
+          <w:ilvl w:val="0"/>
+          <w:numId w:val="2"/>
+        </w:numPr>
+        <w:spacing w:after="60"/>
+      </w:pPr>
+      <w:r>
+        <w:rPr>
+          <w:rFonts w:ascii="Calibri" w:cs="Calibri" w:eastAsia="Calibri" w:hAnsi="Calibri"/>
+          <w:b/>
+          <w:bCs/>
+        </w:rPr>
+        <w:t xml:space="preserve">Hand-off to Suzanne:</w:t>
+      </w:r>
+      <w:r>
+        <w:rPr>
+          <w:rFonts w:ascii="Calibri" w:cs="Calibri" w:eastAsia="Calibri" w:hAnsi="Calibri"/>
+        </w:rPr>
+        <w:t xml:space="preserve"> when Suzanne enters a payment, she asks Charmaine (next desk) whether the remittance matches what Charmaine accepted. There is no list; Charmaine searches her inbox or the portal. She tells Suzanne only when a dispute is finished: won means don't accept that deduction on the remittance, lost means accept it.</w:t>
+      </w:r>
+    </w:p>
+    <w:p>
+      <w:pPr>
+        <w:pStyle w:val="ListParagraph"/>
+        <w:numPr>
+          <w:ilvl w:val="0"/>
+          <w:numId w:val="2"/>
+        </w:numPr>
+        <w:spacing w:after="60"/>
+      </w:pPr>
+      <w:r>
+        <w:rPr>
+          <w:rFonts w:ascii="Calibri" w:cs="Calibri" w:eastAsia="Calibri" w:hAnsi="Calibri"/>
+          <w:b/>
+          <w:bCs/>
+        </w:rPr>
+        <w:t xml:space="preserve">Day 2 vs now:</w:t>
+      </w:r>
+      <w:r>
+        <w:rPr>
+          <w:rFonts w:ascii="Calibri" w:cs="Calibri" w:eastAsia="Calibri" w:hAnsi="Calibri"/>
+        </w:rPr>
+        <w:t xml:space="preserve"> on Day 2 she was seen accepting a wrong-item deduction; now she says she checks those against the image first. Both are kept; that one may have matched.</w:t>
       </w:r>
     </w:p>
     <w:p>

</xml_diff>

<commit_message>
Day 8: Baruch Salamander's deduction workflow (SPS Commerce); extend deductions card
Co-Authored-By: Devin AI <158243242+devin-ai-integration[bot]@users.noreply.github.com>
</commit_message>
<xml_diff>
--- a/Shadowing_Report_2026-10-22_v2.docx
+++ b/Shadowing_Report_2026-10-22_v2.docx
@@ -28,7 +28,7 @@
           <w:sz w:val="26"/>
           <w:szCs w:val="26"/>
         </w:rPr>
-        <w:t xml:space="preserve">Wednesday, October 14 to Friday, October 23, 2026 (seven shadowing days). Version 2: ranked summary up front, detail in the appendix</w:t>
+        <w:t xml:space="preserve">Wednesday, October 14 to Tuesday, October 27, 2026 (eight shadowing days). Version 2: ranked summary up front, detail in the appendix</w:t>
       </w:r>
     </w:p>
     <w:p>
@@ -98,7 +98,7 @@
         <w:rPr>
           <w:rFonts w:ascii="Calibri" w:cs="Calibri" w:eastAsia="Calibri" w:hAnsi="Calibri"/>
         </w:rPr>
-        <w:t xml:space="preserve">Seven days, eight people shadowed. Most of the work I saw is people reading one screen and typing into another, forwarding emails by hand, and keeping track of things on paper, in notebooks and in shared Excels. The clearest bot, and the most measured time, is </w:t>
+        <w:t xml:space="preserve">Eight days, eight people shadowed. Most of the work I saw is people reading one screen and typing into another, forwarding emails by hand, and keeping track of things on paper, in notebooks and in shared Excels. The clearest bot, and the most measured time, is </w:t>
       </w:r>
       <w:r>
         <w:rPr>
@@ -4003,7 +4003,7 @@
                 <w:sz w:val="20"/>
                 <w:szCs w:val="20"/>
               </w:rPr>
-              <w:t xml:space="preserve">Day 5: daily recovery emails to six people with MTD and YTD totals; SUMIF aging by salesman built by hand; about $146k recovered this year</w:t>
+              <w:t xml:space="preserve">Day 5: daily recovery emails to six people with MTD and YTD totals; SUMIF aging by salesman built by hand; about $146k recovered this year. Day 8: he exports the SPS reports and summarises them many ways for Isaac Grossman and the money team</w:t>
             </w:r>
           </w:p>
         </w:tc>
@@ -5316,7 +5316,7 @@
         <w:rPr>
           <w:rFonts w:ascii="Calibri" w:cs="Calibri" w:eastAsia="Calibri" w:hAnsi="Calibri"/>
         </w:rPr>
-        <w:t xml:space="preserve">The Seven Days at a Glance</w:t>
+        <w:t xml:space="preserve">The Eight Days at a Glance</w:t>
       </w:r>
     </w:p>
     <w:tbl>
@@ -7265,6 +7265,92 @@
           </w:p>
         </w:tc>
       </w:tr>
+      <w:tr>
+        <w:trPr>
+          <w:cantSplit/>
+        </w:trPr>
+        <w:tc>
+          <w:tcPr>
+            <w:tcW w:type="dxa" w:w="1500"/>
+            <w:tcBorders>
+              <w:top w:val="single" w:color="BFBFBF" w:sz="4"/>
+              <w:left w:val="single" w:color="BFBFBF" w:sz="4"/>
+              <w:bottom w:val="single" w:color="BFBFBF" w:sz="4"/>
+              <w:right w:val="single" w:color="BFBFBF" w:sz="4"/>
+            </w:tcBorders>
+            <w:tcMar>
+              <w:top w:type="dxa" w:w="60"/>
+              <w:left w:type="dxa" w:w="100"/>
+              <w:bottom w:type="dxa" w:w="60"/>
+              <w:right w:type="dxa" w:w="100"/>
+            </w:tcMar>
+          </w:tcPr>
+          <w:p>
+            <w:r>
+              <w:rPr>
+                <w:rFonts w:ascii="Calibri" w:cs="Calibri" w:eastAsia="Calibri" w:hAnsi="Calibri"/>
+                <w:sz w:val="20"/>
+                <w:szCs w:val="20"/>
+              </w:rPr>
+              <w:t xml:space="preserve">Tue Oct 27</w:t>
+            </w:r>
+          </w:p>
+        </w:tc>
+        <w:tc>
+          <w:tcPr>
+            <w:tcW w:type="dxa" w:w="2100"/>
+            <w:tcBorders>
+              <w:top w:val="single" w:color="BFBFBF" w:sz="4"/>
+              <w:left w:val="single" w:color="BFBFBF" w:sz="4"/>
+              <w:bottom w:val="single" w:color="BFBFBF" w:sz="4"/>
+              <w:right w:val="single" w:color="BFBFBF" w:sz="4"/>
+            </w:tcBorders>
+            <w:tcMar>
+              <w:top w:type="dxa" w:w="60"/>
+              <w:left w:type="dxa" w:w="100"/>
+              <w:bottom w:type="dxa" w:w="60"/>
+              <w:right w:type="dxa" w:w="100"/>
+            </w:tcMar>
+          </w:tcPr>
+          <w:p>
+            <w:r>
+              <w:rPr>
+                <w:rFonts w:ascii="Calibri" w:cs="Calibri" w:eastAsia="Calibri" w:hAnsi="Calibri"/>
+                <w:sz w:val="20"/>
+                <w:szCs w:val="20"/>
+              </w:rPr>
+              <w:t xml:space="preserve">Not given</w:t>
+            </w:r>
+          </w:p>
+        </w:tc>
+        <w:tc>
+          <w:tcPr>
+            <w:tcW w:type="dxa" w:w="5760"/>
+            <w:tcBorders>
+              <w:top w:val="single" w:color="BFBFBF" w:sz="4"/>
+              <w:left w:val="single" w:color="BFBFBF" w:sz="4"/>
+              <w:bottom w:val="single" w:color="BFBFBF" w:sz="4"/>
+              <w:right w:val="single" w:color="BFBFBF" w:sz="4"/>
+            </w:tcBorders>
+            <w:tcMar>
+              <w:top w:type="dxa" w:w="60"/>
+              <w:left w:type="dxa" w:w="100"/>
+              <w:bottom w:type="dxa" w:w="60"/>
+              <w:right w:type="dxa" w:w="100"/>
+            </w:tcMar>
+          </w:tcPr>
+          <w:p>
+            <w:r>
+              <w:rPr>
+                <w:rFonts w:ascii="Calibri" w:cs="Calibri" w:eastAsia="Calibri" w:hAnsi="Calibri"/>
+                <w:sz w:val="20"/>
+                <w:szCs w:val="20"/>
+              </w:rPr>
+              <w:t xml:space="preserve">Baruch Salamander: walkthrough of the deduction workflow (SPS Commerce)</w:t>
+            </w:r>
+          </w:p>
+        </w:tc>
+      </w:tr>
     </w:tbl>
     <w:p>
       <w:pPr>
@@ -18175,7 +18261,15 @@
         <w:rPr>
           <w:rFonts w:ascii="Calibri" w:cs="Calibri" w:eastAsia="Calibri" w:hAnsi="Calibri"/>
         </w:rPr>
-        <w:t xml:space="preserve">He has recovered about $146k in disputes this year so far.</w:t>
+        <w:t xml:space="preserve">He has recovered about $146k in disputes this year so far. </w:t>
+      </w:r>
+      <w:r>
+        <w:rPr>
+          <w:rFonts w:ascii="Calibri" w:cs="Calibri" w:eastAsia="Calibri" w:hAnsi="Calibri"/>
+          <w:i/>
+          <w:iCs/>
+        </w:rPr>
+        <w:t xml:space="preserve">(On Day 8 he gave $146k as co-ops recovered last year; one of the two labels is probably wrong.)</w:t>
       </w:r>
     </w:p>
     <w:p>
@@ -22185,7 +22279,834 @@
         <w:rPr>
           <w:rFonts w:ascii="Calibri" w:cs="Calibri" w:eastAsia="Calibri" w:hAnsi="Calibri"/>
         </w:rPr>
-        <w:t xml:space="preserve">Part 14: Observer's Own Work (not part of the process study)</w:t>
+        <w:t xml:space="preserve">Part 14: Baruch Salamander, Deduction Workflow Breakdown, Day 8 (Tue Oct 27)</w:t>
+      </w:r>
+    </w:p>
+    <w:p>
+      <w:pPr>
+        <w:spacing w:after="120"/>
+      </w:pPr>
+      <w:r>
+        <w:rPr>
+          <w:rFonts w:ascii="Calibri" w:cs="Calibri" w:eastAsia="Calibri" w:hAnsi="Calibri"/>
+        </w:rPr>
+        <w:t xml:space="preserve">The observer asked him to walk through the whole deduction workflow. Described and partly shown, not timed. </w:t>
+      </w:r>
+      <w:r>
+        <w:rPr>
+          <w:rFonts w:ascii="Calibri" w:cs="Calibri" w:eastAsia="Calibri" w:hAnsi="Calibri"/>
+          <w:i/>
+          <w:iCs/>
+        </w:rPr>
+        <w:t xml:space="preserve">(Observer's note: Baruch Salamander is hard to talk to.)</w:t>
+      </w:r>
+      <w:r>
+        <w:rPr>
+          <w:rFonts w:ascii="Calibri" w:cs="Calibri" w:eastAsia="Calibri" w:hAnsi="Calibri"/>
+        </w:rPr>
+        <w:t xml:space="preserve"> The full write-up is the deductions and disputes process card.</w:t>
+      </w:r>
+    </w:p>
+    <w:p>
+      <w:pPr>
+        <w:spacing w:after="120"/>
+      </w:pPr>
+      <w:r>
+        <w:rPr>
+          <w:rFonts w:ascii="Calibri" w:cs="Calibri" w:eastAsia="Calibri" w:hAnsi="Calibri"/>
+          <w:b/>
+          <w:bCs/>
+        </w:rPr>
+        <w:t xml:space="preserve">Systems and tools:</w:t>
+      </w:r>
+      <w:r>
+        <w:rPr>
+          <w:rFonts w:ascii="Calibri" w:cs="Calibri" w:eastAsia="Calibri" w:hAnsi="Calibri"/>
+        </w:rPr>
+        <w:t xml:space="preserve"> SPS Commerce SupplyPike, F&amp;O (Pacejet shipment), FedEx, Amazon Vendor Central, email.</w:t>
+      </w:r>
+    </w:p>
+    <w:p>
+      <w:pPr>
+        <w:spacing w:after="120"/>
+      </w:pPr>
+      <w:r>
+        <w:rPr>
+          <w:rFonts w:ascii="Calibri" w:cs="Calibri" w:eastAsia="Calibri" w:hAnsi="Calibri"/>
+          <w:b/>
+          <w:bCs/>
+        </w:rPr>
+        <w:t xml:space="preserve">SPS Commerce SupplyPike</w:t>
+      </w:r>
+      <w:r>
+        <w:rPr>
+          <w:rFonts w:ascii="Calibri" w:cs="Calibri" w:eastAsia="Calibri" w:hAnsi="Calibri"/>
+        </w:rPr>
+        <w:t xml:space="preserve"> is a third-party funnel for Amazon, Walmart, Home Depot and Lowes. It sorts deductions into groups and runs the disputes, but we tell it what to dispute, apart from the ones it handles on its own.</w:t>
+      </w:r>
+    </w:p>
+    <w:p>
+      <w:pPr>
+        <w:pStyle w:val="Heading2"/>
+        <w:keepNext/>
+        <w:spacing w:after="100" w:before="240"/>
+      </w:pPr>
+      <w:r>
+        <w:rPr>
+          <w:rFonts w:ascii="Calibri" w:cs="Calibri" w:eastAsia="Calibri" w:hAnsi="Calibri"/>
+        </w:rPr>
+        <w:t xml:space="preserve">Amazon (daily)</w:t>
+      </w:r>
+    </w:p>
+    <w:tbl>
+      <w:tblPr>
+        <w:tblW w:type="dxa" w:w="9360"/>
+        <w:tblBorders>
+          <w:top w:val="single" w:color="auto" w:sz="4"/>
+          <w:left w:val="single" w:color="auto" w:sz="4"/>
+          <w:bottom w:val="single" w:color="auto" w:sz="4"/>
+          <w:right w:val="single" w:color="auto" w:sz="4"/>
+          <w:insideH w:val="single" w:color="auto" w:sz="4"/>
+          <w:insideV w:val="single" w:color="auto" w:sz="4"/>
+        </w:tblBorders>
+      </w:tblPr>
+      <w:tblGrid>
+        <w:gridCol w:w="1900"/>
+        <w:gridCol w:w="5160"/>
+        <w:gridCol w:w="2300"/>
+      </w:tblGrid>
+      <w:tr>
+        <w:trPr>
+          <w:tblHeader/>
+        </w:trPr>
+        <w:tc>
+          <w:tcPr>
+            <w:tcW w:type="dxa" w:w="1900"/>
+            <w:tcBorders>
+              <w:top w:val="single" w:color="BFBFBF" w:sz="4"/>
+              <w:left w:val="single" w:color="BFBFBF" w:sz="4"/>
+              <w:bottom w:val="single" w:color="BFBFBF" w:sz="4"/>
+              <w:right w:val="single" w:color="BFBFBF" w:sz="4"/>
+            </w:tcBorders>
+            <w:shd w:fill="D9E2F3" w:color="auto" w:val="clear"/>
+            <w:tcMar>
+              <w:top w:type="dxa" w:w="60"/>
+              <w:left w:type="dxa" w:w="100"/>
+              <w:bottom w:type="dxa" w:w="60"/>
+              <w:right w:type="dxa" w:w="100"/>
+            </w:tcMar>
+          </w:tcPr>
+          <w:p>
+            <w:r>
+              <w:rPr>
+                <w:rFonts w:ascii="Calibri" w:cs="Calibri" w:eastAsia="Calibri" w:hAnsi="Calibri"/>
+                <w:b/>
+                <w:bCs/>
+                <w:sz w:val="20"/>
+                <w:szCs w:val="20"/>
+              </w:rPr>
+              <w:t xml:space="preserve">Group</w:t>
+            </w:r>
+          </w:p>
+        </w:tc>
+        <w:tc>
+          <w:tcPr>
+            <w:tcW w:type="dxa" w:w="5160"/>
+            <w:tcBorders>
+              <w:top w:val="single" w:color="BFBFBF" w:sz="4"/>
+              <w:left w:val="single" w:color="BFBFBF" w:sz="4"/>
+              <w:bottom w:val="single" w:color="BFBFBF" w:sz="4"/>
+              <w:right w:val="single" w:color="BFBFBF" w:sz="4"/>
+            </w:tcBorders>
+            <w:shd w:fill="D9E2F3" w:color="auto" w:val="clear"/>
+            <w:tcMar>
+              <w:top w:type="dxa" w:w="60"/>
+              <w:left w:type="dxa" w:w="100"/>
+              <w:bottom w:type="dxa" w:w="60"/>
+              <w:right w:type="dxa" w:w="100"/>
+            </w:tcMar>
+          </w:tcPr>
+          <w:p>
+            <w:r>
+              <w:rPr>
+                <w:rFonts w:ascii="Calibri" w:cs="Calibri" w:eastAsia="Calibri" w:hAnsi="Calibri"/>
+                <w:b/>
+                <w:bCs/>
+                <w:sz w:val="20"/>
+                <w:szCs w:val="20"/>
+              </w:rPr>
+              <w:t xml:space="preserve">What he does</w:t>
+            </w:r>
+          </w:p>
+        </w:tc>
+        <w:tc>
+          <w:tcPr>
+            <w:tcW w:type="dxa" w:w="2300"/>
+            <w:tcBorders>
+              <w:top w:val="single" w:color="BFBFBF" w:sz="4"/>
+              <w:left w:val="single" w:color="BFBFBF" w:sz="4"/>
+              <w:bottom w:val="single" w:color="BFBFBF" w:sz="4"/>
+              <w:right w:val="single" w:color="BFBFBF" w:sz="4"/>
+            </w:tcBorders>
+            <w:shd w:fill="D9E2F3" w:color="auto" w:val="clear"/>
+            <w:tcMar>
+              <w:top w:type="dxa" w:w="60"/>
+              <w:left w:type="dxa" w:w="100"/>
+              <w:bottom w:type="dxa" w:w="60"/>
+              <w:right w:type="dxa" w:w="100"/>
+            </w:tcMar>
+          </w:tcPr>
+          <w:p>
+            <w:r>
+              <w:rPr>
+                <w:rFonts w:ascii="Calibri" w:cs="Calibri" w:eastAsia="Calibri" w:hAnsi="Calibri"/>
+                <w:b/>
+                <w:bCs/>
+                <w:sz w:val="20"/>
+                <w:szCs w:val="20"/>
+              </w:rPr>
+              <w:t xml:space="preserve">Last year</w:t>
+            </w:r>
+          </w:p>
+        </w:tc>
+      </w:tr>
+      <w:tr>
+        <w:trPr>
+          <w:cantSplit/>
+        </w:trPr>
+        <w:tc>
+          <w:tcPr>
+            <w:tcW w:type="dxa" w:w="1900"/>
+            <w:tcBorders>
+              <w:top w:val="single" w:color="BFBFBF" w:sz="4"/>
+              <w:left w:val="single" w:color="BFBFBF" w:sz="4"/>
+              <w:bottom w:val="single" w:color="BFBFBF" w:sz="4"/>
+              <w:right w:val="single" w:color="BFBFBF" w:sz="4"/>
+            </w:tcBorders>
+            <w:tcMar>
+              <w:top w:type="dxa" w:w="60"/>
+              <w:left w:type="dxa" w:w="100"/>
+              <w:bottom w:type="dxa" w:w="60"/>
+              <w:right w:type="dxa" w:w="100"/>
+            </w:tcMar>
+          </w:tcPr>
+          <w:p>
+            <w:r>
+              <w:rPr>
+                <w:rFonts w:ascii="Calibri" w:cs="Calibri" w:eastAsia="Calibri" w:hAnsi="Calibri"/>
+                <w:sz w:val="20"/>
+                <w:szCs w:val="20"/>
+              </w:rPr>
+              <w:t xml:space="preserve">Overages (new)</w:t>
+            </w:r>
+          </w:p>
+        </w:tc>
+        <w:tc>
+          <w:tcPr>
+            <w:tcW w:type="dxa" w:w="5160"/>
+            <w:tcBorders>
+              <w:top w:val="single" w:color="BFBFBF" w:sz="4"/>
+              <w:left w:val="single" w:color="BFBFBF" w:sz="4"/>
+              <w:bottom w:val="single" w:color="BFBFBF" w:sz="4"/>
+              <w:right w:val="single" w:color="BFBFBF" w:sz="4"/>
+            </w:tcBorders>
+            <w:tcMar>
+              <w:top w:type="dxa" w:w="60"/>
+              <w:left w:type="dxa" w:w="100"/>
+              <w:bottom w:type="dxa" w:w="60"/>
+              <w:right w:type="dxa" w:w="100"/>
+            </w:tcMar>
+          </w:tcPr>
+          <w:p>
+            <w:r>
+              <w:rPr>
+                <w:rFonts w:ascii="Calibri" w:cs="Calibri" w:eastAsia="Calibri" w:hAnsi="Calibri"/>
+                <w:sz w:val="20"/>
+                <w:szCs w:val="20"/>
+              </w:rPr>
+              <w:t xml:space="preserve">Selects all new overages and submits invoices</w:t>
+            </w:r>
+          </w:p>
+        </w:tc>
+        <w:tc>
+          <w:tcPr>
+            <w:tcW w:type="dxa" w:w="2300"/>
+            <w:tcBorders>
+              <w:top w:val="single" w:color="BFBFBF" w:sz="4"/>
+              <w:left w:val="single" w:color="BFBFBF" w:sz="4"/>
+              <w:bottom w:val="single" w:color="BFBFBF" w:sz="4"/>
+              <w:right w:val="single" w:color="BFBFBF" w:sz="4"/>
+            </w:tcBorders>
+            <w:tcMar>
+              <w:top w:type="dxa" w:w="60"/>
+              <w:left w:type="dxa" w:w="100"/>
+              <w:bottom w:type="dxa" w:w="60"/>
+              <w:right w:type="dxa" w:w="100"/>
+            </w:tcMar>
+          </w:tcPr>
+          <w:p>
+            <w:r>
+              <w:rPr>
+                <w:rFonts w:ascii="Calibri" w:cs="Calibri" w:eastAsia="Calibri" w:hAnsi="Calibri"/>
+                <w:sz w:val="20"/>
+                <w:szCs w:val="20"/>
+              </w:rPr>
+              <w:t xml:space="preserve">New, no figure</w:t>
+            </w:r>
+          </w:p>
+        </w:tc>
+      </w:tr>
+      <w:tr>
+        <w:trPr>
+          <w:cantSplit/>
+        </w:trPr>
+        <w:tc>
+          <w:tcPr>
+            <w:tcW w:type="dxa" w:w="1900"/>
+            <w:tcBorders>
+              <w:top w:val="single" w:color="BFBFBF" w:sz="4"/>
+              <w:left w:val="single" w:color="BFBFBF" w:sz="4"/>
+              <w:bottom w:val="single" w:color="BFBFBF" w:sz="4"/>
+              <w:right w:val="single" w:color="BFBFBF" w:sz="4"/>
+            </w:tcBorders>
+            <w:tcMar>
+              <w:top w:type="dxa" w:w="60"/>
+              <w:left w:type="dxa" w:w="100"/>
+              <w:bottom w:type="dxa" w:w="60"/>
+              <w:right w:type="dxa" w:w="100"/>
+            </w:tcMar>
+          </w:tcPr>
+          <w:p>
+            <w:r>
+              <w:rPr>
+                <w:rFonts w:ascii="Calibri" w:cs="Calibri" w:eastAsia="Calibri" w:hAnsi="Calibri"/>
+                <w:sz w:val="20"/>
+                <w:szCs w:val="20"/>
+              </w:rPr>
+              <w:t xml:space="preserve">Chargebacks</w:t>
+            </w:r>
+          </w:p>
+        </w:tc>
+        <w:tc>
+          <w:tcPr>
+            <w:tcW w:type="dxa" w:w="5160"/>
+            <w:tcBorders>
+              <w:top w:val="single" w:color="BFBFBF" w:sz="4"/>
+              <w:left w:val="single" w:color="BFBFBF" w:sz="4"/>
+              <w:bottom w:val="single" w:color="BFBFBF" w:sz="4"/>
+              <w:right w:val="single" w:color="BFBFBF" w:sz="4"/>
+            </w:tcBorders>
+            <w:tcMar>
+              <w:top w:type="dxa" w:w="60"/>
+              <w:left w:type="dxa" w:w="100"/>
+              <w:bottom w:type="dxa" w:w="60"/>
+              <w:right w:type="dxa" w:w="100"/>
+            </w:tcMar>
+          </w:tcPr>
+          <w:p>
+            <w:r>
+              <w:rPr>
+                <w:rFonts w:ascii="Calibri" w:cs="Calibri" w:eastAsia="Calibri" w:hAnsi="Calibri"/>
+                <w:sz w:val="20"/>
+                <w:szCs w:val="20"/>
+              </w:rPr>
+              <w:t xml:space="preserve">Most can't be won. Disputable ones (e.g. on-time shipment) have 30 days. He filters to the last 30 days and drops the types marked X, then selects all and clicks Create disputes. SPS disputes many itself; he downloads the waived report to show what SPS saves us</w:t>
+            </w:r>
+          </w:p>
+        </w:tc>
+        <w:tc>
+          <w:tcPr>
+            <w:tcW w:type="dxa" w:w="2300"/>
+            <w:tcBorders>
+              <w:top w:val="single" w:color="BFBFBF" w:sz="4"/>
+              <w:left w:val="single" w:color="BFBFBF" w:sz="4"/>
+              <w:bottom w:val="single" w:color="BFBFBF" w:sz="4"/>
+              <w:right w:val="single" w:color="BFBFBF" w:sz="4"/>
+            </w:tcBorders>
+            <w:tcMar>
+              <w:top w:type="dxa" w:w="60"/>
+              <w:left w:type="dxa" w:w="100"/>
+              <w:bottom w:type="dxa" w:w="60"/>
+              <w:right w:type="dxa" w:w="100"/>
+            </w:tcMar>
+          </w:tcPr>
+          <w:p>
+            <w:r>
+              <w:rPr>
+                <w:rFonts w:ascii="Calibri" w:cs="Calibri" w:eastAsia="Calibri" w:hAnsi="Calibri"/>
+                <w:sz w:val="20"/>
+                <w:szCs w:val="20"/>
+              </w:rPr>
+              <w:t xml:space="preserve">$127k recovered of $540k</w:t>
+            </w:r>
+          </w:p>
+        </w:tc>
+      </w:tr>
+      <w:tr>
+        <w:trPr>
+          <w:cantSplit/>
+        </w:trPr>
+        <w:tc>
+          <w:tcPr>
+            <w:tcW w:type="dxa" w:w="1900"/>
+            <w:tcBorders>
+              <w:top w:val="single" w:color="BFBFBF" w:sz="4"/>
+              <w:left w:val="single" w:color="BFBFBF" w:sz="4"/>
+              <w:bottom w:val="single" w:color="BFBFBF" w:sz="4"/>
+              <w:right w:val="single" w:color="BFBFBF" w:sz="4"/>
+            </w:tcBorders>
+            <w:tcMar>
+              <w:top w:type="dxa" w:w="60"/>
+              <w:left w:type="dxa" w:w="100"/>
+              <w:bottom w:type="dxa" w:w="60"/>
+              <w:right w:type="dxa" w:w="100"/>
+            </w:tcMar>
+          </w:tcPr>
+          <w:p>
+            <w:r>
+              <w:rPr>
+                <w:rFonts w:ascii="Calibri" w:cs="Calibri" w:eastAsia="Calibri" w:hAnsi="Calibri"/>
+                <w:sz w:val="20"/>
+                <w:szCs w:val="20"/>
+              </w:rPr>
+              <w:t xml:space="preserve">Co-ops</w:t>
+            </w:r>
+          </w:p>
+        </w:tc>
+        <w:tc>
+          <w:tcPr>
+            <w:tcW w:type="dxa" w:w="5160"/>
+            <w:tcBorders>
+              <w:top w:val="single" w:color="BFBFBF" w:sz="4"/>
+              <w:left w:val="single" w:color="BFBFBF" w:sz="4"/>
+              <w:bottom w:val="single" w:color="BFBFBF" w:sz="4"/>
+              <w:right w:val="single" w:color="BFBFBF" w:sz="4"/>
+            </w:tcBorders>
+            <w:tcMar>
+              <w:top w:type="dxa" w:w="60"/>
+              <w:left w:type="dxa" w:w="100"/>
+              <w:bottom w:type="dxa" w:w="60"/>
+              <w:right w:type="dxa" w:w="100"/>
+            </w:tcMar>
+          </w:tcPr>
+          <w:p>
+            <w:r>
+              <w:rPr>
+                <w:rFonts w:ascii="Calibri" w:cs="Calibri" w:eastAsia="Calibri" w:hAnsi="Calibri"/>
+                <w:sz w:val="20"/>
+                <w:szCs w:val="20"/>
+              </w:rPr>
+              <w:t xml:space="preserve">Selects all that SPS labels invalid and disputes them. He doesn't know what makes one valid or invalid. Amazon put co-op disputes on hold to study them: none disputable before April 2027. Two-year lookback; last year's are done</w:t>
+            </w:r>
+          </w:p>
+        </w:tc>
+        <w:tc>
+          <w:tcPr>
+            <w:tcW w:type="dxa" w:w="2300"/>
+            <w:tcBorders>
+              <w:top w:val="single" w:color="BFBFBF" w:sz="4"/>
+              <w:left w:val="single" w:color="BFBFBF" w:sz="4"/>
+              <w:bottom w:val="single" w:color="BFBFBF" w:sz="4"/>
+              <w:right w:val="single" w:color="BFBFBF" w:sz="4"/>
+            </w:tcBorders>
+            <w:tcMar>
+              <w:top w:type="dxa" w:w="60"/>
+              <w:left w:type="dxa" w:w="100"/>
+              <w:bottom w:type="dxa" w:w="60"/>
+              <w:right w:type="dxa" w:w="100"/>
+            </w:tcMar>
+          </w:tcPr>
+          <w:p>
+            <w:r>
+              <w:rPr>
+                <w:rFonts w:ascii="Calibri" w:cs="Calibri" w:eastAsia="Calibri" w:hAnsi="Calibri"/>
+                <w:sz w:val="20"/>
+                <w:szCs w:val="20"/>
+              </w:rPr>
+              <w:t xml:space="preserve">$146k recovered</w:t>
+            </w:r>
+          </w:p>
+        </w:tc>
+      </w:tr>
+      <w:tr>
+        <w:trPr>
+          <w:cantSplit/>
+        </w:trPr>
+        <w:tc>
+          <w:tcPr>
+            <w:tcW w:type="dxa" w:w="1900"/>
+            <w:tcBorders>
+              <w:top w:val="single" w:color="BFBFBF" w:sz="4"/>
+              <w:left w:val="single" w:color="BFBFBF" w:sz="4"/>
+              <w:bottom w:val="single" w:color="BFBFBF" w:sz="4"/>
+              <w:right w:val="single" w:color="BFBFBF" w:sz="4"/>
+            </w:tcBorders>
+            <w:tcMar>
+              <w:top w:type="dxa" w:w="60"/>
+              <w:left w:type="dxa" w:w="100"/>
+              <w:bottom w:type="dxa" w:w="60"/>
+              <w:right w:type="dxa" w:w="100"/>
+            </w:tcMar>
+          </w:tcPr>
+          <w:p>
+            <w:r>
+              <w:rPr>
+                <w:rFonts w:ascii="Calibri" w:cs="Calibri" w:eastAsia="Calibri" w:hAnsi="Calibri"/>
+                <w:sz w:val="20"/>
+                <w:szCs w:val="20"/>
+              </w:rPr>
+              <w:t xml:space="preserve">Shortages</w:t>
+            </w:r>
+          </w:p>
+        </w:tc>
+        <w:tc>
+          <w:tcPr>
+            <w:tcW w:type="dxa" w:w="5160"/>
+            <w:tcBorders>
+              <w:top w:val="single" w:color="BFBFBF" w:sz="4"/>
+              <w:left w:val="single" w:color="BFBFBF" w:sz="4"/>
+              <w:bottom w:val="single" w:color="BFBFBF" w:sz="4"/>
+              <w:right w:val="single" w:color="BFBFBF" w:sz="4"/>
+            </w:tcBorders>
+            <w:tcMar>
+              <w:top w:type="dxa" w:w="60"/>
+              <w:left w:type="dxa" w:w="100"/>
+              <w:bottom w:type="dxa" w:w="60"/>
+              <w:right w:type="dxa" w:w="100"/>
+            </w:tcMar>
+          </w:tcPr>
+          <w:p>
+            <w:r>
+              <w:rPr>
+                <w:rFonts w:ascii="Calibri" w:cs="Calibri" w:eastAsia="Calibri" w:hAnsi="Calibri"/>
+                <w:sz w:val="20"/>
+                <w:szCs w:val="20"/>
+              </w:rPr>
+              <w:t xml:space="preserve">Handled completely by SPS, which gets the BOLs straight from the warehouse</w:t>
+            </w:r>
+          </w:p>
+        </w:tc>
+        <w:tc>
+          <w:tcPr>
+            <w:tcW w:type="dxa" w:w="2300"/>
+            <w:tcBorders>
+              <w:top w:val="single" w:color="BFBFBF" w:sz="4"/>
+              <w:left w:val="single" w:color="BFBFBF" w:sz="4"/>
+              <w:bottom w:val="single" w:color="BFBFBF" w:sz="4"/>
+              <w:right w:val="single" w:color="BFBFBF" w:sz="4"/>
+            </w:tcBorders>
+            <w:tcMar>
+              <w:top w:type="dxa" w:w="60"/>
+              <w:left w:type="dxa" w:w="100"/>
+              <w:bottom w:type="dxa" w:w="60"/>
+              <w:right w:type="dxa" w:w="100"/>
+            </w:tcMar>
+          </w:tcPr>
+          <w:p>
+            <w:r>
+              <w:rPr>
+                <w:rFonts w:ascii="Calibri" w:cs="Calibri" w:eastAsia="Calibri" w:hAnsi="Calibri"/>
+                <w:sz w:val="20"/>
+                <w:szCs w:val="20"/>
+              </w:rPr>
+              <w:t xml:space="preserve">$191k recovered of $917k</w:t>
+            </w:r>
+          </w:p>
+        </w:tc>
+      </w:tr>
+      <w:tr>
+        <w:trPr>
+          <w:cantSplit/>
+        </w:trPr>
+        <w:tc>
+          <w:tcPr>
+            <w:tcW w:type="dxa" w:w="1900"/>
+            <w:tcBorders>
+              <w:top w:val="single" w:color="BFBFBF" w:sz="4"/>
+              <w:left w:val="single" w:color="BFBFBF" w:sz="4"/>
+              <w:bottom w:val="single" w:color="BFBFBF" w:sz="4"/>
+              <w:right w:val="single" w:color="BFBFBF" w:sz="4"/>
+            </w:tcBorders>
+            <w:tcMar>
+              <w:top w:type="dxa" w:w="60"/>
+              <w:left w:type="dxa" w:w="100"/>
+              <w:bottom w:type="dxa" w:w="60"/>
+              <w:right w:type="dxa" w:w="100"/>
+            </w:tcMar>
+          </w:tcPr>
+          <w:p>
+            <w:r>
+              <w:rPr>
+                <w:rFonts w:ascii="Calibri" w:cs="Calibri" w:eastAsia="Calibri" w:hAnsi="Calibri"/>
+                <w:sz w:val="20"/>
+                <w:szCs w:val="20"/>
+              </w:rPr>
+              <w:t xml:space="preserve">Vendor returns</w:t>
+            </w:r>
+          </w:p>
+        </w:tc>
+        <w:tc>
+          <w:tcPr>
+            <w:tcW w:type="dxa" w:w="5160"/>
+            <w:tcBorders>
+              <w:top w:val="single" w:color="BFBFBF" w:sz="4"/>
+              <w:left w:val="single" w:color="BFBFBF" w:sz="4"/>
+              <w:bottom w:val="single" w:color="BFBFBF" w:sz="4"/>
+              <w:right w:val="single" w:color="BFBFBF" w:sz="4"/>
+            </w:tcBorders>
+            <w:tcMar>
+              <w:top w:type="dxa" w:w="60"/>
+              <w:left w:type="dxa" w:w="100"/>
+              <w:bottom w:type="dxa" w:w="60"/>
+              <w:right w:type="dxa" w:w="100"/>
+            </w:tcMar>
+          </w:tcPr>
+          <w:p>
+            <w:r>
+              <w:rPr>
+                <w:rFonts w:ascii="Calibri" w:cs="Calibri" w:eastAsia="Calibri" w:hAnsi="Calibri"/>
+                <w:sz w:val="20"/>
+                <w:szCs w:val="20"/>
+              </w:rPr>
+              <w:t xml:space="preserve">Usually can't be recovered; Matt tried</w:t>
+            </w:r>
+          </w:p>
+        </w:tc>
+        <w:tc>
+          <w:tcPr>
+            <w:tcW w:type="dxa" w:w="2300"/>
+            <w:tcBorders>
+              <w:top w:val="single" w:color="BFBFBF" w:sz="4"/>
+              <w:left w:val="single" w:color="BFBFBF" w:sz="4"/>
+              <w:bottom w:val="single" w:color="BFBFBF" w:sz="4"/>
+              <w:right w:val="single" w:color="BFBFBF" w:sz="4"/>
+            </w:tcBorders>
+            <w:tcMar>
+              <w:top w:type="dxa" w:w="60"/>
+              <w:left w:type="dxa" w:w="100"/>
+              <w:bottom w:type="dxa" w:w="60"/>
+              <w:right w:type="dxa" w:w="100"/>
+            </w:tcMar>
+          </w:tcPr>
+          <w:p>
+            <w:r>
+              <w:rPr>
+                <w:rFonts w:ascii="Calibri" w:cs="Calibri" w:eastAsia="Calibri" w:hAnsi="Calibri"/>
+                <w:sz w:val="20"/>
+                <w:szCs w:val="20"/>
+              </w:rPr>
+              <w:t xml:space="preserve">$10k, none recovered</w:t>
+            </w:r>
+          </w:p>
+        </w:tc>
+      </w:tr>
+    </w:tbl>
+    <w:p>
+      <w:pPr>
+        <w:pStyle w:val="ListParagraph"/>
+        <w:numPr>
+          <w:ilvl w:val="0"/>
+          <w:numId w:val="2"/>
+        </w:numPr>
+        <w:spacing w:after="60"/>
+      </w:pPr>
+      <w:r>
+        <w:rPr>
+          <w:rFonts w:ascii="Calibri" w:cs="Calibri" w:eastAsia="Calibri" w:hAnsi="Calibri"/>
+          <w:b/>
+          <w:bCs/>
+        </w:rPr>
+        <w:t xml:space="preserve">Co-ops</w:t>
+      </w:r>
+      <w:r>
+        <w:rPr>
+          <w:rFonts w:ascii="Calibri" w:cs="Calibri" w:eastAsia="Calibri" w:hAnsi="Calibri"/>
+        </w:rPr>
+        <w:t xml:space="preserve"> are the cost of doing business with Amazon: about $150k a month.</w:t>
+      </w:r>
+    </w:p>
+    <w:p>
+      <w:pPr>
+        <w:pStyle w:val="ListParagraph"/>
+        <w:numPr>
+          <w:ilvl w:val="0"/>
+          <w:numId w:val="2"/>
+        </w:numPr>
+        <w:spacing w:after="60"/>
+      </w:pPr>
+      <w:r>
+        <w:rPr>
+          <w:rFonts w:ascii="Calibri" w:cs="Calibri" w:eastAsia="Calibri" w:hAnsi="Calibri"/>
+          <w:b/>
+          <w:bCs/>
+        </w:rPr>
+        <w:t xml:space="preserve">Advertising</w:t>
+      </w:r>
+      <w:r>
+        <w:rPr>
+          <w:rFonts w:ascii="Calibri" w:cs="Calibri" w:eastAsia="Calibri" w:hAnsi="Calibri"/>
+        </w:rPr>
+        <w:t xml:space="preserve"> is on top: about $75k a month. Paid by credit card until 8/1/26; now Amazon invoices it through Vendor Central, by check or wire only.</w:t>
+      </w:r>
+    </w:p>
+    <w:p>
+      <w:pPr>
+        <w:pStyle w:val="ListParagraph"/>
+        <w:numPr>
+          <w:ilvl w:val="0"/>
+          <w:numId w:val="2"/>
+        </w:numPr>
+        <w:spacing w:after="60"/>
+      </w:pPr>
+      <w:r>
+        <w:rPr>
+          <w:rFonts w:ascii="Calibri" w:cs="Calibri" w:eastAsia="Calibri" w:hAnsi="Calibri"/>
+          <w:b/>
+          <w:bCs/>
+        </w:rPr>
+        <w:t xml:space="preserve">His summary:</w:t>
+      </w:r>
+      <w:r>
+        <w:rPr>
+          <w:rFonts w:ascii="Calibri" w:cs="Calibri" w:eastAsia="Calibri" w:hAnsi="Calibri"/>
+        </w:rPr>
+        <w:t xml:space="preserve"> disputes what he can with a click, lets SPS dispute what it can, ignores the rest, then exports reports and summarises them 'a million different ways' for Isaac Grossman and the money team.</w:t>
+      </w:r>
+    </w:p>
+    <w:p>
+      <w:pPr>
+        <w:pStyle w:val="Heading2"/>
+        <w:keepNext/>
+        <w:spacing w:after="100" w:before="240"/>
+      </w:pPr>
+      <w:r>
+        <w:rPr>
+          <w:rFonts w:ascii="Calibri" w:cs="Calibri" w:eastAsia="Calibri" w:hAnsi="Calibri"/>
+        </w:rPr>
+        <w:t xml:space="preserve">Lowes, Home Depot and Walmart</w:t>
+      </w:r>
+    </w:p>
+    <w:p>
+      <w:pPr>
+        <w:pStyle w:val="ListParagraph"/>
+        <w:numPr>
+          <w:ilvl w:val="0"/>
+          <w:numId w:val="2"/>
+        </w:numPr>
+        <w:spacing w:after="60"/>
+      </w:pPr>
+      <w:r>
+        <w:rPr>
+          <w:rFonts w:ascii="Calibri" w:cs="Calibri" w:eastAsia="Calibri" w:hAnsi="Calibri"/>
+        </w:rPr>
+        <w:t xml:space="preserve">Lowes: deductions and open invoices, starting from New. Only shortages can be disputed. </w:t>
+      </w:r>
+      <w:r>
+        <w:rPr>
+          <w:rFonts w:ascii="Calibri" w:cs="Calibri" w:eastAsia="Calibri" w:hAnsi="Calibri"/>
+          <w:b/>
+          <w:bCs/>
+        </w:rPr>
+        <w:t xml:space="preserve">Freight violations aren't disputed at all:</w:t>
+      </w:r>
+      <w:r>
+        <w:rPr>
+          <w:rFonts w:ascii="Calibri" w:cs="Calibri" w:eastAsia="Calibri" w:hAnsi="Calibri"/>
+        </w:rPr>
+        <w:t xml:space="preserve"> he was never given the information or documentation. SPS could dispute them if we gave it the documentation.</w:t>
+      </w:r>
+    </w:p>
+    <w:p>
+      <w:pPr>
+        <w:pStyle w:val="ListParagraph"/>
+        <w:numPr>
+          <w:ilvl w:val="0"/>
+          <w:numId w:val="2"/>
+        </w:numPr>
+        <w:spacing w:after="60"/>
+      </w:pPr>
+      <w:r>
+        <w:rPr>
+          <w:rFonts w:ascii="Calibri" w:cs="Calibri" w:eastAsia="Calibri" w:hAnsi="Calibri"/>
+          <w:b/>
+          <w:bCs/>
+        </w:rPr>
+        <w:t xml:space="preserve">For each shortage:</w:t>
+      </w:r>
+      <w:r>
+        <w:rPr>
+          <w:rFonts w:ascii="Calibri" w:cs="Calibri" w:eastAsia="Calibri" w:hAnsi="Calibri"/>
+        </w:rPr>
+        <w:t xml:space="preserve"> PO → F&amp;O order → Warehouse → Shipment details → Pacejet shipment → tracking (each one, if several) → FedEx → if delivered, request proof of delivery with our account number (kept in his email) → download and name the POD PDF → open the dispute in SPS → paste a templated reversal request → upload the POD → submit.</w:t>
+      </w:r>
+    </w:p>
+    <w:p>
+      <w:pPr>
+        <w:pStyle w:val="ListParagraph"/>
+        <w:numPr>
+          <w:ilvl w:val="0"/>
+          <w:numId w:val="2"/>
+        </w:numPr>
+        <w:spacing w:after="60"/>
+      </w:pPr>
+      <w:r>
+        <w:rPr>
+          <w:rFonts w:ascii="Calibri" w:cs="Calibri" w:eastAsia="Calibri" w:hAnsi="Calibri"/>
+        </w:rPr>
+        <w:t xml:space="preserve">Home Depot and Walmart: the same.</w:t>
+      </w:r>
+    </w:p>
+    <w:p>
+      <w:pPr>
+        <w:pStyle w:val="ListParagraph"/>
+        <w:numPr>
+          <w:ilvl w:val="0"/>
+          <w:numId w:val="2"/>
+        </w:numPr>
+        <w:spacing w:after="60"/>
+      </w:pPr>
+      <w:r>
+        <w:rPr>
+          <w:rFonts w:ascii="Calibri" w:cs="Calibri" w:eastAsia="Calibri" w:hAnsi="Calibri"/>
+        </w:rPr>
+        <w:t xml:space="preserve">Besides that, he reports all the numbers in different ways.</w:t>
+      </w:r>
+    </w:p>
+    <w:p>
+      <w:pPr>
+        <w:pStyle w:val="ListParagraph"/>
+        <w:numPr>
+          <w:ilvl w:val="0"/>
+          <w:numId w:val="2"/>
+        </w:numPr>
+        <w:spacing w:after="60"/>
+      </w:pPr>
+      <w:r>
+        <w:rPr>
+          <w:rFonts w:ascii="Calibri" w:cs="Calibri" w:eastAsia="Calibri" w:hAnsi="Calibri"/>
+          <w:b/>
+          <w:bCs/>
+        </w:rPr>
+        <w:t xml:space="preserve">Next:</w:t>
+      </w:r>
+      <w:r>
+        <w:rPr>
+          <w:rFonts w:ascii="Calibri" w:cs="Calibri" w:eastAsia="Calibri" w:hAnsi="Calibri"/>
+        </w:rPr>
+        <w:t xml:space="preserve"> Tina set up our SPS Commerce access; the observer is going to her to understand our connection with them.</w:t>
+      </w:r>
+    </w:p>
+    <w:p>
+      <w:pPr>
+        <w:pStyle w:val="Heading1"/>
+        <w:keepNext/>
+        <w:spacing w:after="160" w:before="360"/>
+      </w:pPr>
+      <w:r>
+        <w:rPr>
+          <w:rFonts w:ascii="Calibri" w:cs="Calibri" w:eastAsia="Calibri" w:hAnsi="Calibri"/>
+        </w:rPr>
+        <w:t xml:space="preserve">Part 15: Observer's Own Work (not part of the process study)</w:t>
       </w:r>
     </w:p>
     <w:p>
@@ -22297,7 +23218,7 @@
         <w:sz w:val="18"/>
         <w:szCs w:val="18"/>
       </w:rPr>
-      <w:t xml:space="preserve">Shadowing Report v2, Oct 14 to 23, 2026 | Page </w:t>
+      <w:t xml:space="preserve">Shadowing Report v2, Oct 14 to 27, 2026 | Page </w:t>
     </w:r>
     <w:r>
       <w:rPr>

</xml_diff>

<commit_message>
Walmart shortages: many carriers, needs POD and BOL from each
Co-Authored-By: Devin AI <158243242+devin-ai-integration[bot]@users.noreply.github.com>
</commit_message>
<xml_diff>
--- a/Shadowing_Report_2026-10-22_v2.docx
+++ b/Shadowing_Report_2026-10-22_v2.docx
@@ -23054,6 +23054,30 @@
           <w:rFonts w:ascii="Calibri" w:cs="Calibri" w:eastAsia="Calibri" w:hAnsi="Calibri"/>
         </w:rPr>
         <w:t xml:space="preserve">Home Depot and Walmart: the same.</w:t>
+      </w:r>
+    </w:p>
+    <w:p>
+      <w:pPr>
+        <w:pStyle w:val="ListParagraph"/>
+        <w:numPr>
+          <w:ilvl w:val="0"/>
+          <w:numId w:val="2"/>
+        </w:numPr>
+        <w:spacing w:after="60"/>
+      </w:pPr>
+      <w:r>
+        <w:rPr>
+          <w:rFonts w:ascii="Calibri" w:cs="Calibri" w:eastAsia="Calibri" w:hAnsi="Calibri"/>
+          <w:b/>
+          <w:bCs/>
+        </w:rPr>
+        <w:t xml:space="preserve">Walmart is harder</w:t>
+      </w:r>
+      <w:r>
+        <w:rPr>
+          <w:rFonts w:ascii="Calibri" w:cs="Calibri" w:eastAsia="Calibri" w:hAnsi="Calibri"/>
+        </w:rPr>
+        <w:t xml:space="preserve"> (his addition, later): Walmart uses many carriers, so he has to get both the POD and the BOL from each carrier, not just FedEx.</w:t>
       </w:r>
     </w:p>
     <w:p>

</xml_diff>

<commit_message>
Tina: backstory on why we use SPS Commerce
Co-Authored-By: Devin AI <158243242+devin-ai-integration[bot]@users.noreply.github.com>
</commit_message>
<xml_diff>
--- a/Shadowing_Report_2026-10-22_v2.docx
+++ b/Shadowing_Report_2026-10-22_v2.docx
@@ -7346,7 +7346,7 @@
                 <w:sz w:val="20"/>
                 <w:szCs w:val="20"/>
               </w:rPr>
-              <w:t xml:space="preserve">Baruch Salamander: walkthrough of the deduction workflow (SPS Commerce)</w:t>
+              <w:t xml:space="preserve">Baruch Salamander: walkthrough of the deduction workflow (SPS Commerce); Tina: backstory on SPS</w:t>
             </w:r>
           </w:p>
         </w:tc>
@@ -23118,6 +23118,139 @@
           <w:rFonts w:ascii="Calibri" w:cs="Calibri" w:eastAsia="Calibri" w:hAnsi="Calibri"/>
         </w:rPr>
         <w:t xml:space="preserve"> Tina set up our SPS Commerce access; the observer is going to her to understand our connection with them.</w:t>
+      </w:r>
+    </w:p>
+    <w:p>
+      <w:pPr>
+        <w:pStyle w:val="Heading2"/>
+        <w:keepNext/>
+        <w:spacing w:after="100" w:before="240"/>
+      </w:pPr>
+      <w:r>
+        <w:rPr>
+          <w:rFonts w:ascii="Calibri" w:cs="Calibri" w:eastAsia="Calibri" w:hAnsi="Calibri"/>
+        </w:rPr>
+        <w:t xml:space="preserve">Tina: Why We Use SPS Commerce (backstory, Oct 27)</w:t>
+      </w:r>
+    </w:p>
+    <w:p>
+      <w:pPr>
+        <w:pStyle w:val="ListParagraph"/>
+        <w:numPr>
+          <w:ilvl w:val="0"/>
+          <w:numId w:val="2"/>
+        </w:numPr>
+        <w:spacing w:after="60"/>
+      </w:pPr>
+      <w:r>
+        <w:rPr>
+          <w:rFonts w:ascii="Calibri" w:cs="Calibri" w:eastAsia="Calibri" w:hAnsi="Calibri"/>
+          <w:b/>
+          <w:bCs/>
+        </w:rPr>
+        <w:t xml:space="preserve">How we got here:</w:t>
+      </w:r>
+      <w:r>
+        <w:rPr>
+          <w:rFonts w:ascii="Calibri" w:cs="Calibri" w:eastAsia="Calibri" w:hAnsi="Calibri"/>
+        </w:rPr>
+        <w:t xml:space="preserve"> Simon, CFO for a while, and his assistant Josh were given the main goal of cleaning up Amazon. They quickly found that the first company handling our chargebacks was supposed to handle everything and didn't, so we weren't getting what we paid for. Tina was the go-between because she knew the area. We moved to SupplyPike, which SPS has since bought.</w:t>
+      </w:r>
+    </w:p>
+    <w:p>
+      <w:pPr>
+        <w:pStyle w:val="ListParagraph"/>
+        <w:numPr>
+          <w:ilvl w:val="0"/>
+          <w:numId w:val="2"/>
+        </w:numPr>
+        <w:spacing w:after="60"/>
+      </w:pPr>
+      <w:r>
+        <w:rPr>
+          <w:rFonts w:ascii="Calibri" w:cs="Calibri" w:eastAsia="Calibri" w:hAnsi="Calibri"/>
+          <w:b/>
+          <w:bCs/>
+        </w:rPr>
+        <w:t xml:space="preserve">The market:</w:t>
+      </w:r>
+      <w:r>
+        <w:rPr>
+          <w:rFonts w:ascii="Calibri" w:cs="Calibri" w:eastAsia="Calibri" w:hAnsi="Calibri"/>
+        </w:rPr>
+        <w:t xml:space="preserve"> there were four major chargeback companies; they bought each other up and now there are two, working with the main retailers.</w:t>
+      </w:r>
+    </w:p>
+    <w:p>
+      <w:pPr>
+        <w:pStyle w:val="ListParagraph"/>
+        <w:numPr>
+          <w:ilvl w:val="0"/>
+          <w:numId w:val="2"/>
+        </w:numPr>
+        <w:spacing w:after="60"/>
+      </w:pPr>
+      <w:r>
+        <w:rPr>
+          <w:rFonts w:ascii="Calibri" w:cs="Calibri" w:eastAsia="Calibri" w:hAnsi="Calibri"/>
+          <w:b/>
+          <w:bCs/>
+        </w:rPr>
+        <w:t xml:space="preserve">Why not dispute in Vendor Central and the portals ourselves:</w:t>
+      </w:r>
+      <w:r>
+        <w:rPr>
+          <w:rFonts w:ascii="Calibri" w:cs="Calibri" w:eastAsia="Calibri" w:hAnsi="Calibri"/>
+        </w:rPr>
+        <w:t xml:space="preserve"> each retailer's portal is a tangle with its own terminology. SPS does the first review and funnels everything into one clean view.</w:t>
+      </w:r>
+    </w:p>
+    <w:p>
+      <w:pPr>
+        <w:pStyle w:val="ListParagraph"/>
+        <w:numPr>
+          <w:ilvl w:val="0"/>
+          <w:numId w:val="2"/>
+        </w:numPr>
+        <w:spacing w:after="60"/>
+      </w:pPr>
+      <w:r>
+        <w:rPr>
+          <w:rFonts w:ascii="Calibri" w:cs="Calibri" w:eastAsia="Calibri" w:hAnsi="Calibri"/>
+          <w:b/>
+          <w:bCs/>
+        </w:rPr>
+        <w:t xml:space="preserve">Findings:</w:t>
+      </w:r>
+      <w:r>
+        <w:rPr>
+          <w:rFonts w:ascii="Calibri" w:cs="Calibri" w:eastAsia="Calibri" w:hAnsi="Calibri"/>
+        </w:rPr>
+        <w:t xml:space="preserve"> SPS also investigates. We knew Amazon was taking too much in co-ops but didn't know how to check; SPS did, and still does.</w:t>
+      </w:r>
+    </w:p>
+    <w:p>
+      <w:pPr>
+        <w:pStyle w:val="ListParagraph"/>
+        <w:numPr>
+          <w:ilvl w:val="0"/>
+          <w:numId w:val="2"/>
+        </w:numPr>
+        <w:spacing w:after="60"/>
+      </w:pPr>
+      <w:r>
+        <w:rPr>
+          <w:rFonts w:ascii="Calibri" w:cs="Calibri" w:eastAsia="Calibri" w:hAnsi="Calibri"/>
+          <w:i/>
+          <w:iCs/>
+        </w:rPr>
+        <w:t xml:space="preserve">Not covered yet:</w:t>
+      </w:r>
+      <w:r>
+        <w:rPr>
+          <w:rFonts w:ascii="Calibri" w:cs="Calibri" w:eastAsia="Calibri" w:hAnsi="Calibri"/>
+        </w:rPr>
+        <w:t xml:space="preserve"> the technical connection (what data SPS gets from us and how), what we pay, and who owns the account.</w:t>
       </w:r>
     </w:p>
     <w:p>

</xml_diff>

<commit_message>
Follow-up answers: no backup, SPS results only in reports, SPS marks co-op validity, $146k was co-ops last year
Co-Authored-By: Devin AI <158243242+devin-ai-integration[bot]@users.noreply.github.com>
</commit_message>
<xml_diff>
--- a/Shadowing_Report_2026-10-22_v2.docx
+++ b/Shadowing_Report_2026-10-22_v2.docx
@@ -4003,7 +4003,7 @@
                 <w:sz w:val="20"/>
                 <w:szCs w:val="20"/>
               </w:rPr>
-              <w:t xml:space="preserve">Day 5: daily recovery emails to six people with MTD and YTD totals; SUMIF aging by salesman built by hand; about $146k recovered this year. Day 8: he exports the SPS reports and summarises them many ways for Isaac Grossman and the money team</w:t>
+              <w:t xml:space="preserve">Day 5: daily recovery emails to six people with MTD and YTD totals; SUMIF aging by salesman built by hand; about $146k in co-ops recovered last year. Day 8: he exports the SPS reports and summarises them many ways for Isaac Grossman and the money team</w:t>
             </w:r>
           </w:p>
         </w:tc>
@@ -18269,7 +18269,7 @@
           <w:i/>
           <w:iCs/>
         </w:rPr>
-        <w:t xml:space="preserve">(On Day 8 he gave $146k as co-ops recovered last year; one of the two labels is probably wrong.)</w:t>
+        <w:t xml:space="preserve">(Correction: it was co-ops recovered last year; "this year so far" was a mistake in the observer's notes.)</w:t>
       </w:r>
     </w:p>
     <w:p>
@@ -22696,7 +22696,7 @@
                 <w:sz w:val="20"/>
                 <w:szCs w:val="20"/>
               </w:rPr>
-              <w:t xml:space="preserve">Selects all that SPS labels invalid and disputes them. He doesn't know what makes one valid or invalid. Amazon put co-op disputes on hold to study them: none disputable before April 2027. Two-year lookback; last year's are done</w:t>
+              <w:t xml:space="preserve">Selects all that SPS labels invalid and disputes them. SPS marks validity itself as part of its cleanup; he doesn't need to know why. Amazon put co-op disputes on hold to study them: none disputable before April 2027. Two-year lookback; last year's are done</w:t>
             </w:r>
           </w:p>
         </w:tc>
@@ -23244,13 +23244,37 @@
           <w:i/>
           <w:iCs/>
         </w:rPr>
-        <w:t xml:space="preserve">Not covered yet:</w:t>
-      </w:r>
-      <w:r>
-        <w:rPr>
-          <w:rFonts w:ascii="Calibri" w:cs="Calibri" w:eastAsia="Calibri" w:hAnsi="Calibri"/>
-        </w:rPr>
-        <w:t xml:space="preserve"> the technical connection (what data SPS gets from us and how), what we pay, and who owns the account.</w:t>
+        <w:t xml:space="preserve">Not Tina's to answer:</w:t>
+      </w:r>
+      <w:r>
+        <w:rPr>
+          <w:rFonts w:ascii="Calibri" w:cs="Calibri" w:eastAsia="Calibri" w:hAnsi="Calibri"/>
+        </w:rPr>
+        <w:t xml:space="preserve"> the technical connection (what data SPS gets from us and how), what we pay, and who owns the account. Who to ask is still open.</w:t>
+      </w:r>
+    </w:p>
+    <w:p>
+      <w:pPr>
+        <w:pStyle w:val="ListParagraph"/>
+        <w:numPr>
+          <w:ilvl w:val="0"/>
+          <w:numId w:val="2"/>
+        </w:numPr>
+        <w:spacing w:after="60"/>
+      </w:pPr>
+      <w:r>
+        <w:rPr>
+          <w:rFonts w:ascii="Calibri" w:cs="Calibri" w:eastAsia="Calibri" w:hAnsi="Calibri"/>
+          <w:b/>
+          <w:bCs/>
+        </w:rPr>
+        <w:t xml:space="preserve">Follow-up answers:</w:t>
+      </w:r>
+      <w:r>
+        <w:rPr>
+          <w:rFonts w:ascii="Calibri" w:cs="Calibri" w:eastAsia="Calibri" w:hAnsi="Calibri"/>
+        </w:rPr>
+        <w:t xml:space="preserve"> nobody covers deductions when Charmaine or Baruch Salamander is out. SPS results go only into Baruch Salamander's reports, not to F&amp;O or Suzanne. Still to ask Tina: does SPS cover, or could it cover, Charmaine's customers like Wayfair?</w:t>
       </w:r>
     </w:p>
     <w:p>

</xml_diff>

<commit_message>
Lowes deductions are all in SPS (Baruch Salamander), not Charmaine
Co-Authored-By: Devin AI <158243242+devin-ai-integration[bot]@users.noreply.github.com>
</commit_message>
<xml_diff>
--- a/Shadowing_Report_2026-10-22_v2.docx
+++ b/Shadowing_Report_2026-10-22_v2.docx
@@ -14866,7 +14866,21 @@
         <w:rPr>
           <w:rFonts w:ascii="Calibri" w:cs="Calibri" w:eastAsia="Calibri" w:hAnsi="Calibri"/>
         </w:rPr>
-        <w:t xml:space="preserve"> Wayfair (portal, checked every day), Lowes, OJCommerce and a few others. VirVentures, UnbeatableSales and KartIt are handled entirely by email.</w:t>
+        <w:t xml:space="preserve"> Wayfair (portal, checked every day), OJCommerce and a few others. </w:t>
+      </w:r>
+      <w:r>
+        <w:rPr>
+          <w:rFonts w:ascii="Calibri" w:cs="Calibri" w:eastAsia="Calibri" w:hAnsi="Calibri"/>
+          <w:i/>
+          <w:iCs/>
+        </w:rPr>
+        <w:t xml:space="preserve">(The observer first listed Lowes here too; corrected Oct 27: Lowes is in SPS for all connections, so its deductions are Baruch Salamander's. Her Lowes work is the manual 810 invoicing from Day 1.)</w:t>
+      </w:r>
+      <w:r>
+        <w:rPr>
+          <w:rFonts w:ascii="Calibri" w:cs="Calibri" w:eastAsia="Calibri" w:hAnsi="Calibri"/>
+        </w:rPr>
+        <w:t xml:space="preserve"> VirVentures, UnbeatableSales and KartIt are handled entirely by email.</w:t>
       </w:r>
     </w:p>
     <w:p>

</xml_diff>

<commit_message>
Note: SPS Commerce is required for now; bots build around it
Co-Authored-By: Devin AI <158243242+devin-ai-integration[bot]@users.noreply.github.com>
</commit_message>
<xml_diff>
--- a/Shadowing_Report_2026-10-22_v2.docx
+++ b/Shadowing_Report_2026-10-22_v2.docx
@@ -23289,6 +23289,30 @@
           <w:rFonts w:ascii="Calibri" w:cs="Calibri" w:eastAsia="Calibri" w:hAnsi="Calibri"/>
         </w:rPr>
         <w:t xml:space="preserve"> nobody covers deductions when Charmaine or Baruch Salamander is out. SPS results go only into Baruch Salamander's reports, not to F&amp;O or Suzanne. Still to ask Tina: does SPS cover, or could it cover, Charmaine's customers like Wayfair?</w:t>
+      </w:r>
+    </w:p>
+    <w:p>
+      <w:pPr>
+        <w:pStyle w:val="ListParagraph"/>
+        <w:numPr>
+          <w:ilvl w:val="0"/>
+          <w:numId w:val="2"/>
+        </w:numPr>
+        <w:spacing w:after="60"/>
+      </w:pPr>
+      <w:r>
+        <w:rPr>
+          <w:rFonts w:ascii="Calibri" w:cs="Calibri" w:eastAsia="Calibri" w:hAnsi="Calibri"/>
+          <w:b/>
+          <w:bCs/>
+        </w:rPr>
+        <w:t xml:space="preserve">Observer's view, Oct 27: SPS is required for now.</w:t>
+      </w:r>
+      <w:r>
+        <w:rPr>
+          <w:rFonts w:ascii="Calibri" w:cs="Calibri" w:eastAsia="Calibri" w:hAnsi="Calibri"/>
+        </w:rPr>
+        <w:t xml:space="preserve"> In theory a bot could do SPS's whole job, since cleaning messy portal data is the easy part. But SPS already has the retailer data feeds and the warehouse BOLs, knows what each retailer will accept, finds things like the co-op overcharge by comparing across its clients, and follows each dispute until it closes. On Amazon alone it recovered about $464k last year, and we don't yet know what it costs. So the bots work around SPS: the proof-of-delivery chain, freight violations, Charmaine's DS customers and the SPS scorecard. Whether to replace SPS can be decided once we know its fee.</w:t>
       </w:r>
     </w:p>
     <w:p>

</xml_diff>

<commit_message>
Tina: SPS charges per connection; customer rules are contractual (return-allowance spreadsheet)
Co-Authored-By: Devin AI <158243242+devin-ai-integration[bot]@users.noreply.github.com>
</commit_message>
<xml_diff>
--- a/Shadowing_Report_2026-10-22_v2.docx
+++ b/Shadowing_Report_2026-10-22_v2.docx
@@ -14976,7 +14976,15 @@
         <w:rPr>
           <w:rFonts w:ascii="Calibri" w:cs="Calibri" w:eastAsia="Calibri" w:hAnsi="Calibri"/>
         </w:rPr>
-        <w:t xml:space="preserve"> set per customer by Tina and Avi. Charmaine has them in her head and couldn't repeat them. Sometimes she checks with Tina before responding.</w:t>
+        <w:t xml:space="preserve"> set per customer by Tina and Avi. Charmaine has them in her head and couldn't repeat them. Sometimes she checks with Tina before responding. </w:t>
+      </w:r>
+      <w:r>
+        <w:rPr>
+          <w:rFonts w:ascii="Calibri" w:cs="Calibri" w:eastAsia="Calibri" w:hAnsi="Calibri"/>
+          <w:i/>
+          <w:iCs/>
+        </w:rPr>
+        <w:t xml:space="preserve">(Later, from Tina: the rules are contractual; see her return-allowance spreadsheet in Part 14.)</w:t>
       </w:r>
     </w:p>
     <w:p>
@@ -23288,7 +23296,55 @@
         <w:rPr>
           <w:rFonts w:ascii="Calibri" w:cs="Calibri" w:eastAsia="Calibri" w:hAnsi="Calibri"/>
         </w:rPr>
-        <w:t xml:space="preserve"> nobody covers deductions when Charmaine or Baruch Salamander is out. SPS results go only into Baruch Salamander's reports, not to F&amp;O or Suzanne. Still to ask Tina: does SPS cover, or could it cover, Charmaine's customers like Wayfair?</w:t>
+        <w:t xml:space="preserve"> nobody covers deductions when Charmaine or Baruch Salamander is out. SPS results go only into Baruch Salamander's reports, not to F&amp;O or Suzanne.</w:t>
+      </w:r>
+    </w:p>
+    <w:p>
+      <w:pPr>
+        <w:pStyle w:val="ListParagraph"/>
+        <w:numPr>
+          <w:ilvl w:val="0"/>
+          <w:numId w:val="2"/>
+        </w:numPr>
+        <w:spacing w:after="60"/>
+      </w:pPr>
+      <w:r>
+        <w:rPr>
+          <w:rFonts w:ascii="Calibri" w:cs="Calibri" w:eastAsia="Calibri" w:hAnsi="Calibri"/>
+          <w:b/>
+          <w:bCs/>
+        </w:rPr>
+        <w:t xml:space="preserve">SPS for Charmaine's customers (Tina):</w:t>
+      </w:r>
+      <w:r>
+        <w:rPr>
+          <w:rFonts w:ascii="Calibri" w:cs="Calibri" w:eastAsia="Calibri" w:hAnsi="Calibri"/>
+        </w:rPr>
+        <w:t xml:space="preserve"> she isn't sure Wayfair and the others could be connected, but for most it isn't worth it, because SPS charges for each connection.</w:t>
+      </w:r>
+    </w:p>
+    <w:p>
+      <w:pPr>
+        <w:pStyle w:val="ListParagraph"/>
+        <w:numPr>
+          <w:ilvl w:val="0"/>
+          <w:numId w:val="2"/>
+        </w:numPr>
+        <w:spacing w:after="60"/>
+      </w:pPr>
+      <w:r>
+        <w:rPr>
+          <w:rFonts w:ascii="Calibri" w:cs="Calibri" w:eastAsia="Calibri" w:hAnsi="Calibri"/>
+          <w:b/>
+          <w:bCs/>
+        </w:rPr>
+        <w:t xml:space="preserve">Where the rules come from (Tina):</w:t>
+      </w:r>
+      <w:r>
+        <w:rPr>
+          <w:rFonts w:ascii="Calibri" w:cs="Calibri" w:eastAsia="Calibri" w:hAnsi="Calibri"/>
+        </w:rPr>
+        <w:t xml:space="preserve"> they are contractual. Tina made a return-allowance spreadsheet, covering returns and allowances per contract, for the customers whose contracts she had; customers without a contract she could see aren't on it. She gave it to Peleg. None of it is in F&amp;O; Peleg was supposed to add it, so it may be there by now.</w:t>
       </w:r>
     </w:p>
     <w:p>

</xml_diff>

<commit_message>
Report: deductions as opportunity 6, Bot I spec, Questions for Peleg; Bot H deductions routing; next to shadow
Co-Authored-By: Devin AI <158243242+devin-ai-integration[bot]@users.noreply.github.com>
</commit_message>
<xml_diff>
--- a/Shadowing_Report_2026-10-22_v2.docx
+++ b/Shadowing_Report_2026-10-22_v2.docx
@@ -74,7 +74,7 @@
         <w:rPr>
           <w:rFonts w:ascii="Calibri" w:cs="Calibri" w:eastAsia="Calibri" w:hAnsi="Calibri"/>
         </w:rPr>
-        <w:t xml:space="preserve">I came in with a clean view, so this report records what I saw people actually doing, which is not always what their title says. The first pages are the decisions: what to act on now, the top five opportunities, the F&amp;O settings fixes, and a spec for each bot. The appendix has the detailed notes from every session.</w:t>
+        <w:t xml:space="preserve">I came in with a clean view, so this report records what I saw people actually doing, which is not always what their title says. The first pages are the decisions: what to act on now, the top six opportunities, the F&amp;O settings fixes, and a spec for each bot. The appendix has the detailed notes from every session.</w:t>
       </w:r>
     </w:p>
     <w:p>
@@ -126,7 +126,21 @@
         <w:rPr>
           <w:rFonts w:ascii="Calibri" w:cs="Calibri" w:eastAsia="Calibri" w:hAnsi="Calibri"/>
         </w:rPr>
-        <w:t xml:space="preserve"> is the biggest money risk, but only when cash flow is tight. About eight problems are </w:t>
+        <w:t xml:space="preserve"> is the biggest money risk, but only when cash flow is tight. </w:t>
+      </w:r>
+      <w:r>
+        <w:rPr>
+          <w:rFonts w:ascii="Calibri" w:cs="Calibri" w:eastAsia="Calibri" w:hAnsi="Calibri"/>
+          <w:b/>
+          <w:bCs/>
+        </w:rPr>
+        <w:t xml:space="preserve">Deductions</w:t>
+      </w:r>
+      <w:r>
+        <w:rPr>
+          <w:rFonts w:ascii="Calibri" w:cs="Calibri" w:eastAsia="Calibri" w:hAnsi="Calibri"/>
+        </w:rPr>
+        <w:t xml:space="preserve"> are mostly handled by SPS Commerce, which stays; the bot covers the hand work around it. About eight problems are </w:t>
       </w:r>
       <w:r>
         <w:rPr>
@@ -391,7 +405,7 @@
         <w:rPr>
           <w:rFonts w:ascii="Calibri" w:cs="Calibri" w:eastAsia="Calibri" w:hAnsi="Calibri"/>
         </w:rPr>
-        <w:t xml:space="preserve">Top 5 Opportunities</w:t>
+        <w:t xml:space="preserve">Top 6 Opportunities</w:t>
       </w:r>
     </w:p>
     <w:p>
@@ -1279,6 +1293,146 @@
           </w:p>
         </w:tc>
       </w:tr>
+      <w:tr>
+        <w:trPr>
+          <w:cantSplit/>
+        </w:trPr>
+        <w:tc>
+          <w:tcPr>
+            <w:tcW w:type="dxa" w:w="400"/>
+            <w:tcBorders>
+              <w:top w:val="single" w:color="BFBFBF" w:sz="4"/>
+              <w:left w:val="single" w:color="BFBFBF" w:sz="4"/>
+              <w:bottom w:val="single" w:color="BFBFBF" w:sz="4"/>
+              <w:right w:val="single" w:color="BFBFBF" w:sz="4"/>
+            </w:tcBorders>
+            <w:tcMar>
+              <w:top w:type="dxa" w:w="60"/>
+              <w:left w:type="dxa" w:w="100"/>
+              <w:bottom w:type="dxa" w:w="60"/>
+              <w:right w:type="dxa" w:w="100"/>
+            </w:tcMar>
+          </w:tcPr>
+          <w:p>
+            <w:r>
+              <w:rPr>
+                <w:rFonts w:ascii="Calibri" w:cs="Calibri" w:eastAsia="Calibri" w:hAnsi="Calibri"/>
+                <w:sz w:val="20"/>
+                <w:szCs w:val="20"/>
+              </w:rPr>
+              <w:t xml:space="preserve">6</w:t>
+            </w:r>
+          </w:p>
+        </w:tc>
+        <w:tc>
+          <w:tcPr>
+            <w:tcW w:type="dxa" w:w="2000"/>
+            <w:tcBorders>
+              <w:top w:val="single" w:color="BFBFBF" w:sz="4"/>
+              <w:left w:val="single" w:color="BFBFBF" w:sz="4"/>
+              <w:bottom w:val="single" w:color="BFBFBF" w:sz="4"/>
+              <w:right w:val="single" w:color="BFBFBF" w:sz="4"/>
+            </w:tcBorders>
+            <w:tcMar>
+              <w:top w:type="dxa" w:w="60"/>
+              <w:left w:type="dxa" w:w="100"/>
+              <w:bottom w:type="dxa" w:w="60"/>
+              <w:right w:type="dxa" w:w="100"/>
+            </w:tcMar>
+          </w:tcPr>
+          <w:p>
+            <w:r>
+              <w:rPr>
+                <w:rFonts w:ascii="Calibri" w:cs="Calibri" w:eastAsia="Calibri" w:hAnsi="Calibri"/>
+                <w:sz w:val="20"/>
+                <w:szCs w:val="20"/>
+              </w:rPr>
+              <w:t xml:space="preserve">Deductions and disputes</w:t>
+            </w:r>
+          </w:p>
+        </w:tc>
+        <w:tc>
+          <w:tcPr>
+            <w:tcW w:type="dxa" w:w="3760"/>
+            <w:tcBorders>
+              <w:top w:val="single" w:color="BFBFBF" w:sz="4"/>
+              <w:left w:val="single" w:color="BFBFBF" w:sz="4"/>
+              <w:bottom w:val="single" w:color="BFBFBF" w:sz="4"/>
+              <w:right w:val="single" w:color="BFBFBF" w:sz="4"/>
+            </w:tcBorders>
+            <w:tcMar>
+              <w:top w:type="dxa" w:w="60"/>
+              <w:left w:type="dxa" w:w="100"/>
+              <w:bottom w:type="dxa" w:w="60"/>
+              <w:right w:type="dxa" w:w="100"/>
+            </w:tcMar>
+          </w:tcPr>
+          <w:p>
+            <w:r>
+              <w:rPr>
+                <w:rFonts w:ascii="Calibri" w:cs="Calibri" w:eastAsia="Calibri" w:hAnsi="Calibri"/>
+                <w:sz w:val="20"/>
+                <w:szCs w:val="20"/>
+              </w:rPr>
+              <w:t xml:space="preserve">SPS Commerce recovered about $464k on Amazon last year and stays (required for now). The hand work is around it: for each Lowes, Home Depot and Walmart shortage, Baruch Salamander goes F&amp;O → Pacejet → FedEx for the proof of delivery and uploads it to SPS (Walmart needs a POD and a BOL from whichever of many carriers delivered). Freight violations are never disputed. Charmaine had 70 DS deductions in Oct 2 to 15, 11 needing a 5 to 15 minute check, with her inbox as the only record and the contractual rules in her head. Nobody covers when either is out.</w:t>
+            </w:r>
+          </w:p>
+        </w:tc>
+        <w:tc>
+          <w:tcPr>
+            <w:tcW w:type="dxa" w:w="1500"/>
+            <w:tcBorders>
+              <w:top w:val="single" w:color="BFBFBF" w:sz="4"/>
+              <w:left w:val="single" w:color="BFBFBF" w:sz="4"/>
+              <w:bottom w:val="single" w:color="BFBFBF" w:sz="4"/>
+              <w:right w:val="single" w:color="BFBFBF" w:sz="4"/>
+            </w:tcBorders>
+            <w:tcMar>
+              <w:top w:type="dxa" w:w="60"/>
+              <w:left w:type="dxa" w:w="100"/>
+              <w:bottom w:type="dxa" w:w="60"/>
+              <w:right w:type="dxa" w:w="100"/>
+            </w:tcMar>
+          </w:tcPr>
+          <w:p>
+            <w:r>
+              <w:rPr>
+                <w:rFonts w:ascii="Calibri" w:cs="Calibri" w:eastAsia="Calibri" w:hAnsi="Calibri"/>
+                <w:sz w:val="20"/>
+                <w:szCs w:val="20"/>
+              </w:rPr>
+              <w:t xml:space="preserve">Bot around SPS; rules table first</w:t>
+            </w:r>
+          </w:p>
+        </w:tc>
+        <w:tc>
+          <w:tcPr>
+            <w:tcW w:type="dxa" w:w="1700"/>
+            <w:tcBorders>
+              <w:top w:val="single" w:color="BFBFBF" w:sz="4"/>
+              <w:left w:val="single" w:color="BFBFBF" w:sz="4"/>
+              <w:bottom w:val="single" w:color="BFBFBF" w:sz="4"/>
+              <w:right w:val="single" w:color="BFBFBF" w:sz="4"/>
+            </w:tcBorders>
+            <w:tcMar>
+              <w:top w:type="dxa" w:w="60"/>
+              <w:left w:type="dxa" w:w="100"/>
+              <w:bottom w:type="dxa" w:w="60"/>
+              <w:right w:type="dxa" w:w="100"/>
+            </w:tcMar>
+          </w:tcPr>
+          <w:p>
+            <w:r>
+              <w:rPr>
+                <w:rFonts w:ascii="Calibri" w:cs="Calibri" w:eastAsia="Calibri" w:hAnsi="Calibri"/>
+                <w:sz w:val="20"/>
+                <w:szCs w:val="20"/>
+              </w:rPr>
+              <w:t xml:space="preserve">Peleg with Baruch Salamander and Charmaine</w:t>
+            </w:r>
+          </w:p>
+        </w:tc>
+      </w:tr>
     </w:tbl>
     <w:p>
       <w:pPr>
@@ -4919,7 +5073,7 @@
                 <w:sz w:val="20"/>
                 <w:szCs w:val="20"/>
               </w:rPr>
-              <w:t xml:space="preserve">Sorts each email and routes or answers it: customers who bought through Amazon, Kohls or Wayfair get the standard "contact the retailer" reply; order and sample requests go to Justin; replacement-part requests go to Jhony; packaging and shipping questions go to the warehouse (Brandon, Keith); deductions go to Baruch Salamander; retailer cancellations are checked in F&amp;O for whether the order is already invoiced and sent to the warehouse in time. Everything else stays with Charmaine, with the order, invoice and tracking pulled up next to it.</w:t>
+              <w:t xml:space="preserve">Sorts each email and routes or answers it: customers who bought through Amazon, Kohls or Wayfair get the standard "contact the retailer" reply; order and sample requests go to Justin; replacement-part requests go to Jhony; packaging and shipping questions go to the warehouse (Brandon, Keith); deductions go to Charmaine for DS customers and to Baruch Salamander for the SPS customers (Amazon, Lowes, Home Depot, Walmart); retailer cancellations are checked in F&amp;O for whether the order is already invoiced and sent to the warehouse in time. Everything else stays with Charmaine, with the order, invoice and tracking pulled up next to it.</w:t>
             </w:r>
           </w:p>
         </w:tc>
@@ -5097,6 +5251,513 @@
                 <w:szCs w:val="20"/>
               </w:rPr>
               <w:t xml:space="preserve">Customer service emails a day, and how many are forwarded</w:t>
+            </w:r>
+          </w:p>
+        </w:tc>
+      </w:tr>
+    </w:tbl>
+    <w:p>
+      <w:pPr>
+        <w:spacing w:after="120"/>
+      </w:pPr>
+    </w:p>
+    <w:p>
+      <w:pPr>
+        <w:pStyle w:val="Heading3"/>
+        <w:keepNext/>
+        <w:spacing w:after="80" w:before="180"/>
+      </w:pPr>
+      <w:r>
+        <w:rPr>
+          <w:rFonts w:ascii="Calibri" w:cs="Calibri" w:eastAsia="Calibri" w:hAnsi="Calibri"/>
+        </w:rPr>
+        <w:t xml:space="preserve">I. Deductions assistant (opportunity 6)</w:t>
+      </w:r>
+    </w:p>
+    <w:tbl>
+      <w:tblPr>
+        <w:tblW w:type="dxa" w:w="9360"/>
+        <w:tblBorders>
+          <w:top w:val="single" w:color="auto" w:sz="4"/>
+          <w:left w:val="single" w:color="auto" w:sz="4"/>
+          <w:bottom w:val="single" w:color="auto" w:sz="4"/>
+          <w:right w:val="single" w:color="auto" w:sz="4"/>
+          <w:insideH w:val="single" w:color="auto" w:sz="4"/>
+          <w:insideV w:val="single" w:color="auto" w:sz="4"/>
+        </w:tblBorders>
+      </w:tblPr>
+      <w:tblGrid>
+        <w:gridCol w:w="1900"/>
+        <w:gridCol w:w="7460"/>
+      </w:tblGrid>
+      <w:tr>
+        <w:trPr>
+          <w:tblHeader/>
+        </w:trPr>
+        <w:tc>
+          <w:tcPr>
+            <w:tcW w:type="dxa" w:w="1900"/>
+            <w:tcBorders>
+              <w:top w:val="single" w:color="BFBFBF" w:sz="4"/>
+              <w:left w:val="single" w:color="BFBFBF" w:sz="4"/>
+              <w:bottom w:val="single" w:color="BFBFBF" w:sz="4"/>
+              <w:right w:val="single" w:color="BFBFBF" w:sz="4"/>
+            </w:tcBorders>
+            <w:shd w:fill="D9E2F3" w:color="auto" w:val="clear"/>
+            <w:tcMar>
+              <w:top w:type="dxa" w:w="60"/>
+              <w:left w:type="dxa" w:w="100"/>
+              <w:bottom w:type="dxa" w:w="60"/>
+              <w:right w:type="dxa" w:w="100"/>
+            </w:tcMar>
+          </w:tcPr>
+          <w:p/>
+        </w:tc>
+        <w:tc>
+          <w:tcPr>
+            <w:tcW w:type="dxa" w:w="7460"/>
+            <w:tcBorders>
+              <w:top w:val="single" w:color="BFBFBF" w:sz="4"/>
+              <w:left w:val="single" w:color="BFBFBF" w:sz="4"/>
+              <w:bottom w:val="single" w:color="BFBFBF" w:sz="4"/>
+              <w:right w:val="single" w:color="BFBFBF" w:sz="4"/>
+            </w:tcBorders>
+            <w:shd w:fill="D9E2F3" w:color="auto" w:val="clear"/>
+            <w:tcMar>
+              <w:top w:type="dxa" w:w="60"/>
+              <w:left w:type="dxa" w:w="100"/>
+              <w:bottom w:type="dxa" w:w="60"/>
+              <w:right w:type="dxa" w:w="100"/>
+            </w:tcMar>
+          </w:tcPr>
+          <w:p>
+            <w:r>
+              <w:rPr>
+                <w:rFonts w:ascii="Calibri" w:cs="Calibri" w:eastAsia="Calibri" w:hAnsi="Calibri"/>
+                <w:b/>
+                <w:bCs/>
+                <w:sz w:val="20"/>
+                <w:szCs w:val="20"/>
+              </w:rPr>
+              <w:t xml:space="preserve">Detail</w:t>
+            </w:r>
+          </w:p>
+        </w:tc>
+      </w:tr>
+      <w:tr>
+        <w:trPr>
+          <w:cantSplit/>
+        </w:trPr>
+        <w:tc>
+          <w:tcPr>
+            <w:tcW w:type="dxa" w:w="1900"/>
+            <w:tcBorders>
+              <w:top w:val="single" w:color="BFBFBF" w:sz="4"/>
+              <w:left w:val="single" w:color="BFBFBF" w:sz="4"/>
+              <w:bottom w:val="single" w:color="BFBFBF" w:sz="4"/>
+              <w:right w:val="single" w:color="BFBFBF" w:sz="4"/>
+            </w:tcBorders>
+            <w:tcMar>
+              <w:top w:type="dxa" w:w="60"/>
+              <w:left w:type="dxa" w:w="100"/>
+              <w:bottom w:type="dxa" w:w="60"/>
+              <w:right w:type="dxa" w:w="100"/>
+            </w:tcMar>
+          </w:tcPr>
+          <w:p>
+            <w:r>
+              <w:rPr>
+                <w:rFonts w:ascii="Calibri" w:cs="Calibri" w:eastAsia="Calibri" w:hAnsi="Calibri"/>
+                <w:sz w:val="20"/>
+                <w:szCs w:val="20"/>
+              </w:rPr>
+              <w:t xml:space="preserve">Works with SPS</w:t>
+            </w:r>
+          </w:p>
+        </w:tc>
+        <w:tc>
+          <w:tcPr>
+            <w:tcW w:type="dxa" w:w="7460"/>
+            <w:tcBorders>
+              <w:top w:val="single" w:color="BFBFBF" w:sz="4"/>
+              <w:left w:val="single" w:color="BFBFBF" w:sz="4"/>
+              <w:bottom w:val="single" w:color="BFBFBF" w:sz="4"/>
+              <w:right w:val="single" w:color="BFBFBF" w:sz="4"/>
+            </w:tcBorders>
+            <w:tcMar>
+              <w:top w:type="dxa" w:w="60"/>
+              <w:left w:type="dxa" w:w="100"/>
+              <w:bottom w:type="dxa" w:w="60"/>
+              <w:right w:type="dxa" w:w="100"/>
+            </w:tcMar>
+          </w:tcPr>
+          <w:p>
+            <w:r>
+              <w:rPr>
+                <w:rFonts w:ascii="Calibri" w:cs="Calibri" w:eastAsia="Calibri" w:hAnsi="Calibri"/>
+                <w:sz w:val="20"/>
+                <w:szCs w:val="20"/>
+              </w:rPr>
+              <w:t xml:space="preserve">Doesn't replace SPS Commerce (required for now). It covers what SPS doesn't do</w:t>
+            </w:r>
+          </w:p>
+        </w:tc>
+      </w:tr>
+      <w:tr>
+        <w:trPr>
+          <w:cantSplit/>
+        </w:trPr>
+        <w:tc>
+          <w:tcPr>
+            <w:tcW w:type="dxa" w:w="1900"/>
+            <w:tcBorders>
+              <w:top w:val="single" w:color="BFBFBF" w:sz="4"/>
+              <w:left w:val="single" w:color="BFBFBF" w:sz="4"/>
+              <w:bottom w:val="single" w:color="BFBFBF" w:sz="4"/>
+              <w:right w:val="single" w:color="BFBFBF" w:sz="4"/>
+            </w:tcBorders>
+            <w:tcMar>
+              <w:top w:type="dxa" w:w="60"/>
+              <w:left w:type="dxa" w:w="100"/>
+              <w:bottom w:type="dxa" w:w="60"/>
+              <w:right w:type="dxa" w:w="100"/>
+            </w:tcMar>
+          </w:tcPr>
+          <w:p>
+            <w:r>
+              <w:rPr>
+                <w:rFonts w:ascii="Calibri" w:cs="Calibri" w:eastAsia="Calibri" w:hAnsi="Calibri"/>
+                <w:sz w:val="20"/>
+                <w:szCs w:val="20"/>
+              </w:rPr>
+              <w:t xml:space="preserve">Trigger</w:t>
+            </w:r>
+          </w:p>
+        </w:tc>
+        <w:tc>
+          <w:tcPr>
+            <w:tcW w:type="dxa" w:w="7460"/>
+            <w:tcBorders>
+              <w:top w:val="single" w:color="BFBFBF" w:sz="4"/>
+              <w:left w:val="single" w:color="BFBFBF" w:sz="4"/>
+              <w:bottom w:val="single" w:color="BFBFBF" w:sz="4"/>
+              <w:right w:val="single" w:color="BFBFBF" w:sz="4"/>
+            </w:tcBorders>
+            <w:tcMar>
+              <w:top w:type="dxa" w:w="60"/>
+              <w:left w:type="dxa" w:w="100"/>
+              <w:bottom w:type="dxa" w:w="60"/>
+              <w:right w:type="dxa" w:w="100"/>
+            </w:tcMar>
+          </w:tcPr>
+          <w:p>
+            <w:r>
+              <w:rPr>
+                <w:rFonts w:ascii="Calibri" w:cs="Calibri" w:eastAsia="Calibri" w:hAnsi="Calibri"/>
+                <w:sz w:val="20"/>
+                <w:szCs w:val="20"/>
+              </w:rPr>
+              <w:t xml:space="preserve">A new Lowes, Home Depot or Walmart shortage in SPS; a new deduction in the Wayfair portal or in Charmaine's email (UnbeatableSales sends a weekly batch); Suzanne posting a remittance</w:t>
+            </w:r>
+          </w:p>
+        </w:tc>
+      </w:tr>
+      <w:tr>
+        <w:trPr>
+          <w:cantSplit/>
+        </w:trPr>
+        <w:tc>
+          <w:tcPr>
+            <w:tcW w:type="dxa" w:w="1900"/>
+            <w:tcBorders>
+              <w:top w:val="single" w:color="BFBFBF" w:sz="4"/>
+              <w:left w:val="single" w:color="BFBFBF" w:sz="4"/>
+              <w:bottom w:val="single" w:color="BFBFBF" w:sz="4"/>
+              <w:right w:val="single" w:color="BFBFBF" w:sz="4"/>
+            </w:tcBorders>
+            <w:tcMar>
+              <w:top w:type="dxa" w:w="60"/>
+              <w:left w:type="dxa" w:w="100"/>
+              <w:bottom w:type="dxa" w:w="60"/>
+              <w:right w:type="dxa" w:w="100"/>
+            </w:tcMar>
+          </w:tcPr>
+          <w:p>
+            <w:r>
+              <w:rPr>
+                <w:rFonts w:ascii="Calibri" w:cs="Calibri" w:eastAsia="Calibri" w:hAnsi="Calibri"/>
+                <w:sz w:val="20"/>
+                <w:szCs w:val="20"/>
+              </w:rPr>
+              <w:t xml:space="preserve">What it does</w:t>
+            </w:r>
+          </w:p>
+        </w:tc>
+        <w:tc>
+          <w:tcPr>
+            <w:tcW w:type="dxa" w:w="7460"/>
+            <w:tcBorders>
+              <w:top w:val="single" w:color="BFBFBF" w:sz="4"/>
+              <w:left w:val="single" w:color="BFBFBF" w:sz="4"/>
+              <w:bottom w:val="single" w:color="BFBFBF" w:sz="4"/>
+              <w:right w:val="single" w:color="BFBFBF" w:sz="4"/>
+            </w:tcBorders>
+            <w:tcMar>
+              <w:top w:type="dxa" w:w="60"/>
+              <w:left w:type="dxa" w:w="100"/>
+              <w:bottom w:type="dxa" w:w="60"/>
+              <w:right w:type="dxa" w:w="100"/>
+            </w:tcMar>
+          </w:tcPr>
+          <w:p>
+            <w:r>
+              <w:rPr>
+                <w:rFonts w:ascii="Calibri" w:cs="Calibri" w:eastAsia="Calibri" w:hAnsi="Calibri"/>
+                <w:b/>
+                <w:bCs/>
+                <w:sz w:val="20"/>
+                <w:szCs w:val="20"/>
+              </w:rPr>
+              <w:t xml:space="preserve">Proof of delivery:</w:t>
+            </w:r>
+            <w:r>
+              <w:rPr>
+                <w:rFonts w:ascii="Calibri" w:cs="Calibri" w:eastAsia="Calibri" w:hAnsi="Calibri"/>
+                <w:sz w:val="20"/>
+                <w:szCs w:val="20"/>
+              </w:rPr>
+              <w:t xml:space="preserve"> given a PO, finds every tracking number on the F&amp;O Pacejet shipment, fetches each FedEx POD (for Walmart, the POD and BOL from whichever carrier delivered), names it and drafts the SPS dispute with the template text, for Baruch Salamander to submit. </w:t>
+            </w:r>
+            <w:r>
+              <w:rPr>
+                <w:rFonts w:ascii="Calibri" w:cs="Calibri" w:eastAsia="Calibri" w:hAnsi="Calibri"/>
+                <w:b/>
+                <w:bCs/>
+                <w:sz w:val="20"/>
+                <w:szCs w:val="20"/>
+              </w:rPr>
+              <w:t xml:space="preserve">DS log:</w:t>
+            </w:r>
+            <w:r>
+              <w:rPr>
+                <w:rFonts w:ascii="Calibri" w:cs="Calibri" w:eastAsia="Calibri" w:hAnsi="Calibri"/>
+                <w:sz w:val="20"/>
+                <w:szCs w:val="20"/>
+              </w:rPr>
+              <w:t xml:space="preserve"> logs every Charmaine deduction, marks the policy ones (like Wayfair managed returns) accepted, and for the rest puts what we shipped, tracking and return status next to the customer's image. </w:t>
+            </w:r>
+            <w:r>
+              <w:rPr>
+                <w:rFonts w:ascii="Calibri" w:cs="Calibri" w:eastAsia="Calibri" w:hAnsi="Calibri"/>
+                <w:b/>
+                <w:bCs/>
+                <w:sz w:val="20"/>
+                <w:szCs w:val="20"/>
+              </w:rPr>
+              <w:t xml:space="preserve">Deadlines:</w:t>
+            </w:r>
+            <w:r>
+              <w:rPr>
+                <w:rFonts w:ascii="Calibri" w:cs="Calibri" w:eastAsia="Calibri" w:hAnsi="Calibri"/>
+                <w:sz w:val="20"/>
+                <w:szCs w:val="20"/>
+              </w:rPr>
+              <w:t xml:space="preserve"> Wayfair settlement dates, Amazon chargebacks near 30 days, open disputes. </w:t>
+            </w:r>
+            <w:r>
+              <w:rPr>
+                <w:rFonts w:ascii="Calibri" w:cs="Calibri" w:eastAsia="Calibri" w:hAnsi="Calibri"/>
+                <w:b/>
+                <w:bCs/>
+                <w:sz w:val="20"/>
+                <w:szCs w:val="20"/>
+              </w:rPr>
+              <w:t xml:space="preserve">Payments:</w:t>
+            </w:r>
+            <w:r>
+              <w:rPr>
+                <w:rFonts w:ascii="Calibri" w:cs="Calibri" w:eastAsia="Calibri" w:hAnsi="Calibri"/>
+                <w:sz w:val="20"/>
+                <w:szCs w:val="20"/>
+              </w:rPr>
+              <w:t xml:space="preserve"> shows Suzanne which deductions on a remittance to accept</w:t>
+            </w:r>
+          </w:p>
+        </w:tc>
+      </w:tr>
+      <w:tr>
+        <w:trPr>
+          <w:cantSplit/>
+        </w:trPr>
+        <w:tc>
+          <w:tcPr>
+            <w:tcW w:type="dxa" w:w="1900"/>
+            <w:tcBorders>
+              <w:top w:val="single" w:color="BFBFBF" w:sz="4"/>
+              <w:left w:val="single" w:color="BFBFBF" w:sz="4"/>
+              <w:bottom w:val="single" w:color="BFBFBF" w:sz="4"/>
+              <w:right w:val="single" w:color="BFBFBF" w:sz="4"/>
+            </w:tcBorders>
+            <w:tcMar>
+              <w:top w:type="dxa" w:w="60"/>
+              <w:left w:type="dxa" w:w="100"/>
+              <w:bottom w:type="dxa" w:w="60"/>
+              <w:right w:type="dxa" w:w="100"/>
+            </w:tcMar>
+          </w:tcPr>
+          <w:p>
+            <w:r>
+              <w:rPr>
+                <w:rFonts w:ascii="Calibri" w:cs="Calibri" w:eastAsia="Calibri" w:hAnsi="Calibri"/>
+                <w:sz w:val="20"/>
+                <w:szCs w:val="20"/>
+              </w:rPr>
+              <w:t xml:space="preserve">Data</w:t>
+            </w:r>
+          </w:p>
+        </w:tc>
+        <w:tc>
+          <w:tcPr>
+            <w:tcW w:type="dxa" w:w="7460"/>
+            <w:tcBorders>
+              <w:top w:val="single" w:color="BFBFBF" w:sz="4"/>
+              <w:left w:val="single" w:color="BFBFBF" w:sz="4"/>
+              <w:bottom w:val="single" w:color="BFBFBF" w:sz="4"/>
+              <w:right w:val="single" w:color="BFBFBF" w:sz="4"/>
+            </w:tcBorders>
+            <w:tcMar>
+              <w:top w:type="dxa" w:w="60"/>
+              <w:left w:type="dxa" w:w="100"/>
+              <w:bottom w:type="dxa" w:w="60"/>
+              <w:right w:type="dxa" w:w="100"/>
+            </w:tcMar>
+          </w:tcPr>
+          <w:p>
+            <w:r>
+              <w:rPr>
+                <w:rFonts w:ascii="Calibri" w:cs="Calibri" w:eastAsia="Calibri" w:hAnsi="Calibri"/>
+                <w:sz w:val="20"/>
+                <w:szCs w:val="20"/>
+              </w:rPr>
+              <w:t xml:space="preserve">SPS Commerce, F&amp;O sales orders and Pacejet shipments, FedEx and other carriers, Wayfair portal, deduction emails, warehouse returns, Tina's return-allowance spreadsheet as the start of a per-customer rules table</w:t>
+            </w:r>
+          </w:p>
+        </w:tc>
+      </w:tr>
+      <w:tr>
+        <w:trPr>
+          <w:cantSplit/>
+        </w:trPr>
+        <w:tc>
+          <w:tcPr>
+            <w:tcW w:type="dxa" w:w="1900"/>
+            <w:tcBorders>
+              <w:top w:val="single" w:color="BFBFBF" w:sz="4"/>
+              <w:left w:val="single" w:color="BFBFBF" w:sz="4"/>
+              <w:bottom w:val="single" w:color="BFBFBF" w:sz="4"/>
+              <w:right w:val="single" w:color="BFBFBF" w:sz="4"/>
+            </w:tcBorders>
+            <w:tcMar>
+              <w:top w:type="dxa" w:w="60"/>
+              <w:left w:type="dxa" w:w="100"/>
+              <w:bottom w:type="dxa" w:w="60"/>
+              <w:right w:type="dxa" w:w="100"/>
+            </w:tcMar>
+          </w:tcPr>
+          <w:p>
+            <w:r>
+              <w:rPr>
+                <w:rFonts w:ascii="Calibri" w:cs="Calibri" w:eastAsia="Calibri" w:hAnsi="Calibri"/>
+                <w:sz w:val="20"/>
+                <w:szCs w:val="20"/>
+              </w:rPr>
+              <w:t xml:space="preserve">Evidence</w:t>
+            </w:r>
+          </w:p>
+        </w:tc>
+        <w:tc>
+          <w:tcPr>
+            <w:tcW w:type="dxa" w:w="7460"/>
+            <w:tcBorders>
+              <w:top w:val="single" w:color="BFBFBF" w:sz="4"/>
+              <w:left w:val="single" w:color="BFBFBF" w:sz="4"/>
+              <w:bottom w:val="single" w:color="BFBFBF" w:sz="4"/>
+              <w:right w:val="single" w:color="BFBFBF" w:sz="4"/>
+            </w:tcBorders>
+            <w:tcMar>
+              <w:top w:type="dxa" w:w="60"/>
+              <w:left w:type="dxa" w:w="100"/>
+              <w:bottom w:type="dxa" w:w="60"/>
+              <w:right w:type="dxa" w:w="100"/>
+            </w:tcMar>
+          </w:tcPr>
+          <w:p>
+            <w:r>
+              <w:rPr>
+                <w:rFonts w:ascii="Calibri" w:cs="Calibri" w:eastAsia="Calibri" w:hAnsi="Calibri"/>
+                <w:sz w:val="20"/>
+                <w:szCs w:val="20"/>
+              </w:rPr>
+              <w:t xml:space="preserve">Day 2: Charmaine working Wayfair deductions; Avi G's dispute list passed through Tina. Day 5: Baruch Salamander typing Excel figures into SPS. Charmaine follow-up: 70 deductions in Oct 2 to 15, 11 checked; no list, Suzanne asks her at each remittance. Day 8: the F&amp;O → Pacejet → FedEx → SPS chain for every shortage; Walmart's many carriers; freight violations never disputed. Tina: rules are contractual; SPS charges per connection, so most DS customers aren't worth connecting</w:t>
+            </w:r>
+          </w:p>
+        </w:tc>
+      </w:tr>
+      <w:tr>
+        <w:trPr>
+          <w:cantSplit/>
+        </w:trPr>
+        <w:tc>
+          <w:tcPr>
+            <w:tcW w:type="dxa" w:w="1900"/>
+            <w:tcBorders>
+              <w:top w:val="single" w:color="BFBFBF" w:sz="4"/>
+              <w:left w:val="single" w:color="BFBFBF" w:sz="4"/>
+              <w:bottom w:val="single" w:color="BFBFBF" w:sz="4"/>
+              <w:right w:val="single" w:color="BFBFBF" w:sz="4"/>
+            </w:tcBorders>
+            <w:tcMar>
+              <w:top w:type="dxa" w:w="60"/>
+              <w:left w:type="dxa" w:w="100"/>
+              <w:bottom w:type="dxa" w:w="60"/>
+              <w:right w:type="dxa" w:w="100"/>
+            </w:tcMar>
+          </w:tcPr>
+          <w:p>
+            <w:r>
+              <w:rPr>
+                <w:rFonts w:ascii="Calibri" w:cs="Calibri" w:eastAsia="Calibri" w:hAnsi="Calibri"/>
+                <w:sz w:val="20"/>
+                <w:szCs w:val="20"/>
+              </w:rPr>
+              <w:t xml:space="preserve">Confirm first</w:t>
+            </w:r>
+          </w:p>
+        </w:tc>
+        <w:tc>
+          <w:tcPr>
+            <w:tcW w:type="dxa" w:w="7460"/>
+            <w:tcBorders>
+              <w:top w:val="single" w:color="BFBFBF" w:sz="4"/>
+              <w:left w:val="single" w:color="BFBFBF" w:sz="4"/>
+              <w:bottom w:val="single" w:color="BFBFBF" w:sz="4"/>
+              <w:right w:val="single" w:color="BFBFBF" w:sz="4"/>
+            </w:tcBorders>
+            <w:tcMar>
+              <w:top w:type="dxa" w:w="60"/>
+              <w:left w:type="dxa" w:w="100"/>
+              <w:bottom w:type="dxa" w:w="60"/>
+              <w:right w:type="dxa" w:w="100"/>
+            </w:tcMar>
+          </w:tcPr>
+          <w:p>
+            <w:r>
+              <w:rPr>
+                <w:rFonts w:ascii="Calibri" w:cs="Calibri" w:eastAsia="Calibri" w:hAnsi="Calibri"/>
+                <w:sz w:val="20"/>
+                <w:szCs w:val="20"/>
+              </w:rPr>
+              <w:t xml:space="preserve">Shortage disputes a week for Lowes, Home Depot and Walmart, and minutes each; what freight violations cost and what documentation SPS needs</w:t>
             </w:r>
           </w:p>
         </w:tc>
@@ -5218,7 +5879,7 @@
         <w:rPr>
           <w:rFonts w:ascii="Calibri" w:cs="Calibri" w:eastAsia="Calibri" w:hAnsi="Calibri"/>
         </w:rPr>
-        <w:t xml:space="preserve">For each top-5 item: how often it happens and how many each time. Still open: how many Amazon items need dates; Suzanne's checks a week; how long Baruch Salamander's reports take.</w:t>
+        <w:t xml:space="preserve">For each top-6 item: how often it happens and how many each time. Still open: how many Amazon items need dates; Suzanne's checks a week; how long Baruch Salamander's reports take; his shortage disputes a week per retailer.</w:t>
       </w:r>
     </w:p>
     <w:p>
@@ -5234,12 +5895,30 @@
         <w:rPr>
           <w:rFonts w:ascii="Calibri" w:cs="Calibri" w:eastAsia="Calibri" w:hAnsi="Calibri"/>
         </w:rPr>
-        <w:t xml:space="preserve">Still to shadow: Justin, the warehouse and sales. Repeat sessions with Daniel, Moshe Aryeh Grossman and Avi Altman.</w:t>
-      </w:r>
-    </w:p>
-    <w:p>
-      <w:pPr>
-        <w:spacing w:after="120" w:before="200"/>
+        <w:t xml:space="preserve">Still to shadow: Justin next (order entry, sample orders, where order emails go now that Evelyn is gone), then the warehouse (Brandon, Keith Hamby, Sal D'Rienzo) and sales. A conversation with Dan Holland (IT and EDI) for the technical SPS and EDI questions. Small gaps on deductions: Suzanne's short pays, and whether Avi G's dispute list is a regular handoff.</w:t>
+      </w:r>
+    </w:p>
+    <w:p>
+      <w:pPr>
+        <w:pStyle w:val="Heading1"/>
+        <w:keepNext/>
+        <w:spacing w:after="160" w:before="360"/>
+      </w:pPr>
+      <w:r>
+        <w:rPr>
+          <w:rFonts w:ascii="Calibri" w:cs="Calibri" w:eastAsia="Calibri" w:hAnsi="Calibri"/>
+        </w:rPr>
+        <w:t xml:space="preserve">Questions for Peleg</w:t>
+      </w:r>
+    </w:p>
+    <w:p>
+      <w:pPr>
+        <w:pStyle w:val="ListParagraph"/>
+        <w:numPr>
+          <w:ilvl w:val="0"/>
+          <w:numId w:val="2"/>
+        </w:numPr>
+        <w:spacing w:after="60"/>
       </w:pPr>
       <w:r>
         <w:rPr>
@@ -5247,13 +5926,128 @@
           <w:b/>
           <w:bCs/>
         </w:rPr>
+        <w:t xml:space="preserve">Tina's return-allowance spreadsheet:</w:t>
+      </w:r>
+      <w:r>
+        <w:rPr>
+          <w:rFonts w:ascii="Calibri" w:cs="Calibri" w:eastAsia="Calibri" w:hAnsi="Calibri"/>
+        </w:rPr>
+        <w:t xml:space="preserve"> did it go into F&amp;O? Who fills in the customers whose contracts Tina didn't have? It is the start of the rules table for Bot I.</w:t>
+      </w:r>
+    </w:p>
+    <w:p>
+      <w:pPr>
+        <w:pStyle w:val="ListParagraph"/>
+        <w:numPr>
+          <w:ilvl w:val="0"/>
+          <w:numId w:val="2"/>
+        </w:numPr>
+        <w:spacing w:after="60"/>
+      </w:pPr>
+      <w:r>
+        <w:rPr>
+          <w:rFonts w:ascii="Calibri" w:cs="Calibri" w:eastAsia="Calibri" w:hAnsi="Calibri"/>
+          <w:b/>
+          <w:bCs/>
+        </w:rPr>
+        <w:t xml:space="preserve">SPS Commerce cost and ownership:</w:t>
+      </w:r>
+      <w:r>
+        <w:rPr>
+          <w:rFonts w:ascii="Calibri" w:cs="Calibri" w:eastAsia="Calibri" w:hAnsi="Calibri"/>
+        </w:rPr>
+        <w:t xml:space="preserve"> what we pay (flat fee or a share of what it recovers) and who owns the account and logins. Needed to judge SPS against the $464k it recovered on Amazon last year.</w:t>
+      </w:r>
+    </w:p>
+    <w:p>
+      <w:pPr>
+        <w:pStyle w:val="ListParagraph"/>
+        <w:numPr>
+          <w:ilvl w:val="0"/>
+          <w:numId w:val="2"/>
+        </w:numPr>
+        <w:spacing w:after="60"/>
+      </w:pPr>
+      <w:r>
+        <w:rPr>
+          <w:rFonts w:ascii="Calibri" w:cs="Calibri" w:eastAsia="Calibri" w:hAnsi="Calibri"/>
+          <w:b/>
+          <w:bCs/>
+        </w:rPr>
+        <w:t xml:space="preserve">SPS connection:</w:t>
+      </w:r>
+      <w:r>
+        <w:rPr>
+          <w:rFonts w:ascii="Calibri" w:cs="Calibri" w:eastAsia="Calibri" w:hAnsi="Calibri"/>
+        </w:rPr>
+        <w:t xml:space="preserve"> what data SPS gets from us and how (the warehouse sends it BOLs for Amazon). Could proof of delivery and BOLs for Lowes, Home Depot and Walmart go the same way, so SPS disputes those shortages itself? (Or Dan Holland.)</w:t>
+      </w:r>
+    </w:p>
+    <w:p>
+      <w:pPr>
+        <w:pStyle w:val="ListParagraph"/>
+        <w:numPr>
+          <w:ilvl w:val="0"/>
+          <w:numId w:val="2"/>
+        </w:numPr>
+        <w:spacing w:after="60"/>
+      </w:pPr>
+      <w:r>
+        <w:rPr>
+          <w:rFonts w:ascii="Calibri" w:cs="Calibri" w:eastAsia="Calibri" w:hAnsi="Calibri"/>
+          <w:b/>
+          <w:bCs/>
+        </w:rPr>
+        <w:t xml:space="preserve">Freight violations:</w:t>
+      </w:r>
+      <w:r>
+        <w:rPr>
+          <w:rFonts w:ascii="Calibri" w:cs="Calibri" w:eastAsia="Calibri" w:hAnsi="Calibri"/>
+        </w:rPr>
+        <w:t xml:space="preserve"> what documentation SPS would need, who has it, and roughly what they cost a year. Today none are disputed.</w:t>
+      </w:r>
+    </w:p>
+    <w:p>
+      <w:pPr>
+        <w:pStyle w:val="ListParagraph"/>
+        <w:numPr>
+          <w:ilvl w:val="0"/>
+          <w:numId w:val="2"/>
+        </w:numPr>
+        <w:spacing w:after="60"/>
+      </w:pPr>
+      <w:r>
+        <w:rPr>
+          <w:rFonts w:ascii="Calibri" w:cs="Calibri" w:eastAsia="Calibri" w:hAnsi="Calibri"/>
+          <w:b/>
+          <w:bCs/>
+        </w:rPr>
+        <w:t xml:space="preserve">Backup for deductions:</w:t>
+      </w:r>
+      <w:r>
+        <w:rPr>
+          <w:rFonts w:ascii="Calibri" w:cs="Calibri" w:eastAsia="Calibri" w:hAnsi="Calibri"/>
+        </w:rPr>
+        <w:t xml:space="preserve"> nobody covers when Charmaine or Baruch Salamander is out. Who should?</w:t>
+      </w:r>
+    </w:p>
+    <w:p>
+      <w:pPr>
+        <w:spacing w:after="120" w:before="200"/>
+      </w:pPr>
+      <w:r>
+        <w:rPr>
+          <w:rFonts w:ascii="Calibri" w:cs="Calibri" w:eastAsia="Calibri" w:hAnsi="Calibri"/>
+          <w:b/>
+          <w:bCs/>
+        </w:rPr>
         <w:t xml:space="preserve">Next step:</w:t>
       </w:r>
       <w:r>
         <w:rPr>
           <w:rFonts w:ascii="Calibri" w:cs="Calibri" w:eastAsia="Calibri" w:hAnsi="Calibri"/>
         </w:rPr>
-        <w:t xml:space="preserve"> pick which of bots A to H to build first, and have Peleg take the settings list.</w:t>
+        <w:t xml:space="preserve"> pick which of bots A to I to build first, and have Peleg take the settings list.</w:t>
       </w:r>
     </w:p>
     <w:p>

</xml_diff>